<commit_message>
Actualizamos el .docx para el criterio F
</commit_message>
<xml_diff>
--- a/Factorial.docx
+++ b/Factorial.docx
@@ -1,12 +1,11 @@
 
 <file path=word/document.xml><?xml version="1.0" encoding="utf-8"?>
-<w:document xmlns:mc="http://schemas.openxmlformats.org/markup-compatibility/2006" xmlns:ve="http://schemas.openxmlformats.org/markup-compatibility/2006" xmlns:o="urn:schemas-microsoft-com:office:office" xmlns:r="http://schemas.openxmlformats.org/officeDocument/2006/relationships" xmlns:m="http://schemas.openxmlformats.org/officeDocument/2006/math" xmlns:v="urn:schemas-microsoft-com:vml" xmlns:wp="http://schemas.openxmlformats.org/drawingml/2006/wordprocessingDrawing" xmlns:w10="urn:schemas-microsoft-com:office:word" xmlns:w="http://schemas.openxmlformats.org/wordprocessingml/2006/main" xmlns:wne="http://schemas.microsoft.com/office/word/2006/wordml" xmlns:a="http://schemas.openxmlformats.org/drawingml/2006/main" xmlns:pic="http://schemas.openxmlformats.org/drawingml/2006/picture" xmlns:wpg="http://schemas.microsoft.com/office/word/2010/wordprocessingGroup" xmlns:wps="http://schemas.microsoft.com/office/word/2010/wordprocessingShape" xmlns:w14="http://schemas.microsoft.com/office/word/2010/wordml" mc:Ignorable="w14" xml:space="preserve">
+<w:document xmlns:wpc="http://schemas.microsoft.com/office/word/2010/wordprocessingCanvas" xmlns:cx="http://schemas.microsoft.com/office/drawing/2014/chartex" xmlns:mc="http://schemas.openxmlformats.org/markup-compatibility/2006" xmlns:o="urn:schemas-microsoft-com:office:office" xmlns:r="http://schemas.openxmlformats.org/officeDocument/2006/relationships" xmlns:m="http://schemas.openxmlformats.org/officeDocument/2006/math" xmlns:v="urn:schemas-microsoft-com:vml" xmlns:wp14="http://schemas.microsoft.com/office/word/2010/wordprocessingDrawing" xmlns:wp="http://schemas.openxmlformats.org/drawingml/2006/wordprocessingDrawing" xmlns:w10="urn:schemas-microsoft-com:office:word" xmlns:w="http://schemas.openxmlformats.org/wordprocessingml/2006/main" xmlns:w14="http://schemas.microsoft.com/office/word/2010/wordml" xmlns:w15="http://schemas.microsoft.com/office/word/2012/wordml" xmlns:w16se="http://schemas.microsoft.com/office/word/2015/wordml/symex" xmlns:wpg="http://schemas.microsoft.com/office/word/2010/wordprocessingGroup" xmlns:wpi="http://schemas.microsoft.com/office/word/2010/wordprocessingInk" xmlns:wne="http://schemas.microsoft.com/office/word/2006/wordml" xmlns:wps="http://schemas.microsoft.com/office/word/2010/wordprocessingShape" mc:Ignorable="w14 w15 w16se wp14">
   <w:body>
     <w:p>
       <w:pPr>
         <w:spacing w:line="233" w:lineRule="exact"/>
-        <w:ind w:left="41" w:right="0" w:firstLine="0"/>
-        <w:jc w:val="left"/>
+        <w:ind w:left="41"/>
         <w:rPr>
           <w:rFonts w:ascii="Times New Roman"/>
           <w:position w:val="-4"/>
@@ -16,13 +15,15 @@
       <w:r>
         <w:rPr>
           <w:rFonts w:ascii="Times New Roman"/>
+          <w:noProof/>
           <w:position w:val="-4"/>
           <w:sz w:val="20"/>
+          <w:lang w:val="es-ES" w:eastAsia="es-ES"/>
         </w:rPr>
         <mc:AlternateContent>
-          <mc:Choice Requires="wps">
+          <mc:Choice Requires="wpg">
             <w:drawing>
-              <wp:anchor distT="0" distB="0" distL="0" distR="0" allowOverlap="1" layoutInCell="1" locked="0" behindDoc="0" simplePos="0" relativeHeight="15730688">
+              <wp:anchor distT="0" distB="0" distL="0" distR="0" simplePos="0" relativeHeight="15730688" behindDoc="0" locked="0" layoutInCell="1" allowOverlap="1">
                 <wp:simplePos x="0" y="0"/>
                 <wp:positionH relativeFrom="page">
                   <wp:posOffset>554736</wp:posOffset>
@@ -35,27 +36,29 @@
                 <wp:wrapNone/>
                 <wp:docPr id="1" name="Group 1"/>
                 <wp:cNvGraphicFramePr>
-                  <a:graphicFrameLocks/>
+                  <a:graphicFrameLocks xmlns:a="http://schemas.openxmlformats.org/drawingml/2006/main"/>
                 </wp:cNvGraphicFramePr>
-                <a:graphic>
+                <a:graphic xmlns:a="http://schemas.openxmlformats.org/drawingml/2006/main">
                   <a:graphicData uri="http://schemas.microsoft.com/office/word/2010/wordprocessingGroup">
                     <wpg:wgp>
-                      <wpg:cNvPr id="1" name="Group 1"/>
-                      <wpg:cNvGrpSpPr/>
+                      <wpg:cNvGrpSpPr>
+                        <a:grpSpLocks/>
+                      </wpg:cNvGrpSpPr>
                       <wpg:grpSpPr>
                         <a:xfrm>
                           <a:off x="0" y="0"/>
                           <a:ext cx="6480175" cy="21590"/>
+                          <a:chOff x="0" y="0"/>
                           <a:chExt cx="6480175" cy="21590"/>
                         </a:xfrm>
                       </wpg:grpSpPr>
-                      <pic:pic>
+                      <pic:pic xmlns:pic="http://schemas.openxmlformats.org/drawingml/2006/picture">
                         <pic:nvPicPr>
                           <pic:cNvPr id="2" name="Image 2"/>
                           <pic:cNvPicPr/>
                         </pic:nvPicPr>
                         <pic:blipFill>
-                          <a:blip r:embed="rId5" cstate="print"/>
+                          <a:blip r:embed="rId6" cstate="print"/>
                           <a:stretch>
                             <a:fillRect/>
                           </a:stretch>
@@ -170,19 +173,36 @@
           </mc:Choice>
           <mc:Fallback>
             <w:pict>
-              <v:group style="position:absolute;margin-left:43.68pt;margin-top:131.279999pt;width:510.25pt;height:1.7pt;mso-position-horizontal-relative:page;mso-position-vertical-relative:page;z-index:15730688" id="docshapegroup1" coordorigin="874,2626" coordsize="10205,34">
-                <v:shape style="position:absolute;left:873;top:2625;width:10205;height:34" type="#_x0000_t75" id="docshape2" stroked="false">
-                  <v:imagedata r:id="rId5" o:title=""/>
+              <v:group w14:anchorId="6CEADD92" id="Group 1" o:spid="_x0000_s1026" style="position:absolute;margin-left:43.7pt;margin-top:131.3pt;width:510.25pt;height:1.7pt;z-index:15730688;mso-wrap-distance-left:0;mso-wrap-distance-right:0;mso-position-horizontal-relative:page;mso-position-vertical-relative:page" coordsize="64801,215" o:gfxdata="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">
+                <v:shapetype id="_x0000_t75" coordsize="21600,21600" o:spt="75" o:preferrelative="t" path="m@4@5l@4@11@9@11@9@5xe" filled="f" stroked="f">
+                  <v:stroke joinstyle="miter"/>
+                  <v:formulas>
+                    <v:f eqn="if lineDrawn pixelLineWidth 0"/>
+                    <v:f eqn="sum @0 1 0"/>
+                    <v:f eqn="sum 0 0 @1"/>
+                    <v:f eqn="prod @2 1 2"/>
+                    <v:f eqn="prod @3 21600 pixelWidth"/>
+                    <v:f eqn="prod @3 21600 pixelHeight"/>
+                    <v:f eqn="sum @0 0 1"/>
+                    <v:f eqn="prod @6 1 2"/>
+                    <v:f eqn="prod @7 21600 pixelWidth"/>
+                    <v:f eqn="sum @8 21600 0"/>
+                    <v:f eqn="prod @7 21600 pixelHeight"/>
+                    <v:f eqn="sum @10 21600 0"/>
+                  </v:formulas>
+                  <v:path o:extrusionok="f" gradientshapeok="t" o:connecttype="rect"/>
+                  <o:lock v:ext="edit" aspectratio="t"/>
+                </v:shapetype>
+                <v:shape id="Image 2" o:spid="_x0000_s1027" type="#_x0000_t75" style="position:absolute;width:64800;height:213;visibility:visible;mso-wrap-style:square" o:gfxdata="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">
+                  <v:imagedata r:id="rId7" o:title=""/>
                 </v:shape>
-                <v:shape style="position:absolute;left:11063;top:2628;width:15;height:29" id="docshape3" coordorigin="11063,2628" coordsize="15,29" path="m11078,2657l11063,2657,11063,2643,11078,2628,11078,2657xe" filled="true" fillcolor="#ededed" stroked="false">
+                <v:shape id="Graphic 3" o:spid="_x0000_s1028" style="position:absolute;left:64705;top:18;width:95;height:184;visibility:visible;mso-wrap-style:square;v-text-anchor:top" coordsize="9525,18415" o:gfxdata="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" path="m9144,18287l,18287,,9144,9144,r,18287xe" fillcolor="#ededed" stroked="f">
                   <v:path arrowok="t"/>
-                  <v:fill type="solid"/>
                 </v:shape>
-                <v:shape style="position:absolute;left:874;top:2628;width:17;height:29" id="docshape4" coordorigin="874,2628" coordsize="17,29" path="m874,2657l874,2628,891,2628,891,2643,874,2657xe" filled="true" fillcolor="#9a9a9a" stroked="false">
+                <v:shape id="Graphic 4" o:spid="_x0000_s1029" style="position:absolute;left:5;top:18;width:108;height:184;visibility:visible;mso-wrap-style:square;v-text-anchor:top" coordsize="10795,18415" o:gfxdata="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" path="m,18287l,,10667,r,9144l,18287xe" fillcolor="#9a9a9a" stroked="f">
                   <v:path arrowok="t"/>
-                  <v:fill type="solid"/>
                 </v:shape>
-                <w10:wrap type="none"/>
+                <w10:wrap anchorx="page" anchory="page"/>
               </v:group>
             </w:pict>
           </mc:Fallback>
@@ -191,13 +211,15 @@
       <w:r>
         <w:rPr>
           <w:rFonts w:ascii="Times New Roman"/>
+          <w:noProof/>
           <w:position w:val="-4"/>
           <w:sz w:val="20"/>
+          <w:lang w:val="es-ES" w:eastAsia="es-ES"/>
         </w:rPr>
         <mc:AlternateContent>
-          <mc:Choice Requires="wps">
+          <mc:Choice Requires="wpg">
             <w:drawing>
-              <wp:anchor distT="0" distB="0" distL="0" distR="0" allowOverlap="1" layoutInCell="1" locked="0" behindDoc="0" simplePos="0" relativeHeight="15731200">
+              <wp:anchor distT="0" distB="0" distL="0" distR="0" simplePos="0" relativeHeight="15731200" behindDoc="0" locked="0" layoutInCell="1" allowOverlap="1">
                 <wp:simplePos x="0" y="0"/>
                 <wp:positionH relativeFrom="page">
                   <wp:posOffset>556059</wp:posOffset>
@@ -210,17 +232,19 @@
                 <wp:wrapNone/>
                 <wp:docPr id="5" name="Group 5"/>
                 <wp:cNvGraphicFramePr>
-                  <a:graphicFrameLocks/>
+                  <a:graphicFrameLocks xmlns:a="http://schemas.openxmlformats.org/drawingml/2006/main"/>
                 </wp:cNvGraphicFramePr>
-                <a:graphic>
+                <a:graphic xmlns:a="http://schemas.openxmlformats.org/drawingml/2006/main">
                   <a:graphicData uri="http://schemas.microsoft.com/office/word/2010/wordprocessingGroup">
                     <wpg:wgp>
-                      <wpg:cNvPr id="5" name="Group 5"/>
-                      <wpg:cNvGrpSpPr/>
+                      <wpg:cNvGrpSpPr>
+                        <a:grpSpLocks/>
+                      </wpg:cNvGrpSpPr>
                       <wpg:grpSpPr>
                         <a:xfrm>
                           <a:off x="0" y="0"/>
                           <a:ext cx="6479540" cy="1537335"/>
+                          <a:chOff x="0" y="0"/>
                           <a:chExt cx="6479540" cy="1537335"/>
                         </a:xfrm>
                       </wpg:grpSpPr>
@@ -340,13 +364,13 @@
                           <a:noAutofit/>
                         </wps:bodyPr>
                       </wps:wsp>
-                      <pic:pic>
+                      <pic:pic xmlns:pic="http://schemas.openxmlformats.org/drawingml/2006/picture">
                         <pic:nvPicPr>
                           <pic:cNvPr id="8" name="Image 8"/>
                           <pic:cNvPicPr/>
                         </pic:nvPicPr>
                         <pic:blipFill>
-                          <a:blip r:embed="rId6" cstate="print"/>
+                          <a:blip r:embed="rId8" cstate="print"/>
                           <a:stretch>
                             <a:fillRect/>
                           </a:stretch>
@@ -1457,13 +1481,13 @@
                           <a:noAutofit/>
                         </wps:bodyPr>
                       </wps:wsp>
-                      <pic:pic>
+                      <pic:pic xmlns:pic="http://schemas.openxmlformats.org/drawingml/2006/picture">
                         <pic:nvPicPr>
                           <pic:cNvPr id="10" name="Image 10"/>
                           <pic:cNvPicPr/>
                         </pic:nvPicPr>
                         <pic:blipFill>
-                          <a:blip r:embed="rId7" cstate="print"/>
+                          <a:blip r:embed="rId9" cstate="print"/>
                           <a:stretch>
                             <a:fillRect/>
                           </a:stretch>
@@ -1478,13 +1502,13 @@
                           </a:prstGeom>
                         </pic:spPr>
                       </pic:pic>
-                      <pic:pic>
+                      <pic:pic xmlns:pic="http://schemas.openxmlformats.org/drawingml/2006/picture">
                         <pic:nvPicPr>
                           <pic:cNvPr id="11" name="Image 11"/>
                           <pic:cNvPicPr/>
                         </pic:nvPicPr>
                         <pic:blipFill>
-                          <a:blip r:embed="rId8" cstate="print"/>
+                          <a:blip r:embed="rId10" cstate="print"/>
                           <a:stretch>
                             <a:fillRect/>
                           </a:stretch>
@@ -1499,13 +1523,13 @@
                           </a:prstGeom>
                         </pic:spPr>
                       </pic:pic>
-                      <pic:pic>
+                      <pic:pic xmlns:pic="http://schemas.openxmlformats.org/drawingml/2006/picture">
                         <pic:nvPicPr>
                           <pic:cNvPr id="12" name="Image 12"/>
                           <pic:cNvPicPr/>
                         </pic:nvPicPr>
                         <pic:blipFill>
-                          <a:blip r:embed="rId9" cstate="print"/>
+                          <a:blip r:embed="rId11" cstate="print"/>
                           <a:stretch>
                             <a:fillRect/>
                           </a:stretch>
@@ -1520,13 +1544,13 @@
                           </a:prstGeom>
                         </pic:spPr>
                       </pic:pic>
-                      <pic:pic>
+                      <pic:pic xmlns:pic="http://schemas.openxmlformats.org/drawingml/2006/picture">
                         <pic:nvPicPr>
                           <pic:cNvPr id="13" name="Image 13"/>
                           <pic:cNvPicPr/>
                         </pic:nvPicPr>
                         <pic:blipFill>
-                          <a:blip r:embed="rId10" cstate="print"/>
+                          <a:blip r:embed="rId12" cstate="print"/>
                           <a:stretch>
                             <a:fillRect/>
                           </a:stretch>
@@ -1541,13 +1565,13 @@
                           </a:prstGeom>
                         </pic:spPr>
                       </pic:pic>
-                      <pic:pic>
+                      <pic:pic xmlns:pic="http://schemas.openxmlformats.org/drawingml/2006/picture">
                         <pic:nvPicPr>
                           <pic:cNvPr id="14" name="Image 14"/>
                           <pic:cNvPicPr/>
                         </pic:nvPicPr>
                         <pic:blipFill>
-                          <a:blip r:embed="rId11" cstate="print"/>
+                          <a:blip r:embed="rId13" cstate="print"/>
                           <a:stretch>
                             <a:fillRect/>
                           </a:stretch>
@@ -1728,13 +1752,13 @@
                           <a:noAutofit/>
                         </wps:bodyPr>
                       </wps:wsp>
-                      <pic:pic>
+                      <pic:pic xmlns:pic="http://schemas.openxmlformats.org/drawingml/2006/picture">
                         <pic:nvPicPr>
                           <pic:cNvPr id="16" name="Image 16"/>
                           <pic:cNvPicPr/>
                         </pic:nvPicPr>
                         <pic:blipFill>
-                          <a:blip r:embed="rId12" cstate="print"/>
+                          <a:blip r:embed="rId14" cstate="print"/>
                           <a:stretch>
                             <a:fillRect/>
                           </a:stretch>
@@ -1757,44 +1781,41 @@
           </mc:Choice>
           <mc:Fallback>
             <w:pict>
-              <v:group style="position:absolute;margin-left:43.784248pt;margin-top:177.869247pt;width:510.2pt;height:121.05pt;mso-position-horizontal-relative:page;mso-position-vertical-relative:page;z-index:15731200" id="docshapegroup5" coordorigin="876,3557" coordsize="10204,2421">
-                <v:rect style="position:absolute;left:884;top:3565;width:10187;height:2404" id="docshape6" filled="false" stroked="true" strokeweight=".8415pt" strokecolor="#ededed">
-                  <v:stroke dashstyle="solid"/>
-                </v:rect>
-                <v:shape style="position:absolute;left:1041;top:4970;width:9754;height:917" id="docshape7" coordorigin="1042,4970" coordsize="9754,917" path="m10795,4970l10778,4970,10778,5870,1058,5870,1058,4970,1042,4970,1042,5870,1042,5887,1058,5887,10778,5887,10795,5887,10795,4970xe" filled="true" fillcolor="#ededed" stroked="false">
+              <v:group w14:anchorId="0BD9CF80" id="Group 5" o:spid="_x0000_s1026" style="position:absolute;margin-left:43.8pt;margin-top:177.85pt;width:510.2pt;height:121.05pt;z-index:15731200;mso-wrap-distance-left:0;mso-wrap-distance-right:0;mso-position-horizontal-relative:page;mso-position-vertical-relative:page" coordsize="64795,15373" o:gfxdata="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">
+                <v:shape id="Graphic 6" o:spid="_x0000_s1027" style="position:absolute;left:53;top:53;width:64687;height:15265;visibility:visible;mso-wrap-style:square;v-text-anchor:top" coordsize="6468745,1526540" o:gfxdata="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" path="m,l6468427,r,1526190l,1526190,,xe" filled="f" strokecolor="#ededed" strokeweight=".29686mm">
                   <v:path arrowok="t"/>
-                  <v:fill type="solid"/>
                 </v:shape>
-                <v:shape style="position:absolute;left:1050;top:3885;width:3338;height:258" type="#_x0000_t75" id="docshape8" stroked="false">
-                  <v:imagedata r:id="rId6" o:title=""/>
+                <v:shape id="Graphic 7" o:spid="_x0000_s1028" style="position:absolute;left:1053;top:8972;width:61938;height:5823;visibility:visible;mso-wrap-style:square;v-text-anchor:top" coordsize="6193790,582295" o:gfxdata="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" path="m6193536,r-10668,l6182868,571500r-6172200,l10668,,,,,571500r,10668l10668,582168r6172200,l6193523,582168,6193536,xe" fillcolor="#ededed" stroked="f">
+                  <v:path arrowok="t"/>
                 </v:shape>
-                <v:shape style="position:absolute;left:1170;top:5142;width:1294;height:147" id="docshape9" coordorigin="1170,5142" coordsize="1294,147" path="m1293,5152l1286,5150,1278,5145,1271,5145,1264,5142,1247,5142,1230,5143,1216,5147,1203,5153,1192,5162,1182,5172,1176,5185,1172,5199,1170,5215,1172,5231,1176,5246,1182,5259,1192,5270,1203,5278,1216,5284,1230,5288,1247,5289,1264,5289,1293,5280,1293,5248,1278,5258,1271,5260,1266,5263,1238,5263,1228,5258,1221,5251,1214,5241,1209,5231,1209,5200,1214,5188,1221,5181,1228,5171,1238,5169,1266,5169,1271,5171,1286,5176,1293,5181,1293,5152xm1430,5234l1429,5221,1426,5210,1423,5203,1422,5201,1416,5193,1406,5185,1397,5180,1394,5179,1394,5215,1394,5251,1389,5258,1384,5263,1379,5265,1365,5265,1358,5263,1355,5258,1351,5251,1348,5243,1348,5224,1351,5215,1355,5210,1358,5205,1365,5203,1379,5203,1384,5205,1394,5215,1394,5179,1385,5177,1372,5176,1359,5177,1347,5180,1337,5185,1329,5193,1322,5201,1317,5210,1313,5221,1312,5234,1313,5246,1317,5257,1322,5267,1329,5275,1337,5281,1347,5286,1359,5288,1372,5289,1386,5288,1397,5286,1407,5281,1416,5275,1422,5267,1423,5265,1426,5257,1429,5246,1429,5243,1430,5234xm1562,5207l1560,5195,1553,5188,1548,5181,1538,5176,1519,5176,1512,5179,1507,5181,1500,5186,1495,5188,1490,5195,1490,5179,1456,5179,1456,5287,1490,5287,1490,5224,1493,5217,1495,5212,1500,5205,1505,5203,1519,5203,1521,5205,1524,5205,1524,5207,1526,5210,1526,5212,1529,5215,1529,5287,1562,5287,1562,5222,1562,5207xm1685,5243l1682,5236,1675,5231,1670,5227,1658,5222,1642,5219,1629,5219,1625,5217,1622,5217,1617,5212,1617,5207,1622,5203,1627,5200,1651,5200,1656,5203,1663,5203,1670,5205,1678,5210,1678,5183,1663,5179,1649,5179,1642,5176,1620,5176,1608,5181,1601,5186,1591,5191,1589,5200,1589,5222,1591,5229,1598,5234,1603,5239,1615,5243,1629,5246,1642,5246,1646,5248,1649,5248,1654,5253,1654,5260,1649,5265,1644,5265,1639,5267,1625,5267,1617,5265,1610,5265,1596,5260,1591,5258,1591,5282,1605,5287,1613,5287,1620,5289,1651,5289,1666,5287,1673,5282,1680,5275,1685,5267,1685,5243xm1783,5179l1747,5179,1747,5150,1714,5150,1714,5179,1697,5179,1697,5205,1714,5205,1714,5263,1716,5272,1723,5277,1728,5284,1738,5287,1781,5287,1781,5263,1757,5263,1755,5260,1752,5260,1747,5255,1747,5205,1783,5205,1783,5179xm1884,5179l1880,5179,1877,5176,1868,5176,1853,5181,1843,5191,1839,5198,1839,5179,1805,5179,1805,5287,1839,5287,1839,5227,1841,5219,1846,5212,1851,5207,1858,5205,1875,5205,1877,5207,1882,5207,1884,5210,1884,5205,1884,5198,1884,5179xm2007,5179l1973,5179,1973,5243,1971,5251,1966,5255,1964,5260,1957,5263,1942,5263,1940,5260,1940,5258,1937,5255,1935,5255,1935,5179,1899,5179,1899,5246,1899,5260,1904,5270,1911,5277,1916,5287,1925,5289,1952,5289,1957,5284,1964,5282,1973,5272,1973,5287,2007,5287,2007,5179xm2127,5183l2123,5181,2115,5179,2106,5179,2099,5176,2094,5176,2080,5177,2068,5180,2057,5185,2048,5193,2042,5201,2037,5210,2034,5221,2034,5234,2034,5246,2037,5257,2042,5267,2048,5275,2057,5281,2068,5286,2080,5288,2094,5289,2111,5289,2115,5287,2123,5287,2127,5284,2127,5255,2108,5265,2089,5265,2082,5263,2070,5251,2067,5243,2067,5224,2070,5215,2077,5210,2082,5205,2089,5203,2108,5203,2113,5205,2118,5205,2127,5210,2127,5183xm2228,5179l2195,5179,2195,5150,2158,5150,2158,5179,2142,5179,2142,5205,2158,5205,2158,5263,2163,5272,2168,5277,2173,5284,2183,5287,2226,5287,2226,5263,2202,5263,2199,5260,2197,5260,2195,5258,2195,5205,2228,5205,2228,5179xm2361,5234l2359,5221,2356,5210,2352,5203,2350,5201,2344,5193,2336,5185,2326,5180,2325,5180,2325,5224,2325,5243,2322,5251,2317,5258,2315,5263,2308,5265,2293,5265,2288,5263,2284,5258,2279,5251,2276,5243,2276,5224,2279,5215,2288,5205,2293,5203,2308,5203,2315,5205,2317,5210,2322,5215,2325,5224,2325,5180,2314,5177,2300,5176,2287,5177,2275,5180,2265,5185,2257,5193,2251,5201,2246,5210,2244,5221,2243,5234,2244,5246,2246,5257,2251,5267,2257,5275,2265,5281,2275,5286,2287,5288,2300,5289,2314,5288,2326,5286,2336,5281,2344,5275,2350,5267,2351,5265,2356,5257,2359,5246,2361,5234xm2464,5179l2459,5179,2457,5176,2447,5176,2433,5181,2423,5191,2418,5198,2418,5179,2385,5179,2385,5287,2418,5287,2418,5227,2421,5219,2425,5212,2430,5207,2437,5205,2454,5205,2457,5207,2461,5207,2464,5210,2464,5205,2464,5198,2464,5179xe" filled="true" fillcolor="#343833" stroked="false">
+                <v:shape id="Image 8" o:spid="_x0000_s1029" type="#_x0000_t75" style="position:absolute;left:1106;top:2083;width:21195;height:1632;visibility:visible;mso-wrap-style:square" o:gfxdata="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">
+                  <v:imagedata r:id="rId15" o:title=""/>
+                </v:shape>
+                <v:shape id="Graphic 9" o:spid="_x0000_s1030" style="position:absolute;left:1869;top:10065;width:8217;height:933;visibility:visible;mso-wrap-style:square;v-text-anchor:top" coordsize="821690,93345" o:gfxdata="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" path="m77914,6096l73342,4572,68770,1524r-4572,l59626,,48869,,7797,18770,,45808,876,56438,29057,89916r19812,3238l59626,93154,77914,87058r,-19914l68770,73240r-4572,1524l61150,76288r-18377,l36677,73240,32105,68668,27533,62572,24485,56476r,-19812l27533,29044r4572,-4572l36677,18376r6096,-1524l61150,16852r3048,1524l73342,21424r4572,3048l77914,6096xem164973,58000r-572,-8331l162687,42760r-2274,-4572l159829,37007r-4000,-4915l150025,27216r-6249,-3315l142024,23444r,22364l142024,68668r-3048,4572l135928,76288r-3048,1524l123736,77812r-4572,-1524l117640,73240r-3048,-4572l113068,64096r,-12192l114592,45808r3048,-3048l119164,39712r4572,-1524l132880,38188r3048,1524l142024,45808r,-22364l136677,22021r-8369,-597l119735,22021,90919,49669r-813,8331l90919,65697r28816,26886l128308,93154r8585,-571l160299,77812r2388,-5130l164401,65697r114,-1601l164973,58000xem248983,41236r-1524,-7620l242798,29044r-3048,-4572l233654,21424r-12192,l216890,22948r-3048,1524l209270,27520r-3048,1524l203174,33616r,-10668l181737,22948r,68682l203174,91630r,-39726l204698,47332r1524,-3048l209270,39712r3048,-1524l221462,38188r1524,1524l224510,39712r,1524l226034,42760r,1524l227558,45808r,45822l248983,91630r,-41250l248983,41236xem326796,64096r-1524,-4572l320700,56476r-3048,-3048l310032,50380,299364,48856r-7709,l288607,47332r-1524,l284035,44284r,-3048l287083,38188r3048,-1524l305460,36664r3048,1524l313080,38188r4572,1524l322224,42760r,-16764l313080,22948r-9144,l299364,21424r-13805,l277939,24472r-4572,3048l267271,30568r-1524,6096l265747,50380r1524,4572l271843,58000r3048,3048l282511,64096r9144,1524l299364,65620r3048,1524l303936,67144r3048,3048l306984,74764r-3048,3048l300888,77812r-3048,1524l288607,79336r-4572,-1524l279463,77812r-9144,-3048l267271,73240r,15342l276415,91630r4572,l285559,93154r19901,l314604,91630r4572,-3048l323748,84010r3048,-4674l326796,64096xem389470,22948r-22948,l366522,4572r-21336,l345186,22948r-10770,l334416,39712r10770,l345186,76288r1524,6198l351282,85534r3048,4572l360426,91630r27432,l387858,76288r-15240,l371094,74764r-1524,l366522,71716r,-32004l389470,39712r,-16764xem453580,22948r-3048,l449008,21424r-6096,l433666,24472r-6096,6096l424522,35140r,-12192l403186,22948r,68682l424522,91630r,-38202l426046,48856r3048,-4572l432142,41236r4674,-1524l447484,39712r1524,1524l452056,41236r1524,1524l453580,39712r,-4572l453580,22948xem531393,22948r-21336,l510057,64096r-1524,4572l505485,71716r-1524,3048l499389,76288r-9144,l488721,74764r,-1524l487197,71716r-1524,l485673,22948r-22949,l462724,65620r,9144l465772,80962r4572,4572l473392,91630r6096,1524l496341,93154r3048,-3048l503961,88582r6096,-6096l510057,91630r21336,l531393,22948xem607796,25996r-3048,-1524l600176,22948r-6096,l589508,21424r-3048,l577799,22021,548830,49669r-571,8331l548830,65697r28969,26886l586460,93154r10668,l600176,91630r4572,l607796,90106r,-18390l595604,77812r-12192,l578739,76288r-7620,-7620l569595,64096r,-12192l571119,45808r4572,-3048l578739,39712r4673,-1524l595604,38188r3048,1524l601700,39712r6096,3048l607796,25996xem671893,22948r-21336,l650557,4572r-22962,l627595,22948r-10668,l616927,39712r10668,l627595,76288r3150,6198l633793,85534r3048,4572l642937,91630r27432,l670369,76288r-15240,l653605,74764r-1524,l650557,73240r,-33528l671893,39712r,-16764xem755904,58000l733793,23901r-749,-178l733044,51904r,12192l731520,68668r-3048,4572l726948,76288r-4661,1524l713143,77812r-3048,-1524l707047,73240r-3048,-4572l702475,64096r,-12192l703999,45808r6096,-6096l713143,38188r9144,l726948,39712r1524,3048l731520,45808r1524,6096l733044,23723r-6706,-1702l717715,21424r-8573,597l681710,49669r-571,8331l681710,65697r27432,26886l717715,93154r8623,-571l755091,65697r813,-7697xem821524,22948r-3048,l816952,21424r-6096,l801712,24472r-6096,6096l792568,35140r,-12192l771144,22948r,68682l792568,91630r,-38202l794092,48856r3048,-4572l800188,41236r4572,-1524l815428,39712r1524,1524l820000,41236r1524,1524l821524,39712r,-4572l821524,22948xe" fillcolor="#343833" stroked="f">
                   <v:path arrowok="t"/>
-                  <v:fill type="solid"/>
                 </v:shape>
-                <v:shape style="position:absolute;left:3608;top:5137;width:657;height:152" type="#_x0000_t75" id="docshape10" stroked="false">
-                  <v:imagedata r:id="rId7" o:title=""/>
+                <v:shape id="Image 10" o:spid="_x0000_s1031" type="#_x0000_t75" style="position:absolute;left:17354;top:10034;width:4168;height:962;visibility:visible;mso-wrap-style:square" o:gfxdata="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">
+                  <v:imagedata r:id="rId16" o:title=""/>
                 </v:shape>
-                <v:shape style="position:absolute;left:4298;top:5137;width:544;height:190" type="#_x0000_t75" id="docshape11" stroked="false">
-                  <v:imagedata r:id="rId8" o:title=""/>
+                <v:shape id="Image 11" o:spid="_x0000_s1032" type="#_x0000_t75" style="position:absolute;left:21737;top:10034;width:3450;height:1206;visibility:visible;mso-wrap-style:square" o:gfxdata="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">
+                  <v:imagedata r:id="rId17" o:title=""/>
                 </v:shape>
-                <v:shape style="position:absolute;left:1179;top:5584;width:222;height:157" type="#_x0000_t75" id="docshape12" stroked="false">
-                  <v:imagedata r:id="rId9" o:title=""/>
+                <v:shape id="Image 12" o:spid="_x0000_s1033" type="#_x0000_t75" style="position:absolute;left:1931;top:12874;width:1404;height:991;visibility:visible;mso-wrap-style:square" o:gfxdata="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">
+                  <v:imagedata r:id="rId18" o:title=""/>
                 </v:shape>
-                <v:shape style="position:absolute;left:1432;top:5589;width:351;height:152" type="#_x0000_t75" id="docshape13" stroked="false">
-                  <v:imagedata r:id="rId10" o:title=""/>
+                <v:shape id="Image 13" o:spid="_x0000_s1034" type="#_x0000_t75" style="position:absolute;left:3534;top:12904;width:2229;height:961;visibility:visible;mso-wrap-style:square" o:gfxdata="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">
+                  <v:imagedata r:id="rId19" o:title=""/>
                 </v:shape>
-                <v:shape style="position:absolute;left:1824;top:5565;width:462;height:176" type="#_x0000_t75" id="docshape14" stroked="false">
-                  <v:imagedata r:id="rId11" o:title=""/>
+                <v:shape id="Image 14" o:spid="_x0000_s1035" type="#_x0000_t75" style="position:absolute;left:6023;top:12751;width:2932;height:1114;visibility:visible;mso-wrap-style:square" o:gfxdata="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">
+                  <v:imagedata r:id="rId20" o:title=""/>
                 </v:shape>
-                <v:shape style="position:absolute;left:2343;top:5577;width:166;height:188" id="docshape15" coordorigin="2344,5578" coordsize="166,188" path="m2392,5578l2375,5578,2368,5590,2362,5602,2357,5613,2353,5626,2349,5637,2346,5648,2344,5660,2344,5671,2344,5682,2346,5694,2349,5706,2353,5717,2357,5729,2362,5741,2368,5753,2375,5765,2392,5765,2385,5753,2379,5741,2375,5730,2369,5707,2367,5695,2366,5684,2365,5671,2366,5659,2367,5648,2369,5636,2373,5626,2375,5613,2379,5602,2385,5590,2392,5578xm2510,5671l2509,5660,2508,5648,2506,5637,2502,5626,2498,5613,2493,5602,2488,5590,2481,5578,2464,5578,2470,5590,2475,5602,2480,5613,2486,5637,2489,5648,2490,5660,2490,5671,2490,5683,2489,5695,2486,5706,2483,5717,2479,5729,2475,5741,2464,5765,2481,5765,2488,5753,2493,5741,2498,5729,2502,5717,2506,5706,2508,5694,2509,5682,2510,5671xe" filled="true" fillcolor="#343833" stroked="false">
+                <v:shape id="Graphic 15" o:spid="_x0000_s1036" style="position:absolute;left:9322;top:12828;width:1054;height:1194;visibility:visible;mso-wrap-style:square;v-text-anchor:top" coordsize="105410,119380" o:gfxdata="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" path="m30581,l19812,,15532,7772r-3721,7468l8674,22720,6096,30480,3213,37579,1333,44958,304,52349,,59436r304,7162l1333,74002r1880,7392l6096,88493r2578,7760l11811,103733r3721,7480l19812,118973r10769,l26263,111239r-3581,-7315l13716,59436r292,-7735l14859,44386r1435,-7023l18288,30480r1689,-7760l22682,15240,26263,7772,30581,xem105346,59436l95059,15240,87058,,76288,r4115,7772l83616,15240r9246,37109l93154,59436r-292,7797l76288,118973r10770,l102768,81394r2286,-14796l105346,59436xe" fillcolor="#343833" stroked="f">
                   <v:path arrowok="t"/>
-                  <v:fill type="solid"/>
                 </v:shape>
-                <v:shape style="position:absolute;left:1247;top:4681;width:1506;height:159" type="#_x0000_t75" id="docshape16" stroked="false">
-                  <v:imagedata r:id="rId12" o:title=""/>
+                <v:shape id="Image 16" o:spid="_x0000_s1037" type="#_x0000_t75" style="position:absolute;left:2358;top:7135;width:9559;height:1007;visibility:visible;mso-wrap-style:square" o:gfxdata="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">
+                  <v:imagedata r:id="rId21" o:title=""/>
                 </v:shape>
-                <w10:wrap type="none"/>
+                <w10:wrap anchorx="page" anchory="page"/>
               </v:group>
             </w:pict>
           </mc:Fallback>
@@ -1803,13 +1824,15 @@
       <w:r>
         <w:rPr>
           <w:rFonts w:ascii="Times New Roman"/>
+          <w:noProof/>
           <w:position w:val="-4"/>
           <w:sz w:val="20"/>
+          <w:lang w:val="es-ES" w:eastAsia="es-ES"/>
         </w:rPr>
         <mc:AlternateContent>
-          <mc:Choice Requires="wps">
+          <mc:Choice Requires="wpg">
             <w:drawing>
-              <wp:anchor distT="0" distB="0" distL="0" distR="0" allowOverlap="1" layoutInCell="1" locked="0" behindDoc="0" simplePos="0" relativeHeight="15731712">
+              <wp:anchor distT="0" distB="0" distL="0" distR="0" simplePos="0" relativeHeight="15731712" behindDoc="0" locked="0" layoutInCell="1" allowOverlap="1">
                 <wp:simplePos x="0" y="0"/>
                 <wp:positionH relativeFrom="page">
                   <wp:posOffset>556059</wp:posOffset>
@@ -1822,17 +1845,19 @@
                 <wp:wrapNone/>
                 <wp:docPr id="17" name="Group 17"/>
                 <wp:cNvGraphicFramePr>
-                  <a:graphicFrameLocks/>
+                  <a:graphicFrameLocks xmlns:a="http://schemas.openxmlformats.org/drawingml/2006/main"/>
                 </wp:cNvGraphicFramePr>
-                <a:graphic>
+                <a:graphic xmlns:a="http://schemas.openxmlformats.org/drawingml/2006/main">
                   <a:graphicData uri="http://schemas.microsoft.com/office/word/2010/wordprocessingGroup">
                     <wpg:wgp>
-                      <wpg:cNvPr id="17" name="Group 17"/>
-                      <wpg:cNvGrpSpPr/>
+                      <wpg:cNvGrpSpPr>
+                        <a:grpSpLocks/>
+                      </wpg:cNvGrpSpPr>
                       <wpg:grpSpPr>
                         <a:xfrm>
                           <a:off x="0" y="0"/>
                           <a:ext cx="6479540" cy="2567305"/>
+                          <a:chOff x="0" y="0"/>
                           <a:chExt cx="6479540" cy="2567305"/>
                         </a:xfrm>
                       </wpg:grpSpPr>
@@ -2001,13 +2026,13 @@
                           <a:noAutofit/>
                         </wps:bodyPr>
                       </wps:wsp>
-                      <pic:pic>
+                      <pic:pic xmlns:pic="http://schemas.openxmlformats.org/drawingml/2006/picture">
                         <pic:nvPicPr>
                           <pic:cNvPr id="21" name="Image 21"/>
                           <pic:cNvPicPr/>
                         </pic:nvPicPr>
                         <pic:blipFill>
-                          <a:blip r:embed="rId13" cstate="print"/>
+                          <a:blip r:embed="rId22" cstate="print"/>
                           <a:stretch>
                             <a:fillRect/>
                           </a:stretch>
@@ -2923,13 +2948,13 @@
                           <a:noAutofit/>
                         </wps:bodyPr>
                       </wps:wsp>
-                      <pic:pic>
+                      <pic:pic xmlns:pic="http://schemas.openxmlformats.org/drawingml/2006/picture">
                         <pic:nvPicPr>
                           <pic:cNvPr id="23" name="Image 23"/>
                           <pic:cNvPicPr/>
                         </pic:nvPicPr>
                         <pic:blipFill>
-                          <a:blip r:embed="rId14" cstate="print"/>
+                          <a:blip r:embed="rId23" cstate="print"/>
                           <a:stretch>
                             <a:fillRect/>
                           </a:stretch>
@@ -3758,13 +3783,13 @@
                           <a:noAutofit/>
                         </wps:bodyPr>
                       </wps:wsp>
-                      <pic:pic>
+                      <pic:pic xmlns:pic="http://schemas.openxmlformats.org/drawingml/2006/picture">
                         <pic:nvPicPr>
                           <pic:cNvPr id="25" name="Image 25"/>
                           <pic:cNvPicPr/>
                         </pic:nvPicPr>
                         <pic:blipFill>
-                          <a:blip r:embed="rId15" cstate="print"/>
+                          <a:blip r:embed="rId24" cstate="print"/>
                           <a:stretch>
                             <a:fillRect/>
                           </a:stretch>
@@ -3779,13 +3804,13 @@
                           </a:prstGeom>
                         </pic:spPr>
                       </pic:pic>
-                      <pic:pic>
+                      <pic:pic xmlns:pic="http://schemas.openxmlformats.org/drawingml/2006/picture">
                         <pic:nvPicPr>
                           <pic:cNvPr id="26" name="Image 26"/>
                           <pic:cNvPicPr/>
                         </pic:nvPicPr>
                         <pic:blipFill>
-                          <a:blip r:embed="rId16" cstate="print"/>
+                          <a:blip r:embed="rId25" cstate="print"/>
                           <a:stretch>
                             <a:fillRect/>
                           </a:stretch>
@@ -4614,13 +4639,13 @@
                           <a:noAutofit/>
                         </wps:bodyPr>
                       </wps:wsp>
-                      <pic:pic>
+                      <pic:pic xmlns:pic="http://schemas.openxmlformats.org/drawingml/2006/picture">
                         <pic:nvPicPr>
                           <pic:cNvPr id="28" name="Image 28"/>
                           <pic:cNvPicPr/>
                         </pic:nvPicPr>
                         <pic:blipFill>
-                          <a:blip r:embed="rId17" cstate="print"/>
+                          <a:blip r:embed="rId26" cstate="print"/>
                           <a:stretch>
                             <a:fillRect/>
                           </a:stretch>
@@ -4635,13 +4660,13 @@
                           </a:prstGeom>
                         </pic:spPr>
                       </pic:pic>
-                      <pic:pic>
+                      <pic:pic xmlns:pic="http://schemas.openxmlformats.org/drawingml/2006/picture">
                         <pic:nvPicPr>
                           <pic:cNvPr id="29" name="Image 29"/>
                           <pic:cNvPicPr/>
                         </pic:nvPicPr>
                         <pic:blipFill>
-                          <a:blip r:embed="rId18" cstate="print"/>
+                          <a:blip r:embed="rId27" cstate="print"/>
                           <a:stretch>
                             <a:fillRect/>
                           </a:stretch>
@@ -4656,13 +4681,13 @@
                           </a:prstGeom>
                         </pic:spPr>
                       </pic:pic>
-                      <pic:pic>
+                      <pic:pic xmlns:pic="http://schemas.openxmlformats.org/drawingml/2006/picture">
                         <pic:nvPicPr>
                           <pic:cNvPr id="30" name="Image 30"/>
                           <pic:cNvPicPr/>
                         </pic:nvPicPr>
                         <pic:blipFill>
-                          <a:blip r:embed="rId19" cstate="print"/>
+                          <a:blip r:embed="rId28" cstate="print"/>
                           <a:stretch>
                             <a:fillRect/>
                           </a:stretch>
@@ -4677,13 +4702,13 @@
                           </a:prstGeom>
                         </pic:spPr>
                       </pic:pic>
-                      <pic:pic>
+                      <pic:pic xmlns:pic="http://schemas.openxmlformats.org/drawingml/2006/picture">
                         <pic:nvPicPr>
                           <pic:cNvPr id="31" name="Image 31"/>
                           <pic:cNvPicPr/>
                         </pic:nvPicPr>
                         <pic:blipFill>
-                          <a:blip r:embed="rId20" cstate="print"/>
+                          <a:blip r:embed="rId29" cstate="print"/>
                           <a:stretch>
                             <a:fillRect/>
                           </a:stretch>
@@ -4698,13 +4723,13 @@
                           </a:prstGeom>
                         </pic:spPr>
                       </pic:pic>
-                      <pic:pic>
+                      <pic:pic xmlns:pic="http://schemas.openxmlformats.org/drawingml/2006/picture">
                         <pic:nvPicPr>
                           <pic:cNvPr id="32" name="Image 32"/>
                           <pic:cNvPicPr/>
                         </pic:nvPicPr>
                         <pic:blipFill>
-                          <a:blip r:embed="rId21" cstate="print"/>
+                          <a:blip r:embed="rId30" cstate="print"/>
                           <a:stretch>
                             <a:fillRect/>
                           </a:stretch>
@@ -5326,13 +5351,13 @@
                           <a:noAutofit/>
                         </wps:bodyPr>
                       </wps:wsp>
-                      <pic:pic>
+                      <pic:pic xmlns:pic="http://schemas.openxmlformats.org/drawingml/2006/picture">
                         <pic:nvPicPr>
                           <pic:cNvPr id="34" name="Image 34"/>
                           <pic:cNvPicPr/>
                         </pic:nvPicPr>
                         <pic:blipFill>
-                          <a:blip r:embed="rId22" cstate="print"/>
+                          <a:blip r:embed="rId31" cstate="print"/>
                           <a:stretch>
                             <a:fillRect/>
                           </a:stretch>
@@ -5347,13 +5372,13 @@
                           </a:prstGeom>
                         </pic:spPr>
                       </pic:pic>
-                      <pic:pic>
+                      <pic:pic xmlns:pic="http://schemas.openxmlformats.org/drawingml/2006/picture">
                         <pic:nvPicPr>
                           <pic:cNvPr id="35" name="Image 35"/>
                           <pic:cNvPicPr/>
                         </pic:nvPicPr>
                         <pic:blipFill>
-                          <a:blip r:embed="rId23" cstate="print"/>
+                          <a:blip r:embed="rId32" cstate="print"/>
                           <a:stretch>
                             <a:fillRect/>
                           </a:stretch>
@@ -6503,13 +6528,13 @@
                           <a:noAutofit/>
                         </wps:bodyPr>
                       </wps:wsp>
-                      <pic:pic>
+                      <pic:pic xmlns:pic="http://schemas.openxmlformats.org/drawingml/2006/picture">
                         <pic:nvPicPr>
                           <pic:cNvPr id="37" name="Image 37"/>
                           <pic:cNvPicPr/>
                         </pic:nvPicPr>
                         <pic:blipFill>
-                          <a:blip r:embed="rId24" cstate="print"/>
+                          <a:blip r:embed="rId33" cstate="print"/>
                           <a:stretch>
                             <a:fillRect/>
                           </a:stretch>
@@ -6524,13 +6549,13 @@
                           </a:prstGeom>
                         </pic:spPr>
                       </pic:pic>
-                      <pic:pic>
+                      <pic:pic xmlns:pic="http://schemas.openxmlformats.org/drawingml/2006/picture">
                         <pic:nvPicPr>
                           <pic:cNvPr id="38" name="Image 38"/>
                           <pic:cNvPicPr/>
                         </pic:nvPicPr>
                         <pic:blipFill>
-                          <a:blip r:embed="rId25" cstate="print"/>
+                          <a:blip r:embed="rId34" cstate="print"/>
                           <a:stretch>
                             <a:fillRect/>
                           </a:stretch>
@@ -6545,13 +6570,13 @@
                           </a:prstGeom>
                         </pic:spPr>
                       </pic:pic>
-                      <pic:pic>
+                      <pic:pic xmlns:pic="http://schemas.openxmlformats.org/drawingml/2006/picture">
                         <pic:nvPicPr>
                           <pic:cNvPr id="39" name="Image 39"/>
                           <pic:cNvPicPr/>
                         </pic:nvPicPr>
                         <pic:blipFill>
-                          <a:blip r:embed="rId26" cstate="print"/>
+                          <a:blip r:embed="rId35" cstate="print"/>
                           <a:stretch>
                             <a:fillRect/>
                           </a:stretch>
@@ -7038,13 +7063,13 @@
                           <a:noAutofit/>
                         </wps:bodyPr>
                       </wps:wsp>
-                      <pic:pic>
+                      <pic:pic xmlns:pic="http://schemas.openxmlformats.org/drawingml/2006/picture">
                         <pic:nvPicPr>
                           <pic:cNvPr id="41" name="Image 41"/>
                           <pic:cNvPicPr/>
                         </pic:nvPicPr>
                         <pic:blipFill>
-                          <a:blip r:embed="rId27" cstate="print"/>
+                          <a:blip r:embed="rId36" cstate="print"/>
                           <a:stretch>
                             <a:fillRect/>
                           </a:stretch>
@@ -7059,13 +7084,13 @@
                           </a:prstGeom>
                         </pic:spPr>
                       </pic:pic>
-                      <pic:pic>
+                      <pic:pic xmlns:pic="http://schemas.openxmlformats.org/drawingml/2006/picture">
                         <pic:nvPicPr>
                           <pic:cNvPr id="42" name="Image 42"/>
                           <pic:cNvPicPr/>
                         </pic:nvPicPr>
                         <pic:blipFill>
-                          <a:blip r:embed="rId28" cstate="print"/>
+                          <a:blip r:embed="rId37" cstate="print"/>
                           <a:stretch>
                             <a:fillRect/>
                           </a:stretch>
@@ -7156,13 +7181,13 @@
                           <a:noAutofit/>
                         </wps:bodyPr>
                       </wps:wsp>
-                      <pic:pic>
+                      <pic:pic xmlns:pic="http://schemas.openxmlformats.org/drawingml/2006/picture">
                         <pic:nvPicPr>
                           <pic:cNvPr id="44" name="Image 44"/>
                           <pic:cNvPicPr/>
                         </pic:nvPicPr>
                         <pic:blipFill>
-                          <a:blip r:embed="rId29" cstate="print"/>
+                          <a:blip r:embed="rId38" cstate="print"/>
                           <a:stretch>
                             <a:fillRect/>
                           </a:stretch>
@@ -7177,13 +7202,13 @@
                           </a:prstGeom>
                         </pic:spPr>
                       </pic:pic>
-                      <pic:pic>
+                      <pic:pic xmlns:pic="http://schemas.openxmlformats.org/drawingml/2006/picture">
                         <pic:nvPicPr>
                           <pic:cNvPr id="45" name="Image 45"/>
                           <pic:cNvPicPr/>
                         </pic:nvPicPr>
                         <pic:blipFill>
-                          <a:blip r:embed="rId30" cstate="print"/>
+                          <a:blip r:embed="rId39" cstate="print"/>
                           <a:stretch>
                             <a:fillRect/>
                           </a:stretch>
@@ -7198,13 +7223,13 @@
                           </a:prstGeom>
                         </pic:spPr>
                       </pic:pic>
-                      <pic:pic>
+                      <pic:pic xmlns:pic="http://schemas.openxmlformats.org/drawingml/2006/picture">
                         <pic:nvPicPr>
                           <pic:cNvPr id="46" name="Image 46"/>
                           <pic:cNvPicPr/>
                         </pic:nvPicPr>
                         <pic:blipFill>
-                          <a:blip r:embed="rId31" cstate="print"/>
+                          <a:blip r:embed="rId40" cstate="print"/>
                           <a:stretch>
                             <a:fillRect/>
                           </a:stretch>
@@ -7283,13 +7308,13 @@
                           <a:noAutofit/>
                         </wps:bodyPr>
                       </wps:wsp>
-                      <pic:pic>
+                      <pic:pic xmlns:pic="http://schemas.openxmlformats.org/drawingml/2006/picture">
                         <pic:nvPicPr>
                           <pic:cNvPr id="48" name="Image 48"/>
                           <pic:cNvPicPr/>
                         </pic:nvPicPr>
                         <pic:blipFill>
-                          <a:blip r:embed="rId32" cstate="print"/>
+                          <a:blip r:embed="rId41" cstate="print"/>
                           <a:stretch>
                             <a:fillRect/>
                           </a:stretch>
@@ -7304,13 +7329,13 @@
                           </a:prstGeom>
                         </pic:spPr>
                       </pic:pic>
-                      <pic:pic>
+                      <pic:pic xmlns:pic="http://schemas.openxmlformats.org/drawingml/2006/picture">
                         <pic:nvPicPr>
                           <pic:cNvPr id="49" name="Image 49"/>
                           <pic:cNvPicPr/>
                         </pic:nvPicPr>
                         <pic:blipFill>
-                          <a:blip r:embed="rId33" cstate="print"/>
+                          <a:blip r:embed="rId42" cstate="print"/>
                           <a:stretch>
                             <a:fillRect/>
                           </a:stretch>
@@ -7325,13 +7350,13 @@
                           </a:prstGeom>
                         </pic:spPr>
                       </pic:pic>
-                      <pic:pic>
+                      <pic:pic xmlns:pic="http://schemas.openxmlformats.org/drawingml/2006/picture">
                         <pic:nvPicPr>
                           <pic:cNvPr id="50" name="Image 50"/>
                           <pic:cNvPicPr/>
                         </pic:nvPicPr>
                         <pic:blipFill>
-                          <a:blip r:embed="rId34" cstate="print"/>
+                          <a:blip r:embed="rId43" cstate="print"/>
                           <a:stretch>
                             <a:fillRect/>
                           </a:stretch>
@@ -7346,13 +7371,13 @@
                           </a:prstGeom>
                         </pic:spPr>
                       </pic:pic>
-                      <pic:pic>
+                      <pic:pic xmlns:pic="http://schemas.openxmlformats.org/drawingml/2006/picture">
                         <pic:nvPicPr>
                           <pic:cNvPr id="51" name="Image 51"/>
                           <pic:cNvPicPr/>
                         </pic:nvPicPr>
                         <pic:blipFill>
-                          <a:blip r:embed="rId35" cstate="print"/>
+                          <a:blip r:embed="rId44" cstate="print"/>
                           <a:stretch>
                             <a:fillRect/>
                           </a:stretch>
@@ -7367,13 +7392,13 @@
                           </a:prstGeom>
                         </pic:spPr>
                       </pic:pic>
-                      <pic:pic>
+                      <pic:pic xmlns:pic="http://schemas.openxmlformats.org/drawingml/2006/picture">
                         <pic:nvPicPr>
                           <pic:cNvPr id="52" name="Image 52"/>
                           <pic:cNvPicPr/>
                         </pic:nvPicPr>
                         <pic:blipFill>
-                          <a:blip r:embed="rId36" cstate="print"/>
+                          <a:blip r:embed="rId45" cstate="print"/>
                           <a:stretch>
                             <a:fillRect/>
                           </a:stretch>
@@ -7602,13 +7627,13 @@
                           <a:noAutofit/>
                         </wps:bodyPr>
                       </wps:wsp>
-                      <pic:pic>
+                      <pic:pic xmlns:pic="http://schemas.openxmlformats.org/drawingml/2006/picture">
                         <pic:nvPicPr>
                           <pic:cNvPr id="54" name="Image 54"/>
                           <pic:cNvPicPr/>
                         </pic:nvPicPr>
                         <pic:blipFill>
-                          <a:blip r:embed="rId37" cstate="print"/>
+                          <a:blip r:embed="rId46" cstate="print"/>
                           <a:stretch>
                             <a:fillRect/>
                           </a:stretch>
@@ -7726,13 +7751,13 @@
                           <a:noAutofit/>
                         </wps:bodyPr>
                       </wps:wsp>
-                      <pic:pic>
+                      <pic:pic xmlns:pic="http://schemas.openxmlformats.org/drawingml/2006/picture">
                         <pic:nvPicPr>
                           <pic:cNvPr id="56" name="Image 56"/>
                           <pic:cNvPicPr/>
                         </pic:nvPicPr>
                         <pic:blipFill>
-                          <a:blip r:embed="rId38" cstate="print"/>
+                          <a:blip r:embed="rId47" cstate="print"/>
                           <a:stretch>
                             <a:fillRect/>
                           </a:stretch>
@@ -7811,13 +7836,13 @@
                           <a:noAutofit/>
                         </wps:bodyPr>
                       </wps:wsp>
-                      <pic:pic>
+                      <pic:pic xmlns:pic="http://schemas.openxmlformats.org/drawingml/2006/picture">
                         <pic:nvPicPr>
                           <pic:cNvPr id="58" name="Image 58"/>
                           <pic:cNvPicPr/>
                         </pic:nvPicPr>
                         <pic:blipFill>
-                          <a:blip r:embed="rId39" cstate="print"/>
+                          <a:blip r:embed="rId48" cstate="print"/>
                           <a:stretch>
                             <a:fillRect/>
                           </a:stretch>
@@ -7832,13 +7857,13 @@
                           </a:prstGeom>
                         </pic:spPr>
                       </pic:pic>
-                      <pic:pic>
+                      <pic:pic xmlns:pic="http://schemas.openxmlformats.org/drawingml/2006/picture">
                         <pic:nvPicPr>
                           <pic:cNvPr id="59" name="Image 59"/>
                           <pic:cNvPicPr/>
                         </pic:nvPicPr>
                         <pic:blipFill>
-                          <a:blip r:embed="rId40" cstate="print"/>
+                          <a:blip r:embed="rId49" cstate="print"/>
                           <a:stretch>
                             <a:fillRect/>
                           </a:stretch>
@@ -7899,13 +7924,13 @@
                           <a:noAutofit/>
                         </wps:bodyPr>
                       </wps:wsp>
-                      <pic:pic>
+                      <pic:pic xmlns:pic="http://schemas.openxmlformats.org/drawingml/2006/picture">
                         <pic:nvPicPr>
                           <pic:cNvPr id="61" name="Image 61"/>
                           <pic:cNvPicPr/>
                         </pic:nvPicPr>
                         <pic:blipFill>
-                          <a:blip r:embed="rId41" cstate="print"/>
+                          <a:blip r:embed="rId50" cstate="print"/>
                           <a:stretch>
                             <a:fillRect/>
                           </a:stretch>
@@ -7920,13 +7945,13 @@
                           </a:prstGeom>
                         </pic:spPr>
                       </pic:pic>
-                      <pic:pic>
+                      <pic:pic xmlns:pic="http://schemas.openxmlformats.org/drawingml/2006/picture">
                         <pic:nvPicPr>
                           <pic:cNvPr id="62" name="Image 62"/>
                           <pic:cNvPicPr/>
                         </pic:nvPicPr>
                         <pic:blipFill>
-                          <a:blip r:embed="rId42" cstate="print"/>
+                          <a:blip r:embed="rId51" cstate="print"/>
                           <a:stretch>
                             <a:fillRect/>
                           </a:stretch>
@@ -7941,13 +7966,13 @@
                           </a:prstGeom>
                         </pic:spPr>
                       </pic:pic>
-                      <pic:pic>
+                      <pic:pic xmlns:pic="http://schemas.openxmlformats.org/drawingml/2006/picture">
                         <pic:nvPicPr>
                           <pic:cNvPr id="63" name="Image 63"/>
                           <pic:cNvPicPr/>
                         </pic:nvPicPr>
                         <pic:blipFill>
-                          <a:blip r:embed="rId43" cstate="print"/>
+                          <a:blip r:embed="rId52" cstate="print"/>
                           <a:stretch>
                             <a:fillRect/>
                           </a:stretch>
@@ -8341,13 +8366,13 @@
                           <a:noAutofit/>
                         </wps:bodyPr>
                       </wps:wsp>
-                      <pic:pic>
+                      <pic:pic xmlns:pic="http://schemas.openxmlformats.org/drawingml/2006/picture">
                         <pic:nvPicPr>
                           <pic:cNvPr id="65" name="Image 65"/>
                           <pic:cNvPicPr/>
                         </pic:nvPicPr>
                         <pic:blipFill>
-                          <a:blip r:embed="rId44" cstate="print"/>
+                          <a:blip r:embed="rId53" cstate="print"/>
                           <a:stretch>
                             <a:fillRect/>
                           </a:stretch>
@@ -8414,13 +8439,13 @@
                           <a:noAutofit/>
                         </wps:bodyPr>
                       </wps:wsp>
-                      <pic:pic>
+                      <pic:pic xmlns:pic="http://schemas.openxmlformats.org/drawingml/2006/picture">
                         <pic:nvPicPr>
                           <pic:cNvPr id="67" name="Image 67"/>
                           <pic:cNvPicPr/>
                         </pic:nvPicPr>
                         <pic:blipFill>
-                          <a:blip r:embed="rId45" cstate="print"/>
+                          <a:blip r:embed="rId54" cstate="print"/>
                           <a:stretch>
                             <a:fillRect/>
                           </a:stretch>
@@ -9551,13 +9576,13 @@
                           <a:noAutofit/>
                         </wps:bodyPr>
                       </wps:wsp>
-                      <pic:pic>
+                      <pic:pic xmlns:pic="http://schemas.openxmlformats.org/drawingml/2006/picture">
                         <pic:nvPicPr>
                           <pic:cNvPr id="71" name="Image 71"/>
                           <pic:cNvPicPr/>
                         </pic:nvPicPr>
                         <pic:blipFill>
-                          <a:blip r:embed="rId46" cstate="print"/>
+                          <a:blip r:embed="rId55" cstate="print"/>
                           <a:stretch>
                             <a:fillRect/>
                           </a:stretch>
@@ -9901,13 +9926,13 @@
                           <a:noAutofit/>
                         </wps:bodyPr>
                       </wps:wsp>
-                      <pic:pic>
+                      <pic:pic xmlns:pic="http://schemas.openxmlformats.org/drawingml/2006/picture">
                         <pic:nvPicPr>
                           <pic:cNvPr id="74" name="Image 74"/>
                           <pic:cNvPicPr/>
                         </pic:nvPicPr>
                         <pic:blipFill>
-                          <a:blip r:embed="rId47" cstate="print"/>
+                          <a:blip r:embed="rId56" cstate="print"/>
                           <a:stretch>
                             <a:fillRect/>
                           </a:stretch>
@@ -11287,13 +11312,13 @@
                           <a:noAutofit/>
                         </wps:bodyPr>
                       </wps:wsp>
-                      <pic:pic>
+                      <pic:pic xmlns:pic="http://schemas.openxmlformats.org/drawingml/2006/picture">
                         <pic:nvPicPr>
                           <pic:cNvPr id="78" name="Image 78"/>
                           <pic:cNvPicPr/>
                         </pic:nvPicPr>
                         <pic:blipFill>
-                          <a:blip r:embed="rId48" cstate="print"/>
+                          <a:blip r:embed="rId57" cstate="print"/>
                           <a:stretch>
                             <a:fillRect/>
                           </a:stretch>
@@ -11308,13 +11333,13 @@
                           </a:prstGeom>
                         </pic:spPr>
                       </pic:pic>
-                      <pic:pic>
+                      <pic:pic xmlns:pic="http://schemas.openxmlformats.org/drawingml/2006/picture">
                         <pic:nvPicPr>
                           <pic:cNvPr id="79" name="Image 79"/>
                           <pic:cNvPicPr/>
                         </pic:nvPicPr>
                         <pic:blipFill>
-                          <a:blip r:embed="rId49" cstate="print"/>
+                          <a:blip r:embed="rId58" cstate="print"/>
                           <a:stretch>
                             <a:fillRect/>
                           </a:stretch>
@@ -11496,13 +11521,13 @@
                           <a:noAutofit/>
                         </wps:bodyPr>
                       </wps:wsp>
-                      <pic:pic>
+                      <pic:pic xmlns:pic="http://schemas.openxmlformats.org/drawingml/2006/picture">
                         <pic:nvPicPr>
                           <pic:cNvPr id="82" name="Image 82"/>
                           <pic:cNvPicPr/>
                         </pic:nvPicPr>
                         <pic:blipFill>
-                          <a:blip r:embed="rId50" cstate="print"/>
+                          <a:blip r:embed="rId59" cstate="print"/>
                           <a:stretch>
                             <a:fillRect/>
                           </a:stretch>
@@ -11605,13 +11630,13 @@
                           <a:noAutofit/>
                         </wps:bodyPr>
                       </wps:wsp>
-                      <pic:pic>
+                      <pic:pic xmlns:pic="http://schemas.openxmlformats.org/drawingml/2006/picture">
                         <pic:nvPicPr>
                           <pic:cNvPr id="84" name="Image 84"/>
                           <pic:cNvPicPr/>
                         </pic:nvPicPr>
                         <pic:blipFill>
-                          <a:blip r:embed="rId51" cstate="print"/>
+                          <a:blip r:embed="rId60" cstate="print"/>
                           <a:stretch>
                             <a:fillRect/>
                           </a:stretch>
@@ -11790,13 +11815,13 @@
                           <a:noAutofit/>
                         </wps:bodyPr>
                       </wps:wsp>
-                      <pic:pic>
+                      <pic:pic xmlns:pic="http://schemas.openxmlformats.org/drawingml/2006/picture">
                         <pic:nvPicPr>
                           <pic:cNvPr id="87" name="Image 87"/>
                           <pic:cNvPicPr/>
                         </pic:nvPicPr>
                         <pic:blipFill>
-                          <a:blip r:embed="rId52" cstate="print"/>
+                          <a:blip r:embed="rId61" cstate="print"/>
                           <a:stretch>
                             <a:fillRect/>
                           </a:stretch>
@@ -11899,13 +11924,13 @@
                           <a:noAutofit/>
                         </wps:bodyPr>
                       </wps:wsp>
-                      <pic:pic>
+                      <pic:pic xmlns:pic="http://schemas.openxmlformats.org/drawingml/2006/picture">
                         <pic:nvPicPr>
                           <pic:cNvPr id="89" name="Image 89"/>
                           <pic:cNvPicPr/>
                         </pic:nvPicPr>
                         <pic:blipFill>
-                          <a:blip r:embed="rId53" cstate="print"/>
+                          <a:blip r:embed="rId62" cstate="print"/>
                           <a:stretch>
                             <a:fillRect/>
                           </a:stretch>
@@ -12148,13 +12173,13 @@
                           <a:noAutofit/>
                         </wps:bodyPr>
                       </wps:wsp>
-                      <pic:pic>
+                      <pic:pic xmlns:pic="http://schemas.openxmlformats.org/drawingml/2006/picture">
                         <pic:nvPicPr>
                           <pic:cNvPr id="93" name="Image 93"/>
                           <pic:cNvPicPr/>
                         </pic:nvPicPr>
                         <pic:blipFill>
-                          <a:blip r:embed="rId54" cstate="print"/>
+                          <a:blip r:embed="rId63" cstate="print"/>
                           <a:stretch>
                             <a:fillRect/>
                           </a:stretch>
@@ -12169,13 +12194,13 @@
                           </a:prstGeom>
                         </pic:spPr>
                       </pic:pic>
-                      <pic:pic>
+                      <pic:pic xmlns:pic="http://schemas.openxmlformats.org/drawingml/2006/picture">
                         <pic:nvPicPr>
                           <pic:cNvPr id="94" name="Image 94"/>
                           <pic:cNvPicPr/>
                         </pic:nvPicPr>
                         <pic:blipFill>
-                          <a:blip r:embed="rId55" cstate="print"/>
+                          <a:blip r:embed="rId64" cstate="print"/>
                           <a:stretch>
                             <a:fillRect/>
                           </a:stretch>
@@ -12552,13 +12577,13 @@
                           <a:noAutofit/>
                         </wps:bodyPr>
                       </wps:wsp>
-                      <pic:pic>
+                      <pic:pic xmlns:pic="http://schemas.openxmlformats.org/drawingml/2006/picture">
                         <pic:nvPicPr>
                           <pic:cNvPr id="97" name="Image 97"/>
                           <pic:cNvPicPr/>
                         </pic:nvPicPr>
                         <pic:blipFill>
-                          <a:blip r:embed="rId56" cstate="print"/>
+                          <a:blip r:embed="rId65" cstate="print"/>
                           <a:stretch>
                             <a:fillRect/>
                           </a:stretch>
@@ -12573,13 +12598,13 @@
                           </a:prstGeom>
                         </pic:spPr>
                       </pic:pic>
-                      <pic:pic>
+                      <pic:pic xmlns:pic="http://schemas.openxmlformats.org/drawingml/2006/picture">
                         <pic:nvPicPr>
                           <pic:cNvPr id="98" name="Image 98"/>
                           <pic:cNvPicPr/>
                         </pic:nvPicPr>
                         <pic:blipFill>
-                          <a:blip r:embed="rId57" cstate="print"/>
+                          <a:blip r:embed="rId66" cstate="print"/>
                           <a:stretch>
                             <a:fillRect/>
                           </a:stretch>
@@ -12646,13 +12671,13 @@
                           <a:noAutofit/>
                         </wps:bodyPr>
                       </wps:wsp>
-                      <pic:pic>
+                      <pic:pic xmlns:pic="http://schemas.openxmlformats.org/drawingml/2006/picture">
                         <pic:nvPicPr>
                           <pic:cNvPr id="100" name="Image 100"/>
                           <pic:cNvPicPr/>
                         </pic:nvPicPr>
                         <pic:blipFill>
-                          <a:blip r:embed="rId58" cstate="print"/>
+                          <a:blip r:embed="rId67" cstate="print"/>
                           <a:stretch>
                             <a:fillRect/>
                           </a:stretch>
@@ -12667,13 +12692,13 @@
                           </a:prstGeom>
                         </pic:spPr>
                       </pic:pic>
-                      <pic:pic>
+                      <pic:pic xmlns:pic="http://schemas.openxmlformats.org/drawingml/2006/picture">
                         <pic:nvPicPr>
                           <pic:cNvPr id="101" name="Image 101"/>
                           <pic:cNvPicPr/>
                         </pic:nvPicPr>
                         <pic:blipFill>
-                          <a:blip r:embed="rId59" cstate="print"/>
+                          <a:blip r:embed="rId68" cstate="print"/>
                           <a:stretch>
                             <a:fillRect/>
                           </a:stretch>
@@ -12740,13 +12765,13 @@
                           <a:noAutofit/>
                         </wps:bodyPr>
                       </wps:wsp>
-                      <pic:pic>
+                      <pic:pic xmlns:pic="http://schemas.openxmlformats.org/drawingml/2006/picture">
                         <pic:nvPicPr>
                           <pic:cNvPr id="103" name="Image 103"/>
                           <pic:cNvPicPr/>
                         </pic:nvPicPr>
                         <pic:blipFill>
-                          <a:blip r:embed="rId60" cstate="print"/>
+                          <a:blip r:embed="rId69" cstate="print"/>
                           <a:stretch>
                             <a:fillRect/>
                           </a:stretch>
@@ -12761,13 +12786,13 @@
                           </a:prstGeom>
                         </pic:spPr>
                       </pic:pic>
-                      <pic:pic>
+                      <pic:pic xmlns:pic="http://schemas.openxmlformats.org/drawingml/2006/picture">
                         <pic:nvPicPr>
                           <pic:cNvPr id="104" name="Image 104"/>
                           <pic:cNvPicPr/>
                         </pic:nvPicPr>
                         <pic:blipFill>
-                          <a:blip r:embed="rId61" cstate="print"/>
+                          <a:blip r:embed="rId70" cstate="print"/>
                           <a:stretch>
                             <a:fillRect/>
                           </a:stretch>
@@ -12790,304 +12815,269 @@
           </mc:Choice>
           <mc:Fallback>
             <w:pict>
-              <v:group style="position:absolute;margin-left:43.784248pt;margin-top:310.064270pt;width:510.2pt;height:202.15pt;mso-position-horizontal-relative:page;mso-position-vertical-relative:page;z-index:15731712" id="docshapegroup17" coordorigin="876,6201" coordsize="10204,4043">
-                <v:rect style="position:absolute;left:884;top:6209;width:10187;height:4026" id="docshape18" filled="false" stroked="true" strokeweight=".8415pt" strokecolor="#ededed">
-                  <v:stroke dashstyle="solid"/>
-                </v:rect>
-                <v:shape style="position:absolute;left:1041;top:7612;width:9754;height:920" id="docshape19" coordorigin="1042,7613" coordsize="9754,920" path="m10795,7613l10778,7613,10778,8515,1058,8515,1058,7613,1042,7613,1042,8515,1042,8532,1058,8532,10778,8532,10795,8532,10795,7613xe" filled="true" fillcolor="#ededed" stroked="false">
+              <v:group w14:anchorId="307E0FE9" id="Group 17" o:spid="_x0000_s1026" style="position:absolute;margin-left:43.8pt;margin-top:310.05pt;width:510.2pt;height:202.15pt;z-index:15731712;mso-wrap-distance-left:0;mso-wrap-distance-right:0;mso-position-horizontal-relative:page;mso-position-vertical-relative:page" coordsize="64795,25673" o:gfxdata="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">
+                <v:shape id="Graphic 18" o:spid="_x0000_s1027" style="position:absolute;left:53;top:53;width:64687;height:25565;visibility:visible;mso-wrap-style:square;v-text-anchor:top" coordsize="6468745,2556510" o:gfxdata="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" path="m,l6468427,r,2556414l,2556414,,xe" filled="f" strokecolor="#ededed" strokeweight=".29686mm">
                   <v:path arrowok="t"/>
-                  <v:fill type="solid"/>
                 </v:shape>
-                <v:rect style="position:absolute;left:1047;top:8690;width:9708;height:556" id="docshape20" filled="false" stroked="true" strokeweight=".8415pt" strokecolor="#ededed">
-                  <v:stroke dashstyle="solid"/>
-                </v:rect>
-                <v:shape style="position:absolute;left:1047;top:6524;width:2694;height:262" type="#_x0000_t75" id="docshape21" stroked="false">
-                  <v:imagedata r:id="rId13" o:title=""/>
+                <v:shape id="Graphic 19" o:spid="_x0000_s1028" style="position:absolute;left:1053;top:8963;width:61938;height:5842;visibility:visible;mso-wrap-style:square;v-text-anchor:top" coordsize="6193790,584200" o:gfxdata="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" path="m6193536,r-10668,l6182868,573024r-6172200,l10668,,,,,573024r,10668l10668,583692r6172200,l6193523,583692,6193536,xe" fillcolor="#ededed" stroked="f">
+                  <v:path arrowok="t"/>
                 </v:shape>
-                <v:shape style="position:absolute;left:1237;top:7305;width:1391;height:162" id="docshape22" coordorigin="1237,7306" coordsize="1391,162" path="m1399,7464l1389,7438,1378,7409,1355,7347,1341,7310,1339,7310,1339,7409,1298,7409,1317,7347,1339,7409,1339,7310,1293,7310,1237,7464,1276,7464,1286,7438,1348,7438,1358,7464,1399,7464xm1454,7306l1416,7306,1416,7466,1454,7466,1454,7306xm1526,7306l1488,7306,1488,7466,1526,7466,1526,7306xm1805,7310l1755,7310,1721,7395,1685,7310,1634,7310,1634,7464,1673,7464,1673,7354,1709,7436,1733,7436,1769,7354,1769,7464,1805,7464,1805,7310xm1957,7407l1956,7394,1956,7394,1953,7383,1949,7373,1947,7371,1942,7363,1933,7357,1922,7351,1920,7351,1920,7387,1920,7394,1872,7394,1872,7387,1875,7383,1885,7373,1885,7373,1892,7371,1904,7371,1910,7373,1911,7373,1913,7378,1918,7383,1920,7387,1920,7351,1911,7348,1899,7347,1884,7348,1871,7350,1860,7356,1851,7363,1843,7372,1838,7382,1838,7383,1838,7383,1835,7394,1835,7394,1834,7407,1835,7420,1839,7432,1844,7443,1851,7452,1861,7459,1872,7463,1885,7466,1899,7467,1918,7467,1925,7464,1935,7464,1945,7462,1952,7457,1952,7443,1952,7431,1945,7433,1935,7438,1928,7440,1918,7443,1894,7443,1887,7440,1882,7438,1875,7433,1872,7426,1872,7419,1957,7419,1957,7407xm2062,7349l2026,7349,2026,7318,1988,7318,1988,7349,1971,7349,1971,7375,1988,7375,1988,7440,1993,7450,2005,7462,2014,7464,2060,7464,2060,7438,2031,7438,2026,7433,2026,7375,2062,7375,2062,7349xm2202,7380l2197,7368,2192,7359,2185,7351,2175,7347,2154,7347,2139,7351,2134,7356,2127,7361,2122,7366,2122,7306,2086,7306,2086,7464,2122,7464,2122,7397,2125,7390,2130,7383,2134,7378,2139,7375,2154,7375,2156,7378,2158,7378,2161,7380,2161,7383,2163,7385,2163,7395,2166,7402,2166,7464,2202,7464,2202,7395,2202,7380xm2353,7407l2352,7394,2349,7382,2345,7373,2344,7372,2337,7363,2327,7356,2316,7350,2315,7350,2315,7397,2315,7419,2312,7426,2308,7433,2305,7438,2298,7443,2281,7443,2272,7433,2267,7426,2264,7419,2264,7397,2267,7387,2272,7383,2276,7375,2281,7373,2298,7373,2305,7375,2308,7383,2312,7387,2315,7397,2315,7350,2304,7348,2291,7347,2277,7348,2264,7350,2253,7356,2243,7363,2236,7372,2231,7382,2231,7383,2227,7394,2226,7407,2227,7420,2231,7432,2236,7443,2243,7452,2253,7459,2264,7463,2277,7466,2291,7467,2304,7466,2316,7463,2327,7459,2337,7452,2344,7443,2344,7443,2349,7432,2352,7420,2353,7419,2353,7407xm2495,7306l2459,7306,2459,7366,2459,7397,2459,7419,2457,7426,2452,7433,2447,7438,2442,7440,2426,7440,2421,7438,2416,7433,2411,7426,2411,7387,2426,7373,2442,7373,2457,7387,2459,7397,2459,7366,2454,7361,2447,7356,2442,7351,2428,7347,2406,7347,2394,7354,2385,7363,2380,7373,2376,7383,2373,7394,2373,7397,2373,7407,2373,7420,2376,7432,2380,7442,2385,7450,2394,7462,2406,7467,2435,7467,2442,7464,2447,7460,2454,7455,2459,7448,2459,7464,2495,7464,2495,7448,2495,7440,2495,7373,2495,7366,2495,7306xm2628,7419l2625,7411,2618,7404,2611,7399,2599,7395,2579,7395,2575,7392,2567,7392,2563,7390,2560,7390,2555,7385,2555,7378,2558,7375,2560,7375,2570,7371,2584,7371,2591,7373,2599,7373,2613,7378,2620,7383,2620,7354,2611,7351,2603,7349,2596,7349,2589,7347,2558,7347,2546,7349,2536,7356,2529,7361,2524,7371,2524,7395,2526,7402,2534,7409,2541,7414,2551,7419,2567,7419,2575,7421,2582,7421,2587,7424,2589,7424,2594,7428,2594,7436,2591,7438,2587,7440,2584,7443,2555,7443,2526,7433,2526,7460,2534,7464,2543,7464,2551,7467,2575,7467,2587,7466,2598,7465,2607,7463,2615,7460,2623,7452,2628,7443,2628,7419xe" filled="true" fillcolor="#243441" stroked="false">
+                <v:shape id="Graphic 20" o:spid="_x0000_s1029" style="position:absolute;left:1091;top:15803;width:61646;height:3531;visibility:visible;mso-wrap-style:square;v-text-anchor:top" coordsize="6164580,353060" o:gfxdata="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" path="m,l6164579,r,352519l,352519,,xe" filled="f" strokecolor="#ededed" strokeweight=".29686mm">
                   <v:path arrowok="t"/>
-                  <v:fill type="solid"/>
                 </v:shape>
-                <v:shape style="position:absolute;left:3134;top:7305;width:662;height:162" type="#_x0000_t75" id="docshape23" stroked="false">
-                  <v:imagedata r:id="rId14" o:title=""/>
+                <v:shape id="Image 21" o:spid="_x0000_s1030" type="#_x0000_t75" style="position:absolute;left:1091;top:2052;width:17102;height:1663;visibility:visible;mso-wrap-style:square" o:gfxdata="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">
+                  <v:imagedata r:id="rId71" o:title=""/>
                 </v:shape>
-                <v:shape style="position:absolute;left:3904;top:7305;width:994;height:162" id="docshape24" coordorigin="3904,7306" coordsize="994,162" path="m4075,7310l4025,7310,3989,7395,3955,7310,3904,7310,3904,7464,3941,7464,3941,7354,3977,7436,4001,7436,4037,7354,4037,7464,4075,7464,4075,7310xm4227,7407l4225,7394,4225,7394,4222,7383,4217,7373,4215,7371,4210,7363,4200,7357,4190,7351,4188,7351,4188,7387,4188,7394,4140,7394,4140,7394,4143,7387,4145,7383,4150,7378,4152,7373,4153,7373,4159,7371,4174,7371,4178,7373,4178,7373,4181,7378,4186,7383,4188,7387,4188,7351,4179,7348,4167,7347,4153,7348,4140,7350,4128,7356,4118,7363,4112,7372,4106,7382,4106,7383,4106,7383,4103,7394,4103,7394,4102,7407,4103,7420,4107,7432,4113,7443,4121,7452,4129,7459,4140,7463,4154,7466,4169,7467,4186,7467,4195,7464,4203,7464,4212,7462,4219,7457,4219,7443,4219,7431,4212,7433,4203,7438,4188,7443,4162,7443,4155,7440,4150,7438,4145,7433,4140,7426,4140,7419,4227,7419,4227,7407xm4332,7349l4294,7349,4294,7318,4258,7318,4258,7349,4239,7349,4239,7375,4258,7375,4258,7440,4260,7450,4272,7462,4282,7464,4328,7464,4328,7438,4299,7438,4294,7433,4294,7375,4332,7375,4332,7349xm4470,7380l4467,7368,4460,7359,4453,7351,4443,7347,4421,7347,4414,7349,4409,7351,4402,7356,4397,7361,4390,7366,4390,7306,4354,7306,4354,7464,4390,7464,4390,7397,4393,7390,4397,7383,4402,7378,4407,7375,4421,7375,4424,7378,4426,7378,4431,7383,4431,7387,4433,7390,4433,7464,4470,7464,4470,7395,4470,7380xm4621,7407l4620,7394,4617,7382,4613,7373,4612,7372,4604,7363,4596,7356,4585,7350,4582,7350,4582,7397,4582,7419,4578,7433,4573,7438,4566,7443,4551,7443,4544,7438,4539,7433,4534,7419,4534,7397,4537,7387,4539,7383,4544,7375,4551,7373,4566,7373,4573,7375,4578,7383,4580,7387,4582,7397,4582,7350,4572,7348,4558,7347,4545,7348,4532,7350,4521,7356,4513,7363,4505,7372,4500,7382,4500,7383,4497,7394,4496,7407,4497,7420,4500,7432,4505,7443,4513,7452,4521,7459,4532,7463,4545,7466,4558,7467,4572,7466,4585,7463,4596,7459,4604,7452,4612,7443,4612,7443,4617,7432,4620,7420,4620,7419,4621,7407xm4763,7306l4727,7306,4727,7366,4727,7397,4727,7419,4724,7426,4720,7433,4717,7438,4710,7440,4696,7440,4688,7438,4684,7433,4679,7419,4679,7397,4681,7387,4684,7383,4688,7378,4696,7373,4710,7373,4717,7378,4720,7383,4724,7387,4727,7397,4727,7366,4722,7361,4715,7356,4710,7351,4696,7347,4674,7347,4662,7354,4655,7363,4648,7373,4644,7383,4641,7394,4641,7397,4640,7407,4641,7420,4644,7432,4648,7442,4655,7450,4662,7462,4674,7467,4703,7467,4710,7464,4717,7460,4722,7455,4727,7448,4727,7464,4763,7464,4763,7448,4763,7440,4763,7373,4763,7366,4763,7306xm4898,7419l4893,7411,4881,7399,4866,7395,4849,7395,4842,7392,4835,7392,4830,7390,4828,7390,4825,7387,4825,7375,4830,7375,4833,7373,4837,7371,4852,7371,4859,7373,4866,7373,4881,7378,4888,7383,4888,7354,4881,7351,4871,7349,4864,7349,4857,7347,4825,7347,4813,7349,4804,7356,4797,7361,4792,7371,4792,7395,4794,7402,4801,7409,4809,7414,4821,7419,4837,7419,4842,7421,4849,7421,4854,7424,4857,7424,4861,7428,4861,7436,4857,7440,4852,7443,4823,7443,4794,7433,4794,7460,4801,7464,4811,7464,4818,7467,4842,7467,4855,7466,4866,7465,4875,7463,4883,7460,4893,7452,4898,7443,4898,7419xe" filled="true" fillcolor="#aaaaaa" stroked="false">
+                <v:shape id="Graphic 22" o:spid="_x0000_s1031" style="position:absolute;left:2297;top:7012;width:8833;height:1029;visibility:visible;mso-wrap-style:square;v-text-anchor:top" coordsize="883285,102870" o:gfxdata="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" path="m102298,100774l96024,84010,89154,65633,74320,26009,65722,3048r-1524,l64198,65633r-25997,l50393,26009,64198,65633r,-62585l35153,3048,,100774r24485,l30581,84010r39713,l76390,100774r25908,xem137744,l113360,r,102108l137744,102108,137744,xem183464,l159067,r,102108l183464,102108,183464,xem360426,3048r-32093,l306997,56489,284035,3048r-32004,l252031,100774r24384,l276415,30581r22962,51905l314617,82486,337477,30581r,70193l360426,100774r,-97726xem456641,64109r-572,-7721l456006,56184r-1651,-6934l451497,42672r-952,-1423l447497,36677r-6058,-4242l434835,29057r-1156,-355l433679,51917r,4471l403199,56388r,-4471l404723,48869r6198,-6197l411111,42672r4280,-1423l423011,41249r4293,1423l427532,42672r1575,3149l432155,48869r1524,3048l433679,28702r-5994,-1880l419963,26009r-9474,597l381152,48869r-102,381l379310,56184r-12,204l378726,64109r24270,35903l419963,102298r12192,l436727,100774r6198,l449021,99250r4572,-3048l453593,87058r,-7620l449021,80962r-6096,3048l438251,85534r-6096,1524l416915,87058r-4572,-1524l409295,84010r-4572,-3048l403199,76390r,-4572l456641,71818r,-7709xem523786,27533r-22860,l500926,7721r-24486,l476440,27533r-10668,l465772,44297r10668,l476440,85534r3048,6096l487108,99250r6198,1524l522262,100774r,-16764l503974,84010r-3048,-3048l500926,44297r22860,l523786,27533xem612368,47345r-3048,-7620l606272,33629r-4572,-4572l595604,26009r-13817,l572643,29057r-3048,3048l565023,35153r-3048,3048l561975,,539115,r,100774l561975,100774r,-42761l563499,53441r3048,-4572l569595,45821r3048,-1524l581787,44297r1524,1524l584835,45821r1625,1524l586460,48869r1524,1524l587984,56489r1524,4572l589508,100774r22860,l612368,56489r,-9144xem708571,64109l685088,28486r-901,-216l684187,58013r,13805l682574,76390r-3048,4572l678002,84010r-4572,3048l662762,87058r-6096,-6096l653618,76390r-1524,-4572l652094,58013r1524,-6096l656666,48869r3048,-4572l662762,42773r10668,l678002,44297r1524,4572l682574,51917r1613,6096l684187,28270r-6719,-1664l668858,26009r-8839,597l628421,56184r-813,7925l628421,72758r31598,28969l668858,102298r8610,-571l685088,100012r6769,-2857l697903,93154r4940,-6096l706094,80391r1880,-7633l708037,71818r534,-7709xem798677,l775728,r,38201l775728,58013r,13805l774204,76390r-3048,4572l768108,84010r-3048,1524l754392,85534r-3048,-1524l748296,80962r-3048,-4572l745248,51917r9233,-9245l764959,42672r9245,9245l775728,58013r,-19812l772680,35153r-4572,-3048l765060,29057r-9144,-3048l742200,26009,721194,58013r-431,6096l742200,102298r18288,l765060,100774r3048,-3048l772680,94678r3048,-4572l775728,100774r22949,l798677,90106r,-4572l798677,42672r,-4471l798677,xem882688,71818r-1524,-4661l876592,62585r-4661,-3048l864311,56489r-12192,l849071,54965r-4572,l841451,53441r-1524,l836879,50393r,-4572l838403,44297r1524,l846023,41249r9144,l859739,42773r4572,l873455,45821r4661,3048l878116,30581r-6185,-1524l867359,27533r-4572,l858215,26009r-19812,l830783,27533r-6198,4572l820013,35153r-3048,6096l816965,56489r1524,4572l823061,65633r4674,3048l833831,71818r10668,l849071,73342r4572,l856691,74866r1524,l861263,77914r,4572l859739,84010r-3048,1524l855167,87058r-18288,l818489,80962r,16764l823061,100774r6198,l833831,102298r15240,l856754,102019,882688,87058r,-15240xe" fillcolor="#243441" stroked="f">
                   <v:path arrowok="t"/>
-                  <v:fill type="solid"/>
                 </v:shape>
-                <v:shape style="position:absolute;left:5397;top:7308;width:551;height:159" type="#_x0000_t75" id="docshape25" stroked="false">
-                  <v:imagedata r:id="rId15" o:title=""/>
+                <v:shape id="Image 23" o:spid="_x0000_s1032" type="#_x0000_t75" style="position:absolute;left:14345;top:7012;width:4200;height:1023;visibility:visible;mso-wrap-style:square" o:gfxdata="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">
+                  <v:imagedata r:id="rId72" o:title=""/>
                 </v:shape>
-                <v:shape style="position:absolute;left:5979;top:7317;width:462;height:149" type="#_x0000_t75" id="docshape26" stroked="false">
-                  <v:imagedata r:id="rId16" o:title=""/>
+                <v:shape id="Graphic 24" o:spid="_x0000_s1033" style="position:absolute;left:19231;top:7012;width:6312;height:1029;visibility:visible;mso-wrap-style:square;v-text-anchor:top" coordsize="631190,102870" o:gfxdata="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" path="m108496,3048r-32106,l53530,56489,32105,3048,,3048r,97726l22961,100774r,-70193l45821,82486r15329,l84010,30581r,70193l108496,100774r,-97726xem204685,64109r-800,-7721l203809,56184r-2172,-6934l180213,28702r,23215l180213,56388r-30455,l149834,56184r1423,-4267l152781,48869r3048,-3048l157403,42672r229,l161925,41249r9144,l173926,42672r140,l175641,45821r3048,3048l180213,51917r,-23215l174218,26822r-7721,-813l157645,26606,128244,48869r-114,381l126060,56184r-13,204l125247,64109r24625,35903l168021,102298r10668,l184785,100774r4572,l195541,99250r4572,-3048l200113,87058r,-7620l195541,80962r-6184,3048l180213,87058r-16764,l158877,85534r-3048,-1524l152781,80962r-3048,-4572l149733,71818r54952,l204685,64109xem271843,27533r-24384,l247459,7721r-22962,l224497,27533r-12192,l212305,44297r12192,l224497,85534r1524,6096l233641,99250r6096,1524l268795,100774r,-16764l250507,84010r-3048,-3048l247459,44297r24384,l271843,27533xem358902,47345r-1524,-7620l352806,33629r-4572,-4572l342138,26009r-13805,l323761,27533r-3048,1524l316141,32105r-3048,3048l308521,38201,308521,,285559,r,100774l308521,100774r,-42761l310045,53441r3048,-4572l316141,45821r3048,-1524l328333,44297r1524,1524l331381,45821r3048,3048l334429,51917r1524,1524l335953,100774r22949,l358902,56489r,-9144xem455104,64109l432193,28486r-1575,-369l430618,58013r,13805l427570,80962r-3048,3048l419950,87058r-9144,l406234,84010r-3048,-3048l400138,71818r,-13805l401662,51917r1524,-3048l406234,44297r4572,-1524l419950,42773r4572,1524l427570,48869r1524,3048l430618,58013r,-29896l424205,26606r-8827,-597l406577,26606,376262,56184r-596,7925l376262,72758r30315,28969l415378,102298r8827,-571l432193,100012r6846,-2857l444436,93154r4940,-6096l452628,80391r1879,-7633l454571,71818r533,-7709xem545211,l522249,r,38201l522249,58013r,13805l520725,76390r-3048,4572l516153,84010r-4572,1524l502437,85534r-4572,-1524l494817,80962r-3048,-9144l491769,58013r1524,-6096l494817,48869r3048,-3048l502589,42672r8852,l516153,45821r1524,3048l520725,51917r1524,6096l522249,38201r-3048,-3048l514629,32105r-3048,-3048l502437,26009r-13716,l467753,58013r-457,6096l467868,72732r1714,7468l472440,86487r4000,5143l481012,99250r7709,3048l507009,102298r4572,-1524l516153,97726r3048,-3048l522249,90106r,10668l545211,100774r,-10668l545211,85534r,-42862l545211,38201,545211,xem630745,71818r-3048,-4661l619975,59537r-9144,-3048l600163,56489r-4572,-1524l591019,54965r-3048,-1524l586447,53441r-1524,-1524l584923,44297r3048,l589495,42773r3048,-1524l601687,41249r4572,1524l610831,42773r9144,3048l624547,48869r,-18288l619975,29057r-6096,-1524l609307,27533r-4572,-1524l584923,26009r-7708,1524l571119,32105r-4572,3048l563499,41249r,15240l565023,61061r4572,4572l574167,68681r7708,3137l592543,71818r3048,1524l600163,73342r3048,1524l604735,74866r3048,3048l607783,82486r-3048,3048l601687,87058r-18288,l565023,80962r,16764l569595,100774r6096,l580351,102298r15240,l603935,102019,630745,87058r,-15240xe" fillcolor="#aaa" stroked="f">
+                  <v:path arrowok="t"/>
                 </v:shape>
-                <v:shape style="position:absolute;left:6542;top:7305;width:994;height:162" id="docshape27" coordorigin="6542,7306" coordsize="994,162" path="m6713,7310l6663,7310,6629,7395,6593,7310,6542,7310,6542,7464,6581,7464,6581,7354,6617,7436,6641,7436,6677,7354,6677,7464,6713,7464,6713,7310xm6865,7407l6864,7394,6864,7394,6861,7383,6857,7373,6855,7371,6850,7363,6841,7357,6830,7351,6829,7351,6829,7387,6829,7394,6780,7394,6780,7387,6785,7383,6785,7382,6788,7378,6793,7373,6793,7373,6800,7371,6812,7371,6819,7373,6819,7373,6821,7378,6826,7383,6829,7387,6829,7351,6819,7348,6807,7347,6792,7348,6779,7350,6768,7356,6759,7363,6751,7372,6746,7382,6746,7383,6746,7383,6743,7394,6743,7394,6742,7407,6743,7420,6747,7432,6752,7443,6759,7452,6769,7459,6781,7463,6794,7466,6809,7467,6826,7467,6833,7464,6843,7464,6853,7462,6860,7457,6860,7443,6860,7431,6853,7433,6843,7438,6836,7440,6826,7443,6802,7443,6795,7440,6790,7438,6783,7433,6780,7426,6780,7419,6865,7419,6865,7407xm6971,7349l6934,7349,6934,7318,6896,7318,6896,7349,6879,7349,6879,7375,6896,7375,6896,7440,6901,7450,6913,7462,6922,7464,6968,7464,6968,7438,6939,7438,6934,7433,6934,7375,6971,7375,6971,7349xm7110,7380l7108,7368,7100,7359,7093,7351,7083,7347,7062,7347,7047,7351,7043,7356,7035,7361,7031,7366,7031,7306,6995,7306,6995,7464,7031,7464,7031,7397,7033,7390,7038,7383,7043,7378,7047,7375,7062,7375,7064,7378,7067,7378,7069,7380,7069,7383,7071,7385,7071,7395,7074,7402,7074,7464,7110,7464,7110,7395,7110,7380xm7261,7407l7261,7394,7258,7382,7253,7373,7252,7372,7245,7363,7235,7356,7225,7350,7223,7350,7223,7397,7223,7419,7221,7426,7216,7433,7213,7438,7206,7443,7189,7443,7180,7433,7175,7426,7173,7419,7173,7397,7175,7387,7180,7383,7185,7375,7189,7373,7206,7373,7213,7375,7216,7383,7221,7387,7223,7397,7223,7350,7213,7348,7199,7347,7185,7348,7172,7350,7161,7356,7151,7363,7144,7372,7139,7382,7139,7383,7135,7394,7134,7407,7135,7420,7139,7432,7144,7443,7151,7452,7161,7459,7172,7463,7185,7466,7199,7467,7213,7466,7225,7463,7235,7459,7245,7452,7252,7443,7252,7443,7258,7432,7261,7420,7261,7419,7261,7407xm7403,7306l7367,7306,7367,7366,7367,7397,7367,7419,7365,7426,7360,7433,7355,7438,7350,7440,7334,7440,7329,7438,7324,7433,7319,7426,7319,7387,7334,7373,7350,7373,7365,7387,7367,7397,7367,7366,7362,7361,7355,7356,7350,7351,7336,7347,7314,7347,7302,7354,7293,7363,7288,7373,7284,7383,7282,7394,7281,7397,7281,7407,7282,7420,7284,7432,7288,7442,7293,7450,7302,7462,7314,7467,7343,7467,7350,7464,7355,7460,7362,7455,7367,7448,7367,7464,7403,7464,7403,7448,7403,7440,7403,7373,7403,7366,7403,7306xm7536,7419l7533,7411,7521,7399,7507,7395,7488,7395,7483,7392,7476,7392,7471,7390,7468,7390,7463,7385,7463,7378,7466,7375,7468,7375,7478,7371,7492,7371,7500,7373,7507,7373,7521,7378,7528,7383,7528,7354,7519,7351,7512,7349,7504,7349,7497,7347,7466,7347,7454,7349,7444,7356,7437,7361,7432,7371,7432,7395,7435,7402,7442,7409,7449,7414,7461,7419,7476,7419,7483,7421,7490,7421,7495,7424,7497,7424,7502,7428,7502,7436,7500,7438,7495,7440,7492,7443,7463,7443,7435,7433,7435,7460,7442,7464,7451,7464,7459,7467,7483,7467,7495,7466,7506,7465,7515,7463,7524,7460,7531,7452,7536,7443,7536,7419xe" filled="true" fillcolor="#aaaaaa" stroked="false">
+                <v:shape id="Image 25" o:spid="_x0000_s1034" type="#_x0000_t75" style="position:absolute;left:28715;top:7027;width:3496;height:1008;visibility:visible;mso-wrap-style:square" o:gfxdata="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">
+                  <v:imagedata r:id="rId73" o:title=""/>
+                </v:shape>
+                <v:shape id="Image 26" o:spid="_x0000_s1035" type="#_x0000_t75" style="position:absolute;left:32410;top:7089;width:2932;height:946;visibility:visible;mso-wrap-style:square" o:gfxdata="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">
+                  <v:imagedata r:id="rId74" o:title=""/>
+                </v:shape>
+                <v:shape id="Graphic 27" o:spid="_x0000_s1036" style="position:absolute;left:35983;top:7012;width:6312;height:1029;visibility:visible;mso-wrap-style:square;v-text-anchor:top" coordsize="631190,102870" o:gfxdata="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" path="m108394,3048r-32106,l54952,56489,32004,3048,,3048r,97726l24384,100774r,-70193l47332,82486r15240,l85432,30581r,70193l108394,100774r,-97726xem204685,64109r-584,-7721l204050,56184r-1701,-6934l199466,42672r-965,-1423l195440,36677r-5995,-4242l182867,29057r-1143,-355l181724,51917r,4471l151155,56388r,-4471l154203,48869r102,-190l155816,45821r3149,-3149l159156,42672r4280,-1423l171056,41249r4292,1423l175590,42672r1562,3149l180200,48869r1524,3048l181724,28702r-5995,-1880l168008,26009r-9525,597l129108,49250r-1740,6934l127355,56388r-584,7721l127584,72758r32220,28969l169532,102298r10668,l184772,100774r6096,l196964,99250r4572,-3048l201536,87058r,-7620l196964,80962r-6096,3048l186296,85534r-6096,1524l164960,87058r-4572,-1524l157340,84010r-4661,-3048l151155,76390r,-4572l204685,71818r,-7709xem271843,27533r-22962,l248881,7721r-24384,l224497,27533r-10756,l213741,44297r10756,l224497,85534r3048,6096l235165,99250r6096,1524l270319,100774r,-16764l251929,84010r-3048,-3048l248881,44297r22962,l271843,27533xem360426,47345r-1524,-7620l354330,33629r-4572,-4572l343560,26009r-13716,l320700,29057r-3048,3048l313080,35153r-3048,3048l310032,,287083,r,100774l310032,100774r,-42761l311556,53441r3048,-4572l317652,45821r3048,-1524l329844,44297r1524,1524l332892,45821r1524,1524l334416,48869r1524,1524l335940,56489r1524,4572l337464,100774r22962,l360426,56489r,-9144xem456615,64109l433146,28486r-915,-216l432231,58013r,13805l430618,76390r-3048,4572l426046,84010r-4572,3048l410806,87058r-6096,-6096l401662,76390r-1524,-4572l400138,58013r1524,-6096l404710,48869r3048,-4572l410806,42773r10668,l426046,44297r1524,4572l430618,51917r1613,6096l432231,28270r-6718,-1664l416902,26009r-8839,597l378663,48869r-2197,7315l375653,64109r813,8649l378714,80391r38188,21907l425513,101727r7633,-1715l439915,97155r6032,-4001l450888,87058r3251,-6667l456031,72758r64,-940l456615,64109xem546722,l523773,r,38201l523773,58013r,13805l522249,76390r-3048,4572l516153,84010r-3048,1524l502437,85534r-3048,-1524l496341,80962r-3048,-4572l493293,51917r9233,-9245l513003,42672r9246,9245l523773,58013r,-19812l520725,35153r-4572,-3048l513105,29057r-9144,-3048l490245,26009,469252,58013r-445,6096l490245,102298r18288,l513105,100774r3048,-3048l520725,94678r3048,-4572l523773,100774r22949,l546722,90106r,-4572l546722,42672r,-4471l546722,xem630643,71818r-1524,-4661l621499,59537r-9144,-3048l600163,56489r-3048,-1524l592543,54965r-3048,-1524l587883,53441r-3048,-3048l584835,45821r1524,-1524l587883,44297r6184,-3048l603211,41249r4572,1524l612355,42773r9144,3048l626071,48869r,-18288l619975,29057r-4572,-1524l610831,27533r-4572,-1524l586359,26009r-7620,1524l572643,32105r-4572,3048l565023,41249r,15240l566547,61061r4572,4572l575691,68681r7620,3137l592543,71818r4572,1524l601687,73342r3048,1524l606259,74866r3048,3048l609307,82486r-1524,1524l604735,85534r-1524,1524l584835,87058,566547,80962r,16764l571119,100774r6096,l581787,102298r15328,l604812,102019,630643,87058r,-15240xe" fillcolor="#aaa" stroked="f">
                   <v:path arrowok="t"/>
-                  <v:fill type="solid"/>
                 </v:shape>
-                <v:shape style="position:absolute;left:1179;top:7781;width:433;height:152" type="#_x0000_t75" id="docshape28" stroked="false">
-                  <v:imagedata r:id="rId17" o:title=""/>
+                <v:shape id="Image 28" o:spid="_x0000_s1037" type="#_x0000_t75" style="position:absolute;left:1931;top:10034;width:2748;height:962;visibility:visible;mso-wrap-style:square" o:gfxdata="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">
+                  <v:imagedata r:id="rId75" o:title=""/>
                 </v:shape>
-                <v:shape style="position:absolute;left:1646;top:7781;width:431;height:152" type="#_x0000_t75" id="docshape29" stroked="false">
-                  <v:imagedata r:id="rId18" o:title=""/>
+                <v:shape id="Image 29" o:spid="_x0000_s1038" type="#_x0000_t75" style="position:absolute;left:4894;top:10033;width:2732;height:963;visibility:visible;mso-wrap-style:square" o:gfxdata="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">
+                  <v:imagedata r:id="rId76" o:title=""/>
                 </v:shape>
-                <v:shape style="position:absolute;left:2156;top:7819;width:109;height:114" type="#_x0000_t75" id="docshape30" stroked="false">
-                  <v:imagedata r:id="rId19" o:title=""/>
+                <v:shape id="Image 30" o:spid="_x0000_s1039" type="#_x0000_t75" style="position:absolute;left:8130;top:10278;width:688;height:718;visibility:visible;mso-wrap-style:square" o:gfxdata="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">
+                  <v:imagedata r:id="rId77" o:title=""/>
                 </v:shape>
-                <v:shape style="position:absolute;left:2295;top:7781;width:246;height:152" type="#_x0000_t75" id="docshape31" stroked="false">
-                  <v:imagedata r:id="rId20" o:title=""/>
+                <v:shape id="Image 31" o:spid="_x0000_s1040" type="#_x0000_t75" style="position:absolute;left:9016;top:10034;width:1558;height:962;visibility:visible;mso-wrap-style:square" o:gfxdata="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">
+                  <v:imagedata r:id="rId78" o:title=""/>
                 </v:shape>
-                <v:shape style="position:absolute;left:2627;top:7788;width:501;height:186" type="#_x0000_t75" id="docshape32" stroked="false">
-                  <v:imagedata r:id="rId21" o:title=""/>
+                <v:shape id="Image 32" o:spid="_x0000_s1041" type="#_x0000_t75" style="position:absolute;left:11124;top:10080;width:3175;height:1175;visibility:visible;mso-wrap-style:square" o:gfxdata="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">
+                  <v:imagedata r:id="rId79" o:title=""/>
                 </v:shape>
-                <v:shape style="position:absolute;left:3305;top:7781;width:801;height:152" id="docshape33" coordorigin="3306,7782" coordsize="801,152" path="m3464,7789l3416,7789,3385,7863,3351,7789,3306,7789,3306,7931,3339,7931,3339,7827,3373,7904,3397,7904,3428,7827,3428,7931,3464,7931,3464,7789xm3604,7878l3603,7866,3600,7855,3596,7845,3595,7844,3589,7837,3581,7830,3572,7825,3570,7824,3570,7859,3570,7866,3524,7866,3527,7859,3529,7854,3537,7847,3544,7844,3556,7844,3561,7847,3568,7854,3570,7859,3570,7824,3561,7821,3549,7820,3536,7821,3525,7825,3515,7830,3505,7837,3499,7845,3494,7855,3492,7866,3491,7878,3492,7890,3494,7901,3499,7910,3505,7919,3515,7925,3525,7929,3537,7932,3551,7933,3568,7933,3575,7931,3585,7931,3592,7928,3599,7923,3599,7911,3599,7897,3592,7902,3570,7909,3561,7911,3546,7911,3539,7909,3534,7904,3529,7902,3527,7895,3524,7887,3604,7887,3604,7878xm3702,7822l3669,7822,3669,7794,3635,7794,3635,7822,3616,7822,3616,7849,3635,7849,3635,7907,3638,7916,3642,7921,3647,7928,3657,7931,3700,7931,3700,7907,3676,7907,3674,7904,3671,7904,3669,7902,3669,7849,3702,7849,3702,7822xm3832,7851l3830,7839,3815,7825,3806,7820,3787,7820,3782,7822,3775,7825,3770,7830,3763,7832,3758,7839,3758,7782,3724,7782,3724,7931,3758,7931,3758,7868,3760,7861,3765,7856,3770,7849,3775,7847,3787,7847,3789,7849,3791,7849,3794,7851,3794,7854,3796,7856,3796,7866,3799,7871,3799,7931,3832,7931,3832,7866,3832,7851xm3974,7878l3973,7865,3969,7854,3965,7847,3964,7845,3957,7837,3949,7829,3939,7824,3938,7824,3938,7868,3938,7887,3936,7895,3931,7902,3929,7907,3921,7909,3907,7909,3902,7907,3897,7902,3893,7895,3890,7887,3890,7868,3893,7859,3902,7849,3907,7847,3921,7847,3929,7849,3931,7854,3936,7859,3938,7868,3938,7824,3928,7821,3914,7820,3901,7821,3889,7824,3879,7829,3871,7837,3865,7845,3860,7854,3857,7865,3857,7878,3857,7890,3860,7901,3865,7911,3871,7919,3879,7925,3889,7929,3901,7932,3914,7933,3928,7932,3939,7929,3949,7925,3957,7919,3964,7911,3965,7909,3969,7901,3973,7890,3974,7878xm4106,7782l4070,7782,4070,7839,4070,7868,4070,7887,4068,7895,4066,7899,4061,7907,4056,7909,4041,7909,4034,7907,4032,7899,4027,7895,4025,7887,4025,7868,4027,7859,4037,7849,4041,7847,4056,7847,4061,7849,4066,7854,4068,7859,4070,7868,4070,7839,4066,7832,4061,7830,4056,7825,4049,7822,4044,7820,4022,7820,4013,7827,4003,7837,3998,7845,3994,7855,3992,7866,3992,7868,3991,7878,3992,7889,3994,7900,3998,7909,4003,7919,4013,7928,4022,7933,4049,7933,4056,7928,4061,7926,4070,7916,4070,7931,4106,7931,4106,7916,4106,7909,4106,7847,4106,7839,4106,7782xe" filled="true" fillcolor="#343833" stroked="false">
+                <v:shape id="Graphic 33" o:spid="_x0000_s1042" style="position:absolute;left:15430;top:10034;width:5086;height:965;visibility:visible;mso-wrap-style:square;v-text-anchor:top" coordsize="508634,96520" o:gfxdata="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" path="m100774,4572r-30582,l50380,51904,28956,4572,,4572,,94678r21336,l21336,29044,42672,77812r15328,l77812,29044r,65634l100774,94678r,-90106xem189344,61048l168871,27482r-952,-304l167919,48856r,4509l138887,53365r1600,-4509l142011,45808r4572,-4572l151155,39712r7620,l161823,41236r4572,4572l167919,48856r,-21678l161899,25209r-7696,-825l146469,25209,118097,53365r-572,7683l118097,68745r29019,26873l155727,96202r10668,l170967,94678r6096,l181635,93052r4572,-3048l186207,82384r,-9144l181635,76288r-13716,4572l161823,82384r-9144,l148107,80860r-3048,-3048l142011,76288r-1524,-4572l138861,67144r50483,l189344,61048xem251929,25908r-21424,l230505,7620r-21336,l209169,25908r-12192,l196977,42760r12192,l209169,79336r1524,6096l213741,88480r3048,4572l222885,94678r27520,l250405,79336r-15328,l233553,77812r-1524,l230505,76288r,-33528l251929,42760r,-16852xem334416,44284r-1524,-7620l323659,27432r-6096,-3048l305371,24384r-3048,1524l297751,27432r-3048,3136l290131,32092r-3048,4572l287083,,265645,r,94678l287083,94678r,-39726l288607,50380r3048,-3048l294703,42760r3048,-1524l305371,41236r1524,1524l308419,42760r1524,1524l309943,45808r1524,1524l311467,53428r1524,3048l312991,94678r21425,l334416,53428r,-9144xem424522,61048l402412,26949r-750,-178l401662,54952r,12192l400138,71716r-3048,4572l395566,79336r-4660,1524l381762,80860r-3048,-1524l375666,76288r-3048,-4572l371094,67144r,-12192l372618,48856r6096,-6096l381762,41236r9144,l395566,42760r1524,3048l400138,48856r1524,6096l401662,26771r-6705,-1702l386334,24472r-8573,597l350329,52717r-571,8331l350329,68745r27432,26886l386334,96202r8623,-571l423710,68745r812,-7697xem508431,l485571,r,36664l485571,54952r,12192l484047,71716r-1524,3048l479475,79336r-3137,1524l467194,80860r-4572,-1524l461098,74764r-3048,-3048l456526,67144r,-12192l458050,48856r6096,-6096l467194,41236r9144,l479475,42760r3048,3048l484047,48856r1524,6096l485571,36664r-3048,-4572l479475,30568r-3137,-3136l471766,25908r-3048,-1524l455002,24384,435190,61048r547,7481l455002,96202r16764,l476338,93052r3137,-1524l485571,85432r,9246l508431,94678r,-9246l508431,80860r,-39624l508431,36664,508431,xe" fillcolor="#343833" stroked="f">
                   <v:path arrowok="t"/>
-                  <v:fill type="solid"/>
                 </v:shape>
-                <v:shape style="position:absolute;left:6114;top:7781;width:657;height:152" type="#_x0000_t75" id="docshape34" stroked="false">
-                  <v:imagedata r:id="rId22" o:title=""/>
+                <v:shape id="Image 34" o:spid="_x0000_s1043" type="#_x0000_t75" style="position:absolute;left:33266;top:10033;width:4168;height:963;visibility:visible;mso-wrap-style:square" o:gfxdata="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">
+                  <v:imagedata r:id="rId80" o:title=""/>
                 </v:shape>
-                <v:shape style="position:absolute;left:6804;top:7781;width:544;height:190" type="#_x0000_t75" id="docshape35" stroked="false">
-                  <v:imagedata r:id="rId23" o:title=""/>
+                <v:shape id="Image 35" o:spid="_x0000_s1044" type="#_x0000_t75" style="position:absolute;left:37648;top:10033;width:3451;height:1206;visibility:visible;mso-wrap-style:square" o:gfxdata="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">
+                  <v:imagedata r:id="rId81" o:title=""/>
                 </v:shape>
-                <v:shape style="position:absolute;left:1182;top:8221;width:1352;height:205" id="docshape36" coordorigin="1182,8221" coordsize="1352,205" path="m1266,8339l1264,8332,1254,8322,1247,8318,1238,8318,1230,8315,1218,8313,1211,8310,1206,8308,1204,8306,1202,8301,1202,8291,1204,8286,1218,8279,1240,8279,1254,8286,1262,8289,1262,8270,1254,8267,1250,8267,1245,8265,1238,8265,1233,8262,1214,8262,1202,8267,1194,8272,1187,8279,1182,8286,1182,8306,1185,8313,1192,8318,1197,8325,1204,8327,1214,8330,1221,8330,1223,8332,1240,8334,1247,8339,1247,8356,1245,8361,1230,8368,1209,8368,1204,8366,1182,8358,1182,8378,1190,8380,1197,8380,1204,8382,1209,8385,1235,8385,1247,8380,1254,8375,1262,8368,1266,8358,1266,8339xm1394,8267l1351,8267,1351,8233,1331,8233,1331,8267,1300,8267,1300,8282,1331,8282,1331,8358,1334,8368,1341,8373,1346,8378,1355,8380,1394,8380,1394,8366,1358,8366,1355,8361,1353,8358,1351,8351,1351,8282,1394,8282,1394,8267xm1524,8306l1521,8298,1521,8289,1519,8284,1516,8282,1515,8279,1512,8274,1507,8270,1485,8262,1468,8262,1464,8265,1456,8265,1449,8267,1444,8270,1437,8272,1437,8291,1442,8286,1456,8282,1461,8282,1468,8279,1485,8279,1492,8282,1497,8286,1502,8289,1504,8296,1504,8308,1504,8322,1504,8339,1502,8351,1495,8358,1490,8366,1480,8368,1464,8368,1456,8366,1449,8358,1447,8354,1447,8339,1449,8332,1456,8330,1461,8325,1468,8322,1504,8322,1504,8308,1461,8308,1449,8313,1442,8318,1432,8325,1428,8334,1428,8358,1432,8368,1444,8380,1454,8385,1476,8385,1483,8382,1488,8380,1495,8375,1500,8370,1501,8368,1504,8363,1504,8380,1524,8380,1524,8363,1524,8322,1524,8306xm1646,8267l1603,8267,1603,8233,1586,8233,1586,8267,1555,8267,1555,8282,1586,8282,1586,8358,1589,8368,1593,8373,1601,8378,1610,8380,1646,8380,1646,8366,1613,8366,1605,8358,1603,8351,1603,8282,1646,8282,1646,8267xm1743,8221l1723,8221,1723,8246,1743,8246,1743,8221xm1779,8366l1743,8366,1743,8267,1694,8267,1694,8282,1723,8282,1723,8366,1685,8366,1685,8380,1779,8380,1779,8366xm1904,8272l1899,8270,1892,8267,1887,8265,1882,8265,1877,8262,1870,8262,1858,8264,1847,8267,1837,8272,1829,8279,1823,8289,1818,8299,1816,8311,1815,8325,1816,8337,1818,8349,1823,8360,1829,8368,1837,8376,1847,8381,1858,8384,1870,8385,1877,8385,1882,8382,1887,8382,1894,8380,1904,8375,1904,8356,1899,8361,1884,8368,1860,8368,1851,8363,1836,8349,1834,8339,1834,8310,1836,8298,1851,8284,1860,8279,1877,8279,1882,8282,1889,8282,1894,8284,1899,8289,1904,8291,1904,8272xm2154,8366l2125,8366,2120,8363,2113,8349,2113,8339,2113,8221,2065,8221,2065,8236,2094,8236,2094,8354,2099,8363,2103,8370,2111,8378,2118,8380,2154,8380,2154,8366xm2286,8325l2285,8310,2284,8297,2280,8287,2274,8279,2267,8272,2267,8339,2264,8349,2260,8356,2255,8366,2248,8368,2228,8368,2221,8366,2216,8356,2211,8349,2209,8339,2209,8310,2211,8298,2221,8284,2228,8279,2248,8279,2255,8284,2264,8298,2267,8310,2267,8339,2267,8272,2264,8270,2252,8262,2221,8262,2209,8270,2202,8279,2196,8287,2191,8297,2191,8298,2188,8310,2188,8310,2187,8325,2188,8338,2191,8350,2196,8360,2202,8368,2209,8380,2221,8385,2252,8385,2267,8380,2274,8368,2280,8360,2284,8350,2284,8349,2285,8338,2286,8325xm2409,8294l2406,8284,2399,8274,2394,8267,2385,8262,2365,8262,2358,8265,2353,8270,2349,8272,2344,8277,2339,8284,2339,8267,2320,8267,2320,8380,2339,8380,2339,8306,2341,8296,2346,8289,2351,8284,2358,8279,2375,8279,2380,8282,2385,8286,2387,8291,2390,8301,2390,8380,2409,8380,2409,8310,2409,8294xm2534,8267l2514,8267,2514,8282,2514,8308,2514,8337,2512,8349,2510,8356,2505,8363,2498,8366,2478,8366,2471,8363,2466,8356,2462,8349,2459,8337,2459,8308,2462,8298,2466,8291,2471,8284,2478,8279,2498,8279,2505,8284,2510,8291,2512,8298,2512,8299,2514,8308,2514,8282,2514,8279,2512,8274,2507,8272,2502,8267,2498,8265,2490,8262,2471,8262,2459,8270,2452,8279,2447,8289,2443,8299,2441,8310,2440,8322,2441,8336,2441,8337,2443,8348,2447,8358,2452,8366,2459,8378,2471,8382,2493,8382,2507,8375,2512,8370,2514,8366,2514,8363,2514,8390,2510,8404,2505,8409,2498,8411,2476,8411,2466,8406,2452,8402,2452,8421,2459,8423,2464,8423,2469,8426,2502,8426,2514,8421,2522,8414,2523,8411,2528,8406,2531,8397,2533,8386,2533,8382,2533,8378,2534,8363,2534,8282,2534,8267xe" filled="true" fillcolor="#343833" stroked="false">
+                <v:shape id="Graphic 36" o:spid="_x0000_s1045" style="position:absolute;left:1947;top:12827;width:8585;height:1302;visibility:visible;mso-wrap-style:square;v-text-anchor:top" coordsize="858519,130175" o:gfxdata="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" path="m53428,74866l51904,70192,45808,64096,41148,61048r-6096,l30480,59524,12192,50380r,-6096l13716,41236r9144,-4572l36576,36664r9232,4572l50380,42760r,-12192l45808,29044r-3136,l39624,27520r-4572,l32004,25996r-12192,l12192,29044,7620,32092,3048,36664,,41236,,53428r1524,4572l6096,61048r3048,4572l13716,67144r6096,1524l24384,68668r1524,1524l36576,71716r4572,3150l41148,85534r-1524,3048l30480,93154r-13716,l13716,91630,,87058,,99250r4572,1524l9144,100774r4572,1524l16764,103822r16764,l41148,100774r4660,-3048l50380,93154r3048,-6096l53428,74866xem134302,29044r-27432,l106870,7620r-12192,l94678,29044r-19914,l74764,38188r19914,l94678,87058r1524,6096l100774,96202r3048,3048l109918,100774r24384,l134302,91630r-22860,l109918,88582r-1524,-1524l106870,82486r,-44298l134302,38188r,-9144xem216776,53428r-1524,-4572l215252,42760r-1524,-3048l212204,38188r-1016,-1524l209156,33616r-3048,-3048l192392,25996r-10757,l178587,27520r-4572,l169443,29044r-3048,1524l161823,32092r,12192l164871,41236r9144,-3048l177063,38188r4572,-1524l192392,36664r4572,1524l200012,41236r3048,1524l204584,47332r,7620l204584,64096r,10770l203060,82486r-4572,4572l195440,91630r-6096,1524l178587,93154r-4572,-1524l169443,87058r-1524,-3048l167919,74866r1524,-4674l174015,68668r3048,-3048l181635,64096r22949,l204584,54952r-27521,l169443,58000r-4572,3048l158775,65620r-3048,6096l155727,87058r3048,6096l166395,100774r6096,3048l186207,103822,202552,93154r2032,-3048l204584,100774r12192,l216776,90106r,-26010l216776,53428xem294703,29044r-27534,l267169,7620r-10668,l256501,29044r-19812,l236689,38188r19812,l256501,87058r1524,6096l261073,96202r4572,3048l271741,100774r22962,l294703,91630r-21438,l268693,87058r-1524,-4572l267169,38188r27534,l294703,29044xem355752,l343560,r,15328l355752,15328,355752,xem378612,91630r-22860,l355752,29044r-30582,l325170,38188r18390,l343560,91630r-24486,l319074,100774r59538,l378612,91630xem458050,32092r-3048,-1524l450430,29044r-3048,-1524l444334,27520r-3048,-1524l436714,25996,403860,49428r-2286,16192l402145,73609r26822,29616l436714,103822r4572,l444334,102298r3048,l451954,100774r6096,-3048l458050,85534r-3048,3048l445858,93154r-15240,l424434,90106r-9144,-9144l413766,74866r,-18390l415290,48856r9144,-9144l430618,36664r10668,l444334,38188r4572,l451954,39712r3048,3048l458050,44284r,-12192xem616839,91630r-18288,l595503,90106r-4572,-9144l590931,74866,590931,,560349,r,9232l578739,9232r,74778l581787,90106r3048,4572l589407,99250r4572,1524l616839,100774r,-9144xem700836,65620l688644,32092r,42774l687120,80962r-3048,4572l681024,91630r-4572,1524l664171,93154r-4572,-1524l656551,85534r-3048,-4572l651979,74866r64,-18694l653503,48856r6096,-9144l664171,36664r12281,l681024,39712r6096,9144l688594,56172r50,18694l688644,32092r-1524,-1524l679500,25996r-19901,l651979,30568r-4572,6096l643407,41833r-2858,6452l640422,48856r-1587,7316l638822,56476r-559,9144l638835,74256r1714,7455l643407,88011r4000,5143l651979,100774r7620,3048l679500,103822r9144,-3048l693216,93154r3772,-5143l699312,81711r127,-749l700506,74256r330,-8636xem778764,45808r-1524,-6096l772668,33616r-3048,-4572l763422,25996r-12192,l746658,27520r-3048,3048l740562,32092r-3048,3048l734466,39712r,-10668l722274,29044r,71730l734466,100774r,-47346l735990,47332r3048,-4572l742086,39712r4572,-3048l757326,36664r3048,1524l763422,41236r1524,3048l766572,50380r,50394l778764,100774r,-44298l778764,45808xem858100,29044r-12192,l845908,38188r,16764l845908,73240r-1524,7722l842860,85534r-3048,4572l835240,91630r-12192,l818476,90106r-3048,-4572l812292,80962r-1524,-7722l810768,54952r1524,-6096l815428,44284r3048,-4572l823048,36664r12192,l845908,54952r,-16764l845400,36664r-1016,-3048l841336,32092r-3048,-3048l835240,27520r-4572,-1524l818476,25996,798576,64096r546,8636l799223,73240r1448,6947l803071,86487r3125,5143l810768,99250r7708,3048l832192,102298r9144,-4572l844384,94678r1016,-3048l845908,90106r,16764l842860,116014r-3048,3048l835240,120586r-13716,l815428,117538r-9232,-3048l806196,126682r4572,1524l813816,128206r3136,1524l838288,129730r7620,-3048l850480,122110r1169,-1524l854240,117208r3860,-27102l858100,38188r,-9144xe" fillcolor="#343833" stroked="f">
                   <v:path arrowok="t"/>
-                  <v:fill type="solid"/>
                 </v:shape>
-                <v:shape style="position:absolute;left:3305;top:8228;width:222;height:157" type="#_x0000_t75" id="docshape37" stroked="false">
-                  <v:imagedata r:id="rId24" o:title=""/>
+                <v:shape id="Image 37" o:spid="_x0000_s1046" type="#_x0000_t75" style="position:absolute;left:15430;top:12874;width:1405;height:991;visibility:visible;mso-wrap-style:square" o:gfxdata="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">
+                  <v:imagedata r:id="rId82" o:title=""/>
                 </v:shape>
-                <v:shape style="position:absolute;left:3558;top:8233;width:351;height:152" type="#_x0000_t75" id="docshape38" stroked="false">
-                  <v:imagedata r:id="rId25" o:title=""/>
+                <v:shape id="Image 38" o:spid="_x0000_s1047" type="#_x0000_t75" style="position:absolute;left:17033;top:12903;width:2229;height:962;visibility:visible;mso-wrap-style:square" o:gfxdata="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">
+                  <v:imagedata r:id="rId83" o:title=""/>
                 </v:shape>
-                <v:shape style="position:absolute;left:3950;top:8209;width:462;height:176" type="#_x0000_t75" id="docshape39" stroked="false">
-                  <v:imagedata r:id="rId26" o:title=""/>
+                <v:shape id="Image 39" o:spid="_x0000_s1048" type="#_x0000_t75" style="position:absolute;left:19522;top:12751;width:2932;height:1114;visibility:visible;mso-wrap-style:square" o:gfxdata="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">
+                  <v:imagedata r:id="rId84" o:title=""/>
                 </v:shape>
-                <v:shape style="position:absolute;left:4469;top:8221;width:825;height:188" id="docshape40" coordorigin="4470,8221" coordsize="825,188" path="m4518,8221l4501,8221,4494,8234,4488,8246,4483,8257,4476,8281,4473,8292,4470,8304,4470,8315,4470,8326,4473,8338,4476,8350,4483,8373,4488,8385,4494,8397,4501,8409,4518,8409,4511,8397,4505,8385,4501,8374,4495,8351,4493,8339,4492,8327,4491,8315,4492,8303,4493,8291,4495,8280,4498,8270,4501,8257,4505,8246,4511,8234,4518,8221xm4628,8222l4609,8222,4609,8246,4628,8246,4628,8222xm4667,8366l4628,8366,4628,8267,4580,8267,4580,8282,4609,8282,4609,8366,4573,8366,4573,8380,4667,8380,4667,8366xm4789,8294l4780,8274,4773,8267,4765,8262,4746,8262,4739,8265,4732,8270,4727,8272,4722,8277,4720,8284,4720,8267,4700,8267,4700,8380,4720,8380,4720,8306,4722,8296,4727,8289,4732,8284,4739,8279,4753,8279,4761,8282,4763,8286,4768,8291,4770,8301,4770,8380,4789,8380,4789,8310,4789,8294xm4912,8267l4869,8267,4869,8233,4852,8233,4852,8267,4821,8267,4821,8282,4852,8282,4852,8358,4854,8368,4859,8373,4866,8378,4876,8380,4912,8380,4912,8366,4878,8366,4876,8361,4871,8358,4869,8351,4869,8282,4912,8282,4912,8267xm5167,8294l5164,8284,5160,8274,5152,8267,5145,8262,5126,8262,5119,8265,5112,8270,5107,8272,5102,8277,5100,8284,5100,8267,5080,8267,5080,8380,5100,8380,5100,8306,5102,8296,5107,8289,5112,8284,5119,8279,5133,8279,5140,8282,5143,8286,5148,8291,5150,8301,5150,8380,5167,8380,5167,8310,5167,8294xm5294,8267l5275,8267,5275,8344,5273,8351,5263,8366,5258,8368,5241,8368,5234,8366,5232,8361,5227,8356,5225,8349,5225,8267,5208,8267,5208,8337,5208,8354,5210,8366,5215,8373,5222,8380,5229,8385,5249,8385,5263,8380,5273,8370,5275,8363,5275,8380,5294,8380,5294,8267xe" filled="true" fillcolor="#343833" stroked="false">
+                <v:shape id="Graphic 40" o:spid="_x0000_s1049" style="position:absolute;left:22820;top:12827;width:5239;height:1194;visibility:visible;mso-wrap-style:square;v-text-anchor:top" coordsize="523875,119380" o:gfxdata="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" path="m30568,l19812,,15519,7823,1905,45046,,59524r520,7112l11811,103822r8001,15240l30568,119062r-4305,-7734l22682,104013,13716,59524r279,-7734l14859,44475r1422,-7023l18288,30568r1689,-7759l22682,15328,26263,7823,30568,xem100672,88r-12192,l88480,15328r12192,l100672,88xem125158,91630r-24486,l100672,29044r-30480,l70192,38188r18288,l88480,91630r-22948,l65532,100774r59626,l125158,91630xem203073,45808l196977,33616r-4572,-4572l187833,25996r-12192,l170980,27520r-4572,3048l163360,32092r-3048,3048l158788,39712r,-10668l146596,29044r,71730l158788,100774r,-47346l160312,47332r3048,-4572l166408,39712r4572,-3048l180213,36664r4572,1524l186309,41236r3048,3048l190881,50380r,50394l203073,100774r,-44298l203073,45808xem280987,29044r-27534,l253453,7620r-10668,l242785,29044r-19812,l222973,38188r19812,l242785,87058r1524,6096l247357,96202r4572,3048l258025,100774r22962,l280987,91630r-21438,l258025,88582r-3048,-1524l253453,82486r,-44298l280987,38188r,-9144xem442810,45808r-1524,-6096l438238,33616r-4572,-4572l429094,25996r-12192,l412242,27520r-4572,3048l404622,32092r-3048,3048l400050,39712r,-10668l387858,29044r,71730l400050,100774r,-47346l401574,47332r3048,-4572l407670,39712r4572,-3048l421474,36664r4572,1524l427570,41236r3048,3048l432142,50380r,50394l442810,100774r,-44298l442810,45808xem523786,29044r-12192,l511594,77914r-1524,4572l503872,91630r-3048,1524l490156,93154r-4572,-1524l484060,88582r-3048,-3048l479488,80962r,-51918l468820,29044r,44196l468820,84010r1524,7620l473392,96202r4572,4572l482536,103822r12192,l503872,100774r6198,-6096l511594,90106r,10668l523786,100774r,-71730xe" fillcolor="#343833" stroked="f">
                   <v:path arrowok="t"/>
-                  <v:fill type="solid"/>
                 </v:shape>
-                <v:shape style="position:absolute;left:5325;top:8262;width:229;height:123" type="#_x0000_t75" id="docshape41" stroked="false">
-                  <v:imagedata r:id="rId27" o:title=""/>
+                <v:shape id="Image 41" o:spid="_x0000_s1050" type="#_x0000_t75" style="position:absolute;left:28256;top:13087;width:1451;height:778;visibility:visible;mso-wrap-style:square" o:gfxdata="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">
+                  <v:imagedata r:id="rId85" o:title=""/>
                 </v:shape>
-                <v:shape style="position:absolute;left:5604;top:8262;width:203;height:123" type="#_x0000_t75" id="docshape42" stroked="false">
-                  <v:imagedata r:id="rId28" o:title=""/>
+                <v:shape id="Image 42" o:spid="_x0000_s1051" type="#_x0000_t75" style="position:absolute;left:30028;top:13087;width:1283;height:778;visibility:visible;mso-wrap-style:square" o:gfxdata="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">
+                  <v:imagedata r:id="rId86" o:title=""/>
                 </v:shape>
-                <v:shape style="position:absolute;left:5854;top:8221;width:49;height:188" id="docshape43" coordorigin="5855,8221" coordsize="49,188" path="m5871,8409l5855,8409,5861,8397,5867,8385,5884,8315,5883,8304,5867,8245,5855,8221,5871,8221,5899,8281,5903,8315,5902,8326,5886,8385,5880,8397,5871,8409xe" filled="true" fillcolor="#343833" stroked="false">
+                <v:shape id="Graphic 43" o:spid="_x0000_s1052" style="position:absolute;left:31616;top:12827;width:311;height:1194;visibility:visible;mso-wrap-style:square;v-text-anchor:top" coordsize="31115,119380" o:gfxdata="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" path="m10668,119062l,119062r4286,-7763l8001,103822,18383,59531r-287,-7096l8001,15323,,,10668,,28003,37671r2572,21860l30289,66642,20085,103822r-4195,7477l10668,119062xe" fillcolor="#343833" stroked="f">
                   <v:path arrowok="t"/>
-                  <v:fill type="solid"/>
                 </v:shape>
-                <v:shape style="position:absolute;left:1153;top:8868;width:195;height:176" type="#_x0000_t75" id="docshape44" stroked="false">
-                  <v:imagedata r:id="rId29" o:title=""/>
+                <v:shape id="Image 44" o:spid="_x0000_s1053" type="#_x0000_t75" style="position:absolute;left:1763;top:16933;width:1237;height:1114;visibility:visible;mso-wrap-style:square" o:gfxdata="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">
+                  <v:imagedata r:id="rId87" o:title=""/>
                 </v:shape>
-                <v:shape style="position:absolute;left:1379;top:8860;width:756;height:185" type="#_x0000_t75" id="docshape45" stroked="false">
-                  <v:imagedata r:id="rId30" o:title=""/>
+                <v:shape id="Image 45" o:spid="_x0000_s1054" type="#_x0000_t75" style="position:absolute;left:3198;top:16887;width:4795;height:1175;visibility:visible;mso-wrap-style:square" o:gfxdata="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">
+                  <v:imagedata r:id="rId88" o:title=""/>
                 </v:shape>
-                <v:shape style="position:absolute;left:2165;top:8908;width:121;height:137" type="#_x0000_t75" id="docshape46" stroked="false">
-                  <v:imagedata r:id="rId31" o:title=""/>
+                <v:shape id="Image 46" o:spid="_x0000_s1055" type="#_x0000_t75" style="position:absolute;left:8192;top:17192;width:763;height:870;visibility:visible;mso-wrap-style:square" o:gfxdata="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">
+                  <v:imagedata r:id="rId89" o:title=""/>
                 </v:shape>
-                <v:shape style="position:absolute;left:2401;top:8860;width:41;height:183" id="docshape47" coordorigin="2402,8861" coordsize="41,183" path="m2442,8911l2402,8911,2402,9043,2442,9043,2442,8911xm2442,8861l2402,8861,2402,8894,2442,8894,2442,8861xe" filled="true" fillcolor="#343833" stroked="false">
+                <v:shape id="Graphic 47" o:spid="_x0000_s1056" style="position:absolute;left:9688;top:16887;width:261;height:1162;visibility:visible;mso-wrap-style:square;v-text-anchor:top" coordsize="26034,116205" o:gfxdata="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" path="m25908,32004l,32004r,83921l25908,115925r,-83921xem25908,l,,,21336r25908,l25908,xe" fillcolor="#343833" stroked="f">
                   <v:path arrowok="t"/>
-                  <v:fill type="solid"/>
                 </v:shape>
-                <v:shape style="position:absolute;left:2483;top:8908;width:133;height:135" type="#_x0000_t75" id="docshape48" stroked="false">
-                  <v:imagedata r:id="rId32" o:title=""/>
+                <v:shape id="Image 48" o:spid="_x0000_s1057" type="#_x0000_t75" style="position:absolute;left:10208;top:17192;width:839;height:855;visibility:visible;mso-wrap-style:square" o:gfxdata="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">
+                  <v:imagedata r:id="rId90" o:title=""/>
                 </v:shape>
-                <v:shape style="position:absolute;left:2653;top:8860;width:301;height:185" type="#_x0000_t75" id="docshape49" stroked="false">
-                  <v:imagedata r:id="rId33" o:title=""/>
+                <v:shape id="Image 49" o:spid="_x0000_s1058" type="#_x0000_t75" style="position:absolute;left:11291;top:16887;width:1909;height:1175;visibility:visible;mso-wrap-style:square" o:gfxdata="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">
+                  <v:imagedata r:id="rId91" o:title=""/>
                 </v:shape>
-                <v:shape style="position:absolute;left:2985;top:8860;width:611;height:185" type="#_x0000_t75" id="docshape50" stroked="false">
-                  <v:imagedata r:id="rId34" o:title=""/>
+                <v:shape id="Image 50" o:spid="_x0000_s1059" type="#_x0000_t75" style="position:absolute;left:13398;top:16887;width:3879;height:1175;visibility:visible;mso-wrap-style:square" o:gfxdata="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">
+                  <v:imagedata r:id="rId92" o:title=""/>
                 </v:shape>
-                <v:shape style="position:absolute;left:3704;top:8860;width:614;height:185" type="#_x0000_t75" id="docshape51" stroked="false">
-                  <v:imagedata r:id="rId35" o:title=""/>
+                <v:shape id="Image 51" o:spid="_x0000_s1060" type="#_x0000_t75" style="position:absolute;left:17965;top:16887;width:3894;height:1175;visibility:visible;mso-wrap-style:square" o:gfxdata="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">
+                  <v:imagedata r:id="rId93" o:title=""/>
                 </v:shape>
-                <v:shape style="position:absolute;left:4431;top:8908;width:116;height:137" type="#_x0000_t75" id="docshape52" stroked="false">
-                  <v:imagedata r:id="rId36" o:title=""/>
+                <v:shape id="Image 52" o:spid="_x0000_s1061" type="#_x0000_t75" style="position:absolute;left:22576;top:17192;width:733;height:870;visibility:visible;mso-wrap-style:square" o:gfxdata="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">
+                  <v:imagedata r:id="rId94" o:title=""/>
                 </v:shape>
-                <v:shape style="position:absolute;left:4581;top:8860;width:206;height:185" id="docshape53" coordorigin="4582,8861" coordsize="206,185" path="m4625,8861l4582,8861,4582,9043,4625,9043,4625,8861xm4787,8983l4787,8964,4787,8961,4786,8959,4786,8953,4783,8940,4781,8935,4779,8929,4773,8921,4763,8916,4751,8912,4736,8910,4720,8909,4693,8909,4684,8911,4676,8914,4667,8914,4667,8947,4674,8942,4688,8938,4696,8938,4705,8935,4724,8935,4732,8938,4736,8940,4744,8942,4746,8947,4746,8959,4746,8983,4746,8998,4744,9003,4736,9010,4732,9015,4724,9017,4705,9017,4703,9012,4698,9010,4698,8995,4700,8991,4703,8988,4708,8986,4715,8983,4746,8983,4746,8959,4720,8959,4704,8960,4691,8961,4680,8964,4672,8969,4659,8976,4655,8988,4655,9015,4659,9027,4667,9034,4676,9041,4688,9046,4710,9046,4720,9043,4727,9041,4734,9036,4739,9031,4746,9022,4746,9043,4787,9043,4787,9022,4787,9017,4787,8983xe" filled="true" fillcolor="#343833" stroked="false">
+                <v:shape id="Graphic 53" o:spid="_x0000_s1062" style="position:absolute;left:23532;top:16887;width:1308;height:1175;visibility:visible;mso-wrap-style:square;v-text-anchor:top" coordsize="130810,117475" o:gfxdata="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" path="m27432,l,,,115824r27432,l27432,xem130390,77825r-88,-12027l130187,63919r-89,-1334l129819,58293r-1715,-8001l126822,47244r-1575,-3760l87617,30480r-16764,l64757,32004r-4572,1524l54089,33528r,21336l58661,51816r9144,-3048l72377,48768r6096,-1524l90665,47244r4572,1524l98285,50292r4673,1524l104482,54864r,7721l104482,77825r,9144l102958,90017r-4673,4572l95237,97637r-4572,1524l78473,99161,76949,96113,73901,94589r,-9144l75425,82397r1524,-1524l79997,79349r4572,-1524l104482,77825r,-15240l87617,62585r-9690,305l46380,80873r,16764l49428,105257r4661,4572l60185,114401r7620,3048l81521,117449r22961,-15240l104482,115925r25908,l130390,102209r,-3048l130390,77825xe" fillcolor="#343833" stroked="f">
                   <v:path arrowok="t"/>
-                  <v:fill type="solid"/>
                 </v:shape>
-                <v:shape style="position:absolute;left:4818;top:8908;width:263;height:137" type="#_x0000_t75" id="docshape54" stroked="false">
-                  <v:imagedata r:id="rId37" o:title=""/>
+                <v:shape id="Image 54" o:spid="_x0000_s1063" type="#_x0000_t75" style="position:absolute;left:25035;top:17192;width:1664;height:870;visibility:visible;mso-wrap-style:square" o:gfxdata="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">
+                  <v:imagedata r:id="rId95" o:title=""/>
                 </v:shape>
-                <v:shape style="position:absolute;left:5166;top:8860;width:70;height:234" id="docshape55" coordorigin="5167,8861" coordsize="70,234" path="m5205,9094l5167,9094,5167,9068,5184,9068,5189,9065,5191,9060,5193,9058,5196,9051,5196,8911,5237,8911,5237,9041,5236,9051,5236,9053,5234,9063,5231,9072,5225,9080,5217,9089,5205,9094xm5237,8894l5196,8894,5196,8861,5237,8861,5237,8894xe" filled="true" fillcolor="#343833" stroked="false">
+                <v:shape id="Graphic 55" o:spid="_x0000_s1064" style="position:absolute;left:27249;top:16887;width:444;height:1486;visibility:visible;mso-wrap-style:square;v-text-anchor:top" coordsize="44450,148590" o:gfxdata="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" path="m24479,148018l,148018,,131254r10668,l13716,129730r1524,-3048l16764,125158r1619,-4667l18383,32004r25908,l44291,114395r-271,6096l43957,121903r-1190,6482l40433,133991r-3762,4883l32099,144970r-7620,3048xem44291,21336r-25908,l18383,,44291,r,21336xe" fillcolor="#343833" stroked="f">
                   <v:path arrowok="t"/>
-                  <v:fill type="solid"/>
                 </v:shape>
-                <v:shape style="position:absolute;left:5267;top:8908;width:453;height:137" type="#_x0000_t75" id="docshape56" stroked="false">
-                  <v:imagedata r:id="rId38" o:title=""/>
+                <v:shape id="Image 56" o:spid="_x0000_s1065" type="#_x0000_t75" style="position:absolute;left:27890;top:17192;width:2871;height:870;visibility:visible;mso-wrap-style:square" o:gfxdata="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">
+                  <v:imagedata r:id="rId96" o:title=""/>
                 </v:shape>
-                <v:shape style="position:absolute;left:5760;top:8860;width:132;height:183" id="docshape57" coordorigin="5760,8861" coordsize="132,183" path="m5803,8998l5760,8998,5760,9043,5803,9043,5803,8998xm5892,8861l5846,8861,5846,9043,5892,9043,5892,8861xe" filled="true" fillcolor="#343833" stroked="false">
+                <v:shape id="Graphic 57" o:spid="_x0000_s1066" style="position:absolute;left:31015;top:16887;width:838;height:1162;visibility:visible;mso-wrap-style:square;v-text-anchor:top" coordsize="83820,116205" o:gfxdata="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" path="m27432,86868l,86868r,28956l27432,115824r,-28956xem83807,l54864,r,115824l83807,115824,83807,xe" fillcolor="#343833" stroked="f">
                   <v:path arrowok="t"/>
-                  <v:fill type="solid"/>
                 </v:shape>
-                <v:shape style="position:absolute;left:5922;top:8908;width:133;height:137" type="#_x0000_t75" id="docshape58" stroked="false">
-                  <v:imagedata r:id="rId39" o:title=""/>
+                <v:shape id="Image 58" o:spid="_x0000_s1067" type="#_x0000_t75" style="position:absolute;left:32044;top:17192;width:840;height:870;visibility:visible;mso-wrap-style:square" o:gfxdata="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">
+                  <v:imagedata r:id="rId97" o:title=""/>
                 </v:shape>
-                <v:shape style="position:absolute;left:6092;top:8908;width:303;height:186" type="#_x0000_t75" id="docshape59" stroked="false">
-                  <v:imagedata r:id="rId40" o:title=""/>
+                <v:shape id="Image 59" o:spid="_x0000_s1068" type="#_x0000_t75" style="position:absolute;left:33128;top:17192;width:1924;height:1176;visibility:visible;mso-wrap-style:square" o:gfxdata="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">
+                  <v:imagedata r:id="rId98" o:title=""/>
                 </v:shape>
-                <v:rect style="position:absolute;left:6439;top:8997;width:44;height:46" id="docshape60" filled="true" fillcolor="#343833" stroked="false">
-                  <v:fill type="solid"/>
-                </v:rect>
-                <v:shape style="position:absolute;left:6518;top:8863;width:181;height:183" type="#_x0000_t75" id="docshape61" stroked="false">
-                  <v:imagedata r:id="rId41" o:title=""/>
+                <v:shape id="Graphic 60" o:spid="_x0000_s1069" style="position:absolute;left:35328;top:17756;width:279;height:292;visibility:visible;mso-wrap-style:square;v-text-anchor:top" coordsize="27940,29209" o:gfxdata="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" path="m27432,28955l,28955,,,27432,r,28955xe" fillcolor="#343833" stroked="f">
+                  <v:path arrowok="t"/>
                 </v:shape>
-                <v:shape style="position:absolute;left:6730;top:8860;width:215;height:234" type="#_x0000_t75" id="docshape62" stroked="false">
-                  <v:imagedata r:id="rId42" o:title=""/>
+                <v:shape id="Image 61" o:spid="_x0000_s1070" type="#_x0000_t75" style="position:absolute;left:35831;top:16903;width:1145;height:1159;visibility:visible;mso-wrap-style:square" o:gfxdata="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">
+                  <v:imagedata r:id="rId99" o:title=""/>
                 </v:shape>
-                <v:shape style="position:absolute;left:6975;top:8872;width:404;height:173" type="#_x0000_t75" id="docshape63" stroked="false">
-                  <v:imagedata r:id="rId43" o:title=""/>
+                <v:shape id="Image 62" o:spid="_x0000_s1071" type="#_x0000_t75" style="position:absolute;left:37175;top:16887;width:1359;height:1481;visibility:visible;mso-wrap-style:square" o:gfxdata="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">
+                  <v:imagedata r:id="rId100" o:title=""/>
                 </v:shape>
-                <v:shape style="position:absolute;left:1179;top:9391;width:469;height:164" id="docshape64" coordorigin="1180,9392" coordsize="469,164" path="m1269,9445l1264,9440,1259,9438,1254,9438,1249,9435,1237,9435,1225,9436,1214,9439,1205,9444,1197,9452,1190,9460,1185,9470,1181,9482,1180,9495,1181,9509,1185,9521,1190,9531,1197,9541,1205,9547,1214,9552,1225,9554,1237,9555,1249,9555,1254,9553,1259,9553,1269,9548,1269,9527,1266,9531,1262,9534,1254,9536,1245,9541,1225,9541,1216,9536,1211,9529,1204,9522,1201,9510,1201,9481,1204,9471,1211,9462,1216,9454,1225,9452,1249,9452,1264,9459,1269,9464,1269,9445xm1394,9536l1365,9536,1360,9534,1358,9531,1355,9527,1353,9519,1353,9512,1353,9392,1305,9392,1305,9406,1334,9406,1334,9524,1339,9534,1343,9541,1351,9551,1358,9553,1394,9553,1394,9536xm1526,9495l1526,9482,1525,9481,1524,9470,1520,9459,1516,9452,1514,9450,1507,9442,1507,9481,1507,9510,1504,9522,1495,9536,1488,9541,1468,9541,1461,9536,1452,9522,1449,9510,1449,9481,1452,9469,1456,9462,1461,9454,1468,9452,1488,9452,1495,9454,1500,9462,1504,9469,1505,9470,1507,9481,1507,9442,1504,9440,1492,9435,1461,9435,1449,9440,1442,9450,1436,9459,1431,9470,1428,9482,1428,9495,1428,9509,1429,9510,1431,9522,1436,9532,1442,9541,1449,9551,1461,9555,1492,9555,1507,9551,1514,9541,1520,9532,1524,9522,1526,9509,1526,9495xm1649,9467l1646,9454,1639,9447,1634,9440,1625,9435,1605,9435,1598,9438,1593,9440,1579,9454,1579,9438,1560,9438,1560,9553,1579,9553,1579,9476,1581,9467,1586,9462,1591,9454,1598,9452,1615,9452,1620,9454,1625,9459,1627,9464,1629,9471,1629,9553,1649,9553,1649,9481,1649,9467xe" filled="true" fillcolor="#496782" stroked="false">
+                <v:shape id="Image 63" o:spid="_x0000_s1072" type="#_x0000_t75" style="position:absolute;left:38732;top:16964;width:2565;height:1098;visibility:visible;mso-wrap-style:square" o:gfxdata="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">
+                  <v:imagedata r:id="rId101" o:title=""/>
+                </v:shape>
+                <v:shape id="Graphic 64" o:spid="_x0000_s1073" style="position:absolute;left:1931;top:20260;width:2978;height:1042;visibility:visible;mso-wrap-style:square;v-text-anchor:top" coordsize="297815,104139" o:gfxdata="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" path="m56489,33528l53441,30480,50393,28956r-3048,l44196,27432r-7620,l28892,28028,812,57035,,65620r812,8598l28892,103149r7684,571l44196,103720r3149,-1524l50393,102196r6096,-3048l56489,85432r-1524,3048l51917,90004r-4572,1524l41148,94576r-12192,l22860,91528,19812,86956,15240,82384,13716,74764r,-18288l15240,50380r4572,-6184l22860,39624r6096,-1524l44196,38100r9245,4572l56489,45808r,-12280xem135826,91528r-18288,l114490,90004r-1524,-1524l111442,85432r-1524,-4572l109918,76288,109918,,79349,r,9144l97726,9144r,74764l100774,90004r3048,4572l108394,100672r4572,1524l135826,102196r,-10668xem219837,65620l207645,32004r,24472l207645,74764r-1524,7620l200025,91528r-4572,3048l183172,94576r-4572,-3048l172504,82384r-1524,-7620l170980,56476r1524,-7620l175552,44196r3048,-4572l183172,38100r12281,l207645,56476r,-24472l206121,30480r-7620,-3048l178600,27432,157264,65620r571,8814l157911,74764r1639,7620l162407,89204r4001,5372l170980,100672r7620,3048l198501,103720,219506,74434r331,-8814xem297751,47332r-1524,-7708l291655,35052r-3048,-4572l282422,27432r-12192,l265658,28956r-3048,1524l253466,39624r,-10668l241274,28956r,73240l253466,102196r,-48768l254990,47332r3048,-3136l261086,39624r4572,-1524l276326,38100r3048,1524l282422,42672r1524,3136l285470,50380r,51816l297751,102196r,-45720l297751,47332xe" fillcolor="#496782" stroked="f">
                   <v:path arrowok="t"/>
-                  <v:fill type="solid"/>
                 </v:shape>
-                <v:shape style="position:absolute;left:1680;top:9435;width:101;height:121" type="#_x0000_t75" id="docshape65" stroked="false">
-                  <v:imagedata r:id="rId44" o:title=""/>
+                <v:shape id="Image 65" o:spid="_x0000_s1074" type="#_x0000_t75" style="position:absolute;left:5107;top:20535;width:641;height:762;visibility:visible;mso-wrap-style:square" o:gfxdata="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">
+                  <v:imagedata r:id="rId102" o:title=""/>
                 </v:shape>
-                <v:shape style="position:absolute;left:1971;top:9521;width:36;height:61" id="docshape66" coordorigin="1971,9522" coordsize="36,61" path="m1988,9582l1971,9582,1981,9543,1981,9522,2007,9522,2007,9543,1988,9582xe" filled="true" fillcolor="#343833" stroked="false">
+                <v:shape id="Graphic 66" o:spid="_x0000_s1075" style="position:absolute;left:6955;top:21084;width:228;height:387;visibility:visible;mso-wrap-style:square;v-text-anchor:top" coordsize="22860,38735" o:gfxdata="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" path="m10668,38194l,38194,6095,13715,6095,,22860,r,13715l10668,38194xe" fillcolor="#343833" stroked="f">
                   <v:path arrowok="t"/>
-                  <v:fill type="solid"/>
                 </v:shape>
-                <v:shape style="position:absolute;left:2194;top:9435;width:224;height:162" type="#_x0000_t75" id="docshape67" stroked="false">
-                  <v:imagedata r:id="rId45" o:title=""/>
+                <v:shape id="Image 67" o:spid="_x0000_s1076" type="#_x0000_t75" style="position:absolute;left:8375;top:20535;width:1420;height:1023;visibility:visible;mso-wrap-style:square" o:gfxdata="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">
+                  <v:imagedata r:id="rId103" o:title=""/>
                 </v:shape>
-                <v:shape style="position:absolute;left:2456;top:9391;width:465;height:164" id="docshape68" coordorigin="2457,9392" coordsize="465,164" path="m2543,9438l2524,9438,2524,9524,2519,9529,2514,9536,2507,9539,2490,9539,2483,9536,2481,9531,2476,9527,2476,9438,2457,9438,2457,9510,2457,9524,2459,9536,2464,9543,2471,9553,2478,9555,2505,9555,2512,9551,2517,9548,2522,9543,2524,9536,2524,9553,2543,9553,2543,9438xm2671,9464l2668,9459,2666,9454,2664,9452,2661,9447,2654,9442,2649,9440,2642,9438,2632,9435,2611,9435,2606,9438,2599,9438,2584,9442,2584,9462,2599,9457,2603,9454,2611,9452,2635,9452,2642,9454,2647,9457,2652,9462,2652,9481,2652,9495,2652,9512,2649,9522,2644,9529,2637,9536,2630,9541,2611,9541,2606,9539,2599,9531,2596,9524,2596,9510,2599,9505,2603,9500,2618,9495,2652,9495,2652,9481,2611,9481,2599,9483,2589,9491,2582,9498,2577,9507,2577,9531,2579,9539,2594,9553,2603,9555,2632,9555,2637,9551,2644,9548,2649,9543,2650,9541,2652,9536,2652,9553,2671,9553,2671,9536,2671,9495,2671,9464xm2796,9536l2767,9536,2762,9534,2760,9531,2757,9527,2755,9519,2755,9512,2755,9392,2707,9392,2707,9406,2736,9406,2736,9524,2741,9534,2745,9541,2753,9551,2760,9553,2796,9553,2796,9536xm2921,9512l2918,9505,2914,9498,2909,9493,2894,9488,2885,9486,2873,9483,2866,9481,2863,9479,2858,9476,2858,9462,2861,9457,2863,9454,2868,9452,2894,9452,2899,9454,2906,9454,2911,9457,2916,9462,2916,9452,2916,9442,2911,9440,2904,9438,2899,9438,2894,9435,2868,9435,2858,9438,2849,9445,2841,9450,2839,9459,2839,9479,2841,9486,2846,9491,2851,9495,2858,9500,2870,9500,2878,9503,2894,9505,2904,9512,2904,9527,2902,9531,2897,9536,2892,9539,2885,9541,2870,9541,2866,9539,2858,9539,2851,9536,2846,9534,2839,9529,2839,9548,2846,9551,2851,9553,2858,9553,2866,9555,2890,9555,2902,9553,2909,9546,2918,9541,2921,9531,2921,9512xe" filled="true" fillcolor="#496782" stroked="false">
+                <v:shape id="Graphic 68" o:spid="_x0000_s1077" style="position:absolute;left:10039;top:20260;width:2953;height:1042;visibility:visible;mso-wrap-style:square;v-text-anchor:top" coordsize="295275,104139" o:gfxdata="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" path="m55054,28956r-12281,l42773,83908r-3048,3048l36677,91528r-4572,1524l21437,93052,16865,91528,15341,88480,12293,85432r,-56476l,28956,,74764r,9144l1524,91528r3048,4572l9245,102196r4572,1524l30581,103720r4572,-3048l38201,99148r3048,-3048l42773,91528r,10668l55054,102196r,-73240xem135928,45808r-1524,-3136l132880,39624r-1524,-1524l129832,35052r-4572,-3048l122212,30480r-4572,-1524l111544,27432r-13818,l94678,28956r-4572,l80962,32004r,12192l90106,41148r3048,-1524l97726,38100r15342,l117640,39624r3048,1524l123736,44196r,12280l123736,65620r,10668l122212,82384r-3048,4572l114592,91528r-4572,3048l97726,94576,94678,93052,90106,88480,88582,83908r,-9144l90106,71716r3048,-3048l102400,65620r21336,l123736,56476r-26010,l90106,58000r-6096,4572l79438,67144r-3048,6096l76390,88480r1524,4572l87058,102196r6096,1524l111544,103720r3048,-3048l119164,99148r3048,-3048l122720,94576r1016,-3048l123736,102196r12192,l135928,91528r,-25908l135928,45808xem215277,91528r-18288,l193941,90004r-1524,-1524l190893,85432r-1524,-4572l189369,76288,189369,,158788,r,9144l177177,9144r,74764l180225,90004r3048,4572l187845,100672r4572,1524l215277,102196r,-10668xem294805,76288l264223,58000r-4572,-1524l258127,54952r-3048,-1524l255079,44196r1524,-3048l258127,39624r3048,-1524l277939,38100r3048,1524l285559,39624r3048,1524l291655,44196r,-6096l291655,32004r-3048,-1524l284035,28956r-3048,l277939,27432r-16764,l255079,28956r-6096,4572l244322,36576r-1524,6096l242798,54952r1524,4572l247459,62572r3048,3048l255079,68668r7620,l267271,70192r10668,1524l284035,76288r,9144l282511,88480r-3048,3048l276415,93052r-4572,1524l262699,94576r-3048,-1524l255079,93052r-4572,-1524l247459,90004r-4661,-3048l242798,99148r4661,1524l250507,102196r4572,l259651,103720r15240,l282511,102196r4572,-4572l293179,94576r1626,-6096l294805,76288xe" fillcolor="#496782" stroked="f">
                   <v:path arrowok="t"/>
-                  <v:fill type="solid"/>
                 </v:shape>
-                <v:shape style="position:absolute;left:3120;top:9521;width:37;height:61" id="docshape69" coordorigin="3120,9522" coordsize="37,61" path="m3135,9582l3120,9582,3130,9543,3130,9522,3157,9522,3157,9543,3135,9582xe" filled="true" fillcolor="#343833" stroked="false">
+                <v:shape id="Graphic 69" o:spid="_x0000_s1078" style="position:absolute;left:14254;top:21084;width:235;height:387;visibility:visible;mso-wrap-style:square;v-text-anchor:top" coordsize="23495,38735" o:gfxdata="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" path="m9144,38194l,38194,6095,13715,6095,,22955,r,13715l9144,38194xe" fillcolor="#343833" stroked="f">
                   <v:path arrowok="t"/>
-                  <v:fill type="solid"/>
                 </v:shape>
-                <v:shape style="position:absolute;left:3351;top:9391;width:847;height:164" id="docshape70" coordorigin="3351,9392" coordsize="847,164" path="m3440,9394l3407,9394,3397,9397,3385,9409,3383,9418,3383,9438,3351,9438,3351,9452,3383,9452,3383,9553,3402,9553,3402,9452,3440,9452,3440,9438,3402,9438,3402,9416,3404,9414,3409,9411,3411,9409,3440,9409,3440,9394xm3534,9394l3515,9394,3515,9416,3534,9416,3534,9394xm3570,9539l3534,9539,3534,9438,3484,9438,3484,9452,3515,9452,3515,9539,3476,9539,3476,9553,3570,9553,3570,9539xm3693,9467l3690,9454,3683,9447,3678,9440,3669,9435,3650,9435,3642,9438,3638,9440,3623,9454,3623,9438,3604,9438,3604,9553,3623,9553,3623,9476,3626,9467,3630,9462,3635,9454,3642,9452,3659,9452,3664,9454,3669,9459,3671,9464,3674,9471,3674,9553,3693,9553,3693,9481,3693,9467xm3820,9469l3818,9464,3818,9459,3815,9454,3813,9452,3803,9442,3782,9435,3760,9435,3753,9438,3748,9438,3734,9442,3734,9462,3741,9459,3746,9457,3760,9452,3782,9452,3789,9454,3794,9457,3799,9462,3801,9469,3801,9481,3801,9495,3801,9512,3799,9522,3791,9529,3787,9536,3777,9541,3760,9541,3755,9539,3750,9534,3746,9531,3743,9524,3743,9510,3753,9500,3758,9498,3767,9495,3801,9495,3801,9481,3760,9481,3746,9483,3738,9491,3729,9498,3724,9507,3724,9531,3729,9539,3743,9553,3753,9555,3779,9555,3787,9551,3791,9548,3796,9543,3798,9541,3801,9536,3801,9553,3820,9553,3820,9536,3820,9495,3820,9469xm3945,9536l3917,9536,3912,9534,3904,9527,3904,9512,3904,9392,3854,9392,3854,9406,3885,9406,3885,9524,3888,9534,3895,9541,3900,9551,3909,9553,3945,9553,3945,9536xm4039,9394l4020,9394,4020,9416,4039,9416,4039,9394xm4078,9539l4039,9539,4039,9438,3991,9438,3991,9452,4020,9452,4020,9539,3984,9539,3984,9553,4078,9553,4078,9539xm4198,9438l4114,9438,4114,9452,4179,9452,4111,9536,4111,9553,4198,9553,4198,9539,4133,9539,4198,9454,4198,9438xe" filled="true" fillcolor="#496782" stroked="false">
+                <v:shape id="Graphic 70" o:spid="_x0000_s1079" style="position:absolute;left:15720;top:20260;width:5378;height:1042;visibility:visible;mso-wrap-style:square;v-text-anchor:top" coordsize="537845,104139" o:gfxdata="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" path="m56476,1524r-21336,l29044,3048r-7620,7620l19900,16764r,12192l,28956r,9144l19900,38100r,64096l32092,102196r,-64096l56476,38100r,-9144l32092,28956r,-13716l33616,13716r3048,-1524l38188,10668r18288,l56476,1524xem116103,1524r-12281,l103822,15240r12281,l116103,1524xem138963,93052r-22860,l116103,28956r-32093,l84010,38100r19812,l103822,93052r-24384,l79438,102196r59525,l138963,93052xem216877,47332r-1524,-7708l210781,35052r-3048,-4572l201549,27432r-12192,l184785,28956r-3048,1524l172593,39624r,-10668l160401,28956r,73240l172593,102196r,-48768l174117,47332r3048,-3136l180213,39624r4572,-1524l195453,38100r3048,1524l201549,42672r1524,3136l204597,50380r,51816l216877,102196r,-45720l216877,47332xem297738,48856r-1524,-3048l296214,42672r-1524,-3048l293166,38100r-6096,-6096l273354,27432r-13716,l254977,28956r-3048,l242785,32004r,12192l247357,42672r3048,-1524l259638,38100r13716,l277926,39624r3048,1524l284022,44196r1524,4660l285546,56476r,9144l285546,76288r-1524,6096l279450,86956r-3048,4572l270306,94576r-10668,l256590,93052r-3137,-3048l250405,88480r-1524,-4572l248881,74764r6096,-6096l258114,67144r6096,-1524l285546,65620r,-9144l259638,56476r-9233,1524l245833,62572r-6096,4572l236689,73240r,15240l239737,93052r9144,9144l254977,103720r16853,l276402,100672r3048,-1524l282498,96100r1016,-1524l285546,91528r,10668l297738,102196r,-10668l297738,65620r,-16764xem377190,91528r-18288,l355854,90004r-4674,-4572l351180,76288,351180,,319176,r,9144l338988,9144r,74764l340512,90004r4572,4572l348132,100672r6198,1524l377190,102196r,-10668xem436714,1524r-12192,l424522,15240r12192,l436714,1524xem461200,93052r-24486,l436714,28956r-30480,l406234,38100r18288,l424522,93052r-22860,l401662,102196r59538,l461200,93052xem537489,28956r-53442,l484047,38100r41250,l482523,91528r,10668l537489,102196r,-9144l496341,93052,537489,39624r,-10668xe" fillcolor="#496782" stroked="f">
                   <v:path arrowok="t"/>
-                  <v:fill type="solid"/>
                 </v:shape>
-                <v:shape style="position:absolute;left:4231;top:9435;width:101;height:121" type="#_x0000_t75" id="docshape71" stroked="false">
-                  <v:imagedata r:id="rId46" o:title=""/>
+                <v:shape id="Image 71" o:spid="_x0000_s1080" type="#_x0000_t75" style="position:absolute;left:21309;top:20535;width:641;height:762;visibility:visible;mso-wrap-style:square" o:gfxdata="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">
+                  <v:imagedata r:id="rId104" o:title=""/>
                 </v:shape>
-                <v:shape style="position:absolute;left:4522;top:9521;width:36;height:61" id="docshape72" coordorigin="4522,9522" coordsize="36,61" path="m4537,9582l4522,9582,4532,9543,4532,9522,4558,9522,4558,9543,4537,9582xe" filled="true" fillcolor="#343833" stroked="false">
+                <v:shape id="Graphic 72" o:spid="_x0000_s1081" style="position:absolute;left:23157;top:21084;width:228;height:387;visibility:visible;mso-wrap-style:square;v-text-anchor:top" coordsize="22860,38735" o:gfxdata="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" path="m9143,38194l,38194,6096,13715,6096,,22859,r,13715l9143,38194xe" fillcolor="#343833" stroked="f">
                   <v:path arrowok="t"/>
-                  <v:fill type="solid"/>
                 </v:shape>
-                <v:shape style="position:absolute;left:4746;top:9435;width:94;height:164" id="docshape73" coordorigin="4746,9435" coordsize="94,164" path="m4804,9553l4777,9553,4765,9548,4758,9539,4753,9529,4749,9519,4747,9507,4746,9495,4747,9482,4749,9470,4753,9460,4765,9440,4777,9435,4797,9435,4804,9438,4813,9442,4818,9447,4820,9452,4785,9452,4777,9454,4773,9462,4768,9469,4765,9481,4765,9510,4768,9519,4768,9519,4777,9534,4785,9539,4819,9539,4818,9541,4813,9546,4809,9548,4804,9553xm4840,9454l4821,9454,4821,9438,4840,9438,4840,9454xm4819,9539l4804,9539,4811,9534,4816,9527,4818,9519,4821,9510,4821,9481,4818,9469,4816,9462,4811,9454,4804,9452,4820,9452,4821,9454,4840,9454,4840,9534,4821,9534,4819,9539xm4828,9584l4801,9584,4811,9579,4816,9575,4818,9570,4821,9560,4821,9534,4840,9534,4840,9548,4839,9558,4838,9569,4834,9578,4828,9584xm4809,9599l4782,9599,4775,9596,4770,9596,4765,9594,4758,9591,4758,9575,4773,9579,4777,9582,4782,9582,4787,9584,4828,9584,4821,9594,4809,9599xe" filled="true" fillcolor="#496782" stroked="false">
+                <v:shape id="Graphic 73" o:spid="_x0000_s1082" style="position:absolute;left:24577;top:20535;width:597;height:1041;visibility:visible;mso-wrap-style:square;v-text-anchor:top" coordsize="59690,104139" o:gfxdata="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" path="m36576,74771r-16764,l12192,71723,,38195,547,29607,2095,22145,4500,15826,12192,3048,19812,,32004,r4572,1524l42672,4572r3143,3048l46831,10668r-22447,l19812,12192r-3048,4572l13716,21431r-1524,7620l12192,47339r1428,5715l13716,53435r6096,9144l24384,65627r21939,l45815,67151r-3143,3048l39624,71723r-3048,3048xem59531,12192r-12192,l47339,1524r12192,l59531,12192xem46323,65627r-9747,l41148,62579r3143,-4572l45815,53435r1524,-6096l47339,29051,45815,21431,44291,16764,41148,12192,36576,10668r10255,l47339,12192r12192,l59531,62579r-12192,l46323,65627xem51911,94678r-16859,l41148,91630r3143,-3048l45815,85534r1524,-6191l47339,62579r12192,l59465,71723r-268,6158l58007,84724r-2334,5700l51911,94678xem39624,103822r-16764,l18288,102298r-3048,l12192,100774,7620,99250r,-10668l16764,91630r3048,1524l22860,93154r3048,1524l51911,94678r-4572,6096l39624,103822xe" fillcolor="#496782" stroked="f">
                   <v:path arrowok="t"/>
-                  <v:fill type="solid"/>
                 </v:shape>
-                <v:shape style="position:absolute;left:4873;top:9406;width:219;height:149" type="#_x0000_t75" id="docshape74" stroked="false">
-                  <v:imagedata r:id="rId47" o:title=""/>
+                <v:shape id="Image 74" o:spid="_x0000_s1083" type="#_x0000_t75" style="position:absolute;left:25387;top:20352;width:1388;height:945;visibility:visible;mso-wrap-style:square" o:gfxdata="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">
+                  <v:imagedata r:id="rId105" o:title=""/>
                 </v:shape>
-                <v:shape style="position:absolute;left:5128;top:9391;width:597;height:164" id="docshape75" coordorigin="5128,9392" coordsize="597,164" path="m5225,9406l5217,9402,5213,9402,5203,9397,5191,9397,5176,9398,5164,9402,5153,9409,5145,9418,5138,9430,5132,9444,5129,9459,5128,9476,5129,9495,5132,9511,5137,9524,5143,9536,5152,9544,5163,9550,5176,9554,5191,9555,5203,9555,5208,9553,5213,9553,5217,9551,5225,9548,5225,9527,5220,9531,5213,9534,5208,9536,5201,9539,5176,9539,5167,9534,5160,9524,5155,9515,5152,9504,5151,9491,5150,9476,5151,9461,5152,9449,5155,9439,5160,9430,5167,9418,5176,9414,5196,9414,5201,9416,5208,9416,5213,9418,5220,9423,5225,9426,5225,9406xm5347,9536l5319,9536,5314,9534,5306,9527,5306,9512,5306,9392,5256,9392,5256,9406,5287,9406,5287,9524,5290,9534,5297,9541,5302,9551,5311,9553,5347,9553,5347,9536xm5475,9464l5472,9459,5470,9454,5467,9452,5465,9447,5458,9442,5453,9440,5446,9438,5436,9435,5415,9435,5410,9438,5403,9438,5388,9442,5388,9462,5403,9457,5407,9454,5415,9452,5439,9452,5446,9454,5451,9457,5453,9462,5455,9469,5455,9481,5455,9495,5455,9512,5453,9522,5448,9529,5441,9536,5434,9541,5415,9541,5410,9539,5403,9531,5400,9524,5400,9510,5403,9505,5407,9500,5412,9498,5422,9495,5455,9495,5455,9481,5415,9481,5403,9483,5393,9491,5386,9498,5381,9507,5381,9531,5383,9539,5398,9553,5407,9555,5436,9555,5441,9551,5448,9548,5453,9543,5454,9541,5455,9536,5455,9553,5475,9553,5475,9536,5475,9495,5475,9464xm5600,9512l5597,9505,5593,9498,5588,9493,5581,9491,5571,9488,5564,9486,5552,9483,5542,9481,5535,9474,5535,9462,5537,9457,5542,9454,5544,9452,5571,9452,5578,9454,5583,9454,5588,9457,5593,9462,5593,9452,5593,9442,5583,9438,5576,9438,5571,9435,5544,9435,5535,9438,5528,9445,5520,9450,5516,9459,5516,9479,5518,9486,5528,9495,5537,9500,5547,9500,5554,9503,5571,9505,5581,9512,5581,9527,5578,9531,5573,9536,5568,9539,5561,9541,5549,9541,5542,9539,5535,9539,5530,9536,5523,9534,5516,9529,5516,9548,5530,9553,5535,9553,5542,9555,5568,9555,5578,9553,5588,9546,5595,9541,5600,9531,5600,9512xm5725,9512l5722,9505,5718,9498,5713,9493,5698,9488,5689,9486,5677,9483,5670,9481,5667,9479,5662,9476,5662,9462,5665,9457,5667,9454,5672,9452,5698,9452,5703,9454,5708,9454,5715,9457,5720,9462,5720,9452,5720,9442,5715,9440,5708,9438,5703,9438,5698,9435,5672,9435,5660,9438,5653,9445,5645,9450,5643,9459,5643,9479,5645,9486,5650,9491,5655,9495,5662,9500,5674,9500,5682,9503,5698,9505,5706,9512,5706,9531,5701,9536,5696,9539,5689,9541,5674,9541,5670,9539,5662,9539,5648,9534,5643,9529,5643,9548,5650,9551,5655,9553,5662,9553,5670,9555,5694,9555,5706,9553,5713,9546,5722,9541,5725,9531,5725,9512xe" filled="true" fillcolor="#496782" stroked="false">
+                <v:shape id="Graphic 75" o:spid="_x0000_s1084" style="position:absolute;left:27005;top:20260;width:3791;height:1042;visibility:visible;mso-wrap-style:square;v-text-anchor:top" coordsize="379095,104139" o:gfxdata="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" path="m61061,9144l56489,6096r-3048,l47345,3048r-7721,l30175,3898,2476,32778,,53428,571,65176r21527,35306l39624,103720r7721,l50393,102196r3048,l56489,100672r4572,-1524l61061,85432r-3048,3048l53441,90004r-3048,1524l45821,93052r-15341,l13716,53428r317,-9499l30480,13716r12293,l45821,15240r4572,l53441,16764r4572,3048l61061,21336r,-12192xem138976,91528r-18288,l117640,90004r-4661,-4572l112979,76288,112979,,80975,r,9144l100787,9144r,74764l102311,90004r4572,4572l109931,100672r6185,1524l138976,102196r,-10668xem219837,45808r-1524,-3136l216789,39624r-1524,-1524l213741,35052r-4572,-3048l206121,30480r-4572,-1524l195453,27432r-13805,l178600,28956r-4572,l164884,32004r,12192l174028,41148r3048,-1524l181648,38100r15329,l201549,39624r3048,1524l206121,44196r1524,4660l207645,56476r,9144l207645,76288r-1524,6096l203073,86956r-4572,4572l193929,94576r-12281,l178600,93052r-4572,-4572l172504,83908r,-9144l174028,71716r3048,-3048l180124,67144r6096,-1524l207645,65620r,-9144l181648,56476r-7620,1524l167932,62572r-4572,4572l160312,73240r,15240l161836,93052r9144,9144l177076,103720r18377,l198501,100672r4572,-1524l206121,96100r508,-1524l207645,91528r,10668l219837,102196r,-10668l219837,65620r,-19812xem299275,76288l280898,61048r-4572,-1524l268706,58000r-6096,-1524l258038,51904r,-7708l259562,41148r3048,-1524l264134,38100r16764,l285559,39624r3048,l291655,41148r3048,3048l294703,38100r,-6096l288607,28956r-4572,l280898,27432r-16764,l258038,28956r-4572,4572l248894,36576r-3048,6096l245846,54952r1524,4572l253466,65620r6096,3048l265658,68668r4572,1524l280898,71716r6185,4572l287083,85432r-1524,3048l282422,91528r-3048,1524l274802,94576r-7620,l262610,93052r-4572,l254990,91528r-4572,-1524l245846,86956r,12192l254990,102196r3048,l262610,103720r16764,l285559,102196r6096,-4572l296227,94576r3048,-6096l299275,76288xem378625,76288l348145,58000r-4572,-1524l342049,54952r-3048,-1524l339001,44196r1524,-3048l342049,39624r3048,-1524l361861,38100r3048,1524l367957,39624r4572,1524l375577,44196r,-6096l375577,32004r-3048,-1524l367957,28956r-3048,l361861,27432r-16764,l337477,28956r-4572,4572l328231,36576r-1524,6096l326707,54952r1524,4572l331381,62572r3048,3048l339001,68668r7620,l351193,70192r10668,1524l366433,76288r,12192l363385,91528r-3048,1524l355765,94576r-9144,l343573,93052r-4572,l329755,90004r-3048,-3048l326707,99148r4674,1524l334429,102196r4572,l343573,103720r15240,l366433,102196r4572,-4572l377101,94576r1524,-6096l378625,76288xe" fillcolor="#496782" stroked="f">
                   <v:path arrowok="t"/>
-                  <v:fill type="solid"/>
                 </v:shape>
-                <v:shape style="position:absolute;left:5924;top:9521;width:37;height:61" id="docshape76" coordorigin="5924,9522" coordsize="37,61" path="m5939,9582l5924,9582,5934,9543,5934,9522,5961,9522,5961,9543,5939,9582xe" filled="true" fillcolor="#343833" stroked="false">
+                <v:shape id="Graphic 76" o:spid="_x0000_s1085" style="position:absolute;left:32059;top:21084;width:235;height:387;visibility:visible;mso-wrap-style:square;v-text-anchor:top" coordsize="23495,38735" o:gfxdata="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" path="m9144,38194l,38194,6096,13715,6096,,22955,r,13715l9144,38194xe" fillcolor="#343833" stroked="f">
                   <v:path arrowok="t"/>
-                  <v:fill type="solid"/>
                 </v:shape>
-                <v:shape style="position:absolute;left:6155;top:9394;width:597;height:161" id="docshape77" coordorigin="6155,9394" coordsize="597,161" path="m6244,9467l6239,9454,6230,9440,6220,9435,6201,9435,6194,9438,6189,9440,6182,9445,6177,9450,6174,9454,6174,9394,6155,9394,6155,9553,6174,9553,6174,9476,6177,9467,6182,9462,6187,9454,6194,9452,6211,9452,6215,9454,6220,9459,6223,9464,6225,9471,6225,9553,6244,9553,6244,9481,6244,9467xm6372,9479l6369,9469,6369,9459,6367,9454,6365,9452,6355,9442,6333,9435,6312,9435,6304,9438,6297,9438,6292,9440,6285,9442,6285,9462,6290,9459,6304,9454,6309,9452,6333,9452,6341,9454,6345,9457,6350,9462,6353,9469,6353,9481,6353,9495,6353,9512,6348,9522,6338,9536,6328,9541,6312,9541,6304,9539,6302,9534,6297,9531,6295,9524,6295,9510,6297,9505,6302,9500,6316,9495,6353,9495,6353,9481,6309,9481,6297,9483,6288,9491,6280,9498,6276,9507,6276,9531,6285,9546,6292,9553,6302,9555,6331,9555,6336,9551,6343,9548,6348,9543,6349,9541,6353,9536,6353,9553,6372,9553,6372,9536,6372,9495,6372,9479xm6494,9512l6492,9505,6487,9498,6482,9493,6475,9491,6465,9488,6458,9486,6446,9483,6439,9481,6434,9479,6429,9474,6429,9462,6432,9457,6441,9452,6468,9452,6473,9454,6477,9454,6482,9457,6490,9462,6490,9442,6482,9440,6477,9438,6473,9438,6465,9435,6441,9435,6429,9438,6422,9445,6415,9450,6410,9459,6410,9479,6413,9486,6417,9491,6432,9500,6441,9500,6449,9503,6451,9503,6468,9505,6475,9512,6475,9527,6473,9531,6468,9536,6458,9541,6444,9541,6437,9539,6432,9539,6417,9534,6410,9529,6410,9548,6425,9553,6432,9553,6437,9555,6463,9555,6475,9553,6482,9546,6490,9541,6494,9531,6494,9512xm6624,9467l6619,9454,6610,9440,6600,9435,6581,9435,6574,9438,6569,9440,6562,9445,6557,9450,6554,9454,6554,9394,6535,9394,6535,9553,6554,9553,6554,9476,6557,9467,6562,9462,6567,9454,6574,9452,6591,9452,6595,9454,6598,9459,6603,9464,6605,9471,6605,9553,6624,9553,6624,9481,6624,9467xm6752,9406l6747,9402,6742,9402,6737,9399,6730,9397,6718,9397,6704,9398,6692,9402,6682,9409,6672,9418,6666,9430,6660,9444,6657,9459,6655,9476,6657,9495,6660,9511,6666,9524,6672,9536,6682,9544,6692,9550,6704,9554,6718,9555,6730,9555,6737,9553,6742,9553,6752,9548,6752,9527,6747,9531,6737,9536,6730,9539,6706,9539,6694,9534,6684,9515,6680,9504,6678,9491,6677,9476,6678,9461,6680,9449,6684,9439,6689,9430,6694,9418,6706,9414,6725,9414,6730,9416,6735,9416,6742,9418,6747,9423,6752,9426,6752,9406xe" filled="true" fillcolor="#496782" stroked="false">
+                <v:shape id="Graphic 77" o:spid="_x0000_s1086" style="position:absolute;left:33525;top:20276;width:3791;height:1022;visibility:visible;mso-wrap-style:square;v-text-anchor:top" coordsize="379095,102235" o:gfxdata="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" path="m56476,45808l53428,38100,47332,28956,41236,25908r-12192,l12192,38100,12192,,,,,100672r12192,l12192,51904r1524,-6096l16852,42672r3048,-4572l24472,36576r10668,l38188,38100r3048,3048l42760,44284r1524,4572l44284,100672r12192,l56476,54952r,-9144xem137452,53428r-1524,-6096l135928,41148r-1524,-3048l132880,36576r-6096,-6096l113068,25908r-13818,l94678,27432r-4572,l87058,28956r-4572,1524l82486,42672r3048,-1524l94678,38100r3048,-1524l113068,36576r4572,1524l120688,39624r3048,3048l125260,47332r,7620l125260,64096r,10668l122212,80860r-6096,9144l109918,93052r-10668,l94678,91528,93154,88480,90106,86956,88582,82384r,-9144l90106,70192r3048,-3048l102298,64096r22962,l125260,54952r-27534,l90106,56476r-6096,4572l79438,65620r-3048,6096l76390,86956r6096,9144l87058,100672r6096,1524l111442,102196r3150,-3048l119164,97624r3048,-3048l123228,93052r2032,-3048l125260,100672r12192,l137452,90004r,-25908l137452,53428xem215366,74764l196977,59524r-4572,-1524l184785,56476r-4572,-1524l177165,53428r-3048,-3048l174117,42672r1524,-3048l181737,36576r16764,l201549,38100r3048,l207645,39624r4673,3048l212318,30480r-4673,-1524l204597,27432r-3048,l196977,25908r-15240,l174117,27432r-4572,4572l164973,35052r-3048,6096l161925,53428r1524,4572l166497,61048r9144,6096l181737,67144r4572,1524l187833,68668r10668,1524l203073,74764r,9144l201549,86956r-3048,3048l192405,93052r-9144,l178689,91528r-3048,l166497,88480r-4572,-3048l161925,97624r9144,3048l175641,100672r3048,1524l195453,102196r7620,-1524l207645,96100r4673,-3048l215366,86956r,-12192xem297751,45808r-3048,-7708l288607,28956r-6096,-3048l270319,25908,253453,38100,253453,,241261,r,100672l253453,100672r,-48768l254977,45808r3150,-3136l261175,38100r4572,-1524l276415,36576r3048,1524l280987,41148r3048,3136l285559,48856r,51816l297751,100672r,-45720l297751,45808xem378714,7620l375666,4572r-3048,l369570,3048,364998,1524r-7620,l324091,22669r-6439,29235l318465,63652r22631,35306l357378,102196r7620,l369570,100672r3048,l378714,97624r,-13716l375666,86956r-6096,3048l364998,91528r-15342,l331368,51904r559,-9499l333463,34493r2413,-6465l338988,22860r3048,-7620l349656,12192r12294,l364998,13716r3048,l372618,15240r3048,3048l378714,19812r,-12192xe" fillcolor="#496782" stroked="f">
                   <v:path arrowok="t"/>
-                  <v:fill type="solid"/>
                 </v:shape>
-                <v:shape style="position:absolute;left:6782;top:9394;width:219;height:161" type="#_x0000_t75" id="docshape78" stroked="false">
-                  <v:imagedata r:id="rId48" o:title=""/>
+                <v:shape id="Image 78" o:spid="_x0000_s1087" type="#_x0000_t75" style="position:absolute;left:37510;top:20275;width:1390;height:1022;visibility:visible;mso-wrap-style:square" o:gfxdata="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">
+                  <v:imagedata r:id="rId106" o:title=""/>
                 </v:shape>
-                <v:shape style="position:absolute;left:7035;top:9435;width:101;height:121" type="#_x0000_t75" id="docshape79" stroked="false">
-                  <v:imagedata r:id="rId49" o:title=""/>
+                <v:shape id="Image 79" o:spid="_x0000_s1088" type="#_x0000_t75" style="position:absolute;left:39114;top:20535;width:641;height:762;visibility:visible;mso-wrap-style:square" o:gfxdata="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">
+                  <v:imagedata r:id="rId107" o:title=""/>
                 </v:shape>
-                <v:shape style="position:absolute;left:7326;top:9521;width:36;height:61" id="docshape80" coordorigin="7326,9522" coordsize="36,61" path="m7341,9582l7326,9582,7336,9543,7336,9522,7362,9522,7362,9543,7341,9582xe" filled="true" fillcolor="#343833" stroked="false">
+                <v:shape id="Graphic 80" o:spid="_x0000_s1089" style="position:absolute;left:40962;top:21084;width:228;height:387;visibility:visible;mso-wrap-style:square;v-text-anchor:top" coordsize="22860,38735" o:gfxdata="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" path="m9144,38194l,38194,6096,13715,6096,,22859,r,13715l9144,38194xe" fillcolor="#343833" stroked="f">
                   <v:path arrowok="t"/>
-                  <v:fill type="solid"/>
                 </v:shape>
-                <v:shape style="position:absolute;left:7557;top:9435;width:89;height:118" id="docshape81" coordorigin="7557,9435" coordsize="89,118" path="m7646,9553l7627,9553,7627,9471,7625,9464,7620,9459,7617,9454,7612,9452,7596,9452,7588,9454,7584,9462,7579,9467,7576,9476,7576,9553,7557,9553,7557,9438,7576,9438,7576,9454,7579,9450,7584,9445,7591,9440,7596,9438,7603,9435,7622,9435,7632,9440,7641,9454,7646,9467,7646,9481,7646,9553xe" filled="true" fillcolor="#496782" stroked="false">
+                <v:shape id="Graphic 81" o:spid="_x0000_s1090" style="position:absolute;left:42428;top:20535;width:565;height:749;visibility:visible;mso-wrap-style:square;v-text-anchor:top" coordsize="56515,74930" o:gfxdata="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" path="m56483,74771r-12192,l44291,22955,42767,18383,39623,15240,38099,12192,35051,10668r-10668,l19811,12192r-3048,4572l13715,19907r-1524,6096l12191,74771,,74771,,1524r12191,l12191,12192,13715,9144,16763,6096,21335,3048,24383,1524,28955,,41243,r6096,3048l53435,12192r3048,7715l56483,29051r,45720xe" fillcolor="#496782" stroked="f">
                   <v:path arrowok="t"/>
-                  <v:fill type="solid"/>
                 </v:shape>
-                <v:shape style="position:absolute;left:7677;top:9406;width:219;height:149" type="#_x0000_t75" id="docshape82" stroked="false">
-                  <v:imagedata r:id="rId50" o:title=""/>
+                <v:shape id="Image 82" o:spid="_x0000_s1091" type="#_x0000_t75" style="position:absolute;left:43191;top:20352;width:1389;height:945;visibility:visible;mso-wrap-style:square" o:gfxdata="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">
+                  <v:imagedata r:id="rId108" o:title=""/>
                 </v:shape>
-                <v:shape style="position:absolute;left:7934;top:9394;width:94;height:159" id="docshape83" coordorigin="7935,9394" coordsize="94,159" path="m7992,9538l7973,9538,7973,9452,7944,9452,7944,9438,7992,9438,7992,9538xm8029,9553l7935,9553,7935,9538,8029,9538,8029,9553xm7992,9416l7973,9416,7973,9394,7992,9394,7992,9416xe" filled="true" fillcolor="#496782" stroked="false">
+                <v:shape id="Graphic 83" o:spid="_x0000_s1092" style="position:absolute;left:44825;top:20275;width:597;height:1010;visibility:visible;mso-wrap-style:square;v-text-anchor:top" coordsize="59690,100965" o:gfxdata="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" path="m36576,91535r-12192,l24384,36576r-18288,l6096,27432r30480,l36576,91535xem59531,100679l,100679,,91535r59531,l59531,100679xem36576,13716r-12192,l24384,,36576,r,13716xe" fillcolor="#496782" stroked="f">
                   <v:path arrowok="t"/>
-                  <v:fill type="solid"/>
                 </v:shape>
-                <v:shape style="position:absolute;left:8064;top:9394;width:224;height:202" type="#_x0000_t75" id="docshape84" stroked="false">
-                  <v:imagedata r:id="rId51" o:title=""/>
+                <v:shape id="Image 84" o:spid="_x0000_s1093" type="#_x0000_t75" style="position:absolute;left:45649;top:20275;width:1420;height:1283;visibility:visible;mso-wrap-style:square" o:gfxdata="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">
+                  <v:imagedata r:id="rId109" o:title=""/>
                 </v:shape>
-                <v:shape style="position:absolute;left:8473;top:9521;width:36;height:61" id="docshape85" coordorigin="8474,9522" coordsize="36,61" path="m8490,9582l8474,9582,8483,9543,8483,9522,8509,9522,8509,9543,8490,9582xe" filled="true" fillcolor="#343833" stroked="false">
+                <v:shape id="Graphic 85" o:spid="_x0000_s1094" style="position:absolute;left:48246;top:21084;width:228;height:387;visibility:visible;mso-wrap-style:square;v-text-anchor:top" coordsize="22860,38735" o:gfxdata="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" path="m10667,38194l,38194,6095,13715,6095,,22859,r,13715l10667,38194xe" fillcolor="#343833" stroked="f">
                   <v:path arrowok="t"/>
-                  <v:fill type="solid"/>
                 </v:shape>
-                <v:shape style="position:absolute;left:8706;top:9435;width:87;height:118" id="docshape86" coordorigin="8707,9435" coordsize="87,118" path="m8793,9553l8774,9553,8774,9464,8769,9459,8767,9454,8760,9452,8743,9452,8738,9454,8733,9462,8728,9467,8726,9476,8726,9553,8707,9553,8707,9438,8726,9438,8726,9454,8728,9450,8738,9440,8745,9438,8750,9435,8772,9435,8779,9440,8786,9447,8791,9454,8793,9467,8793,9481,8793,9553xe" filled="true" fillcolor="#496782" stroked="false">
+                <v:shape id="Graphic 86" o:spid="_x0000_s1095" style="position:absolute;left:49727;top:20535;width:552;height:749;visibility:visible;mso-wrap-style:square;v-text-anchor:top" coordsize="55244,74930" o:gfxdata="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" path="m54959,74771r-12192,l42767,18383,39719,15240,38195,12192,33527,10668r-10668,l19811,12192r-3048,4572l13715,19907r-1524,6096l12191,74771,,74771,,1524r12191,l12191,12192,13715,9144,19811,3048,24383,1524,27431,,41243,r4572,3048l50387,7620r3048,4572l54959,19907r,9144l54959,74771xe" fillcolor="#496782" stroked="f">
                   <v:path arrowok="t"/>
-                  <v:fill type="solid"/>
                 </v:shape>
-                <v:shape style="position:absolute;left:8826;top:9406;width:219;height:149" type="#_x0000_t75" id="docshape87" stroked="false">
-                  <v:imagedata r:id="rId52" o:title=""/>
+                <v:shape id="Image 87" o:spid="_x0000_s1096" type="#_x0000_t75" style="position:absolute;left:50490;top:20352;width:1389;height:945;visibility:visible;mso-wrap-style:square" o:gfxdata="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">
+                  <v:imagedata r:id="rId110" o:title=""/>
                 </v:shape>
-                <v:shape style="position:absolute;left:9084;top:9394;width:94;height:159" id="docshape88" coordorigin="9084,9394" coordsize="94,159" path="m9140,9538l9123,9538,9123,9452,9091,9452,9091,9438,9140,9438,9140,9538xm9178,9553l9084,9553,9084,9538,9178,9538,9178,9553xm9140,9416l9123,9416,9123,9394,9140,9394,9140,9416xe" filled="true" fillcolor="#496782" stroked="false">
+                <v:shape id="Graphic 88" o:spid="_x0000_s1097" style="position:absolute;left:52124;top:20275;width:597;height:1010;visibility:visible;mso-wrap-style:square;v-text-anchor:top" coordsize="59690,100965" o:gfxdata="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" path="m35147,91535r-10763,l24384,36576r-19812,l4572,27432r30575,l35147,91535xem59531,100679l,100679,,91535r59531,l59531,100679xem35147,13716r-10763,l24384,,35147,r,13716xe" fillcolor="#496782" stroked="f">
                   <v:path arrowok="t"/>
-                  <v:fill type="solid"/>
                 </v:shape>
-                <v:shape style="position:absolute;left:9211;top:9391;width:467;height:205" type="#_x0000_t75" id="docshape89" stroked="false">
-                  <v:imagedata r:id="rId53" o:title=""/>
+                <v:shape id="Image 89" o:spid="_x0000_s1098" type="#_x0000_t75" style="position:absolute;left:52934;top:20260;width:2962;height:1298;visibility:visible;mso-wrap-style:square" o:gfxdata="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">
+                  <v:imagedata r:id="rId111" o:title=""/>
                 </v:shape>
-                <v:shape style="position:absolute;left:9716;top:9391;width:89;height:161" id="docshape90" coordorigin="9717,9392" coordsize="89,161" path="m9806,9553l9770,9553,9762,9551,9755,9541,9748,9534,9745,9524,9745,9406,9717,9406,9717,9392,9765,9392,9765,9512,9765,9519,9767,9527,9770,9531,9772,9534,9777,9536,9806,9536,9806,9553xe" filled="true" fillcolor="#496782" stroked="false">
+                <v:shape id="Graphic 90" o:spid="_x0000_s1099" style="position:absolute;left:56140;top:20260;width:565;height:1023;visibility:visible;mso-wrap-style:square;v-text-anchor:top" coordsize="56515,102235" o:gfxdata="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" path="m56483,102203r-22860,l29051,100679,24479,94583,19907,90011,18288,83915r,-74772l,9143,,,30575,r,76295l30575,80867r1524,4572l33623,88487r1524,1524l38195,91535r18288,l56483,102203xe" fillcolor="#496782" stroked="f">
                   <v:path arrowok="t"/>
-                  <v:fill type="solid"/>
                 </v:shape>
-                <v:shape style="position:absolute;left:10002;top:9521;width:36;height:61" id="docshape91" coordorigin="10003,9522" coordsize="36,61" path="m10017,9582l10003,9582,10013,9543,10013,9522,10039,9522,10039,9543,10017,9582xe" filled="true" fillcolor="#343833" stroked="false">
+                <v:shape id="Graphic 91" o:spid="_x0000_s1100" style="position:absolute;left:57957;top:21084;width:229;height:387;visibility:visible;mso-wrap-style:square;v-text-anchor:top" coordsize="22860,38735" o:gfxdata="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" path="m9144,38194l,38194,6096,13715,6096,,22860,r,13715l9144,38194xe" fillcolor="#343833" stroked="f">
                   <v:path arrowok="t"/>
-                  <v:fill type="solid"/>
                 </v:shape>
-                <v:shape style="position:absolute;left:1175;top:9706;width:92;height:147" id="docshape92" coordorigin="1175,9707" coordsize="92,147" path="m1266,9853l1230,9853,1221,9851,1209,9839,1206,9829,1206,9752,1175,9752,1175,9738,1206,9738,1206,9707,1223,9707,1223,9738,1266,9738,1266,9752,1223,9752,1223,9825,1228,9834,1238,9839,1266,9839,1266,9853xe" filled="true" fillcolor="#496782" stroked="false">
+                <v:shape id="Graphic 92" o:spid="_x0000_s1101" style="position:absolute;left:1901;top:22260;width:584;height:933;visibility:visible;mso-wrap-style:square;v-text-anchor:top" coordsize="58419,93345" o:gfxdata="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" path="m58007,93059r-22956,l28955,91535,21335,83915,19811,77819r,-48863l,28956,,19812r19811,l19811,,30479,r,19812l58007,19812r,9144l30479,28956r,45815l33527,80867r6096,3048l58007,83915r,9144xe" fillcolor="#496782" stroked="f">
                   <v:path arrowok="t"/>
-                  <v:fill type="solid"/>
                 </v:shape>
-                <v:shape style="position:absolute;left:1302;top:9697;width:344;height:159" type="#_x0000_t75" id="docshape93" stroked="false">
-                  <v:imagedata r:id="rId54" o:title=""/>
+                <v:shape id="Image 93" o:spid="_x0000_s1102" type="#_x0000_t75" style="position:absolute;left:2709;top:22199;width:2185;height:1006;visibility:visible;mso-wrap-style:square" o:gfxdata="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">
+                  <v:imagedata r:id="rId112" o:title=""/>
                 </v:shape>
-                <v:shape style="position:absolute;left:1704;top:9694;width:203;height:159" type="#_x0000_t75" id="docshape94" stroked="false">
-                  <v:imagedata r:id="rId55" o:title=""/>
+                <v:shape id="Image 94" o:spid="_x0000_s1103" type="#_x0000_t75" style="position:absolute;left:5259;top:22183;width:1283;height:1007;visibility:visible;mso-wrap-style:square" o:gfxdata="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">
+                  <v:imagedata r:id="rId113" o:title=""/>
                 </v:shape>
-                <v:shape style="position:absolute;left:1939;top:9735;width:214;height:164" id="docshape95" coordorigin="1940,9736" coordsize="214,164" path="m2029,9767l2026,9755,2019,9748,2014,9740,2005,9736,1985,9736,1978,9738,1973,9740,1959,9755,1959,9738,1940,9738,1940,9853,1959,9853,1959,9777,1961,9767,1966,9762,1971,9755,1978,9752,1995,9752,2000,9755,2005,9760,2007,9765,2009,9772,2009,9853,2029,9853,2029,9781,2029,9767xm2154,9738l2135,9738,2135,9755,2135,9781,2135,9810,2132,9820,2130,9827,2125,9834,2118,9839,2099,9839,2091,9834,2087,9827,2082,9820,2081,9819,2079,9810,2079,9781,2082,9769,2087,9762,2091,9755,2099,9752,2118,9752,2125,9755,2130,9762,2132,9769,2135,9781,2135,9755,2134,9752,2132,9748,2127,9743,2113,9736,2091,9736,2079,9740,2067,9761,2063,9770,2061,9782,2060,9796,2061,9808,2063,9819,2067,9830,2072,9839,2079,9849,2091,9853,2118,9853,2123,9849,2130,9846,2132,9841,2133,9839,2135,9834,2135,9861,2132,9870,2130,9875,2125,9880,2118,9885,2101,9885,2096,9882,2091,9882,2087,9880,2072,9875,2072,9892,2079,9894,2084,9897,2089,9897,2096,9899,2123,9899,2135,9894,2142,9885,2148,9878,2151,9869,2153,9858,2154,9849,2154,9834,2154,9755,2154,9738xe" filled="true" fillcolor="#496782" stroked="false">
+                <v:shape id="Graphic 95" o:spid="_x0000_s1104" style="position:absolute;left:6757;top:22442;width:1359;height:1042;visibility:visible;mso-wrap-style:square;v-text-anchor:top" coordsize="135890,104139" o:gfxdata="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" path="m56476,19913l54952,12192,50380,7620,47332,3048,41148,,28956,,24384,1524,21336,3048r-9144,9144l12192,1524,,1524,,74777r12192,l12192,26009r1524,-6096l16764,16764r3048,-4572l24384,10668r10668,l38100,12192r3048,3048l42672,18389r1524,4572l44196,74777r12280,l56476,29057r,-9144xem135826,1524r-12192,l123634,12192r,16865l123634,47345r-1524,6096l120586,58013r-3048,4572l112966,65633r-12192,l96202,62585,93154,58013,90004,53441r-88,-381l88480,47345r,-18288l90004,21336r3150,-4572l96202,12192r4572,-1524l112966,10668r4572,1524l120586,16764r1524,4572l123634,29057r,-16865l123126,10668,122110,7620,119062,4572,109918,,96202,,76288,38201r547,7709l96202,74777r16764,l116014,71729r4572,-1524l122110,67157r508,-1524l123634,62585r,16764l122110,85445r-1524,3137l117538,91630r-4572,3048l102298,94678,99250,93154r-3048,l93154,91630,83908,88582r,10668l88480,100774r3048,1524l94678,102298r4572,1524l116014,103822r7620,-3048l128206,94678r3759,-4242l134302,84734r1181,-6845l135750,71729r76,-9144l135826,12192r,-10668xe" fillcolor="#496782" stroked="f">
                   <v:path arrowok="t"/>
-                  <v:fill type="solid"/>
                 </v:shape>
-                <v:shape style="position:absolute;left:2350;top:9822;width:36;height:61" id="docshape96" coordorigin="2351,9822" coordsize="36,61" path="m2368,9882l2351,9882,2361,9844,2361,9822,2387,9822,2387,9844,2368,9882xe" filled="true" fillcolor="#343833" stroked="false">
+                <v:shape id="Graphic 96" o:spid="_x0000_s1105" style="position:absolute;left:9367;top:22992;width:229;height:387;visibility:visible;mso-wrap-style:square;v-text-anchor:top" coordsize="22860,38735" o:gfxdata="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" path="m10668,38195l,38195,6095,13716,6095,,22860,r,13716l10668,38195xe" fillcolor="#343833" stroked="f">
                   <v:path arrowok="t"/>
-                  <v:fill type="solid"/>
                 </v:shape>
-                <v:shape style="position:absolute;left:2562;top:9735;width:236;height:121" type="#_x0000_t75" id="docshape97" stroked="false">
-                  <v:imagedata r:id="rId56" o:title=""/>
+                <v:shape id="Image 97" o:spid="_x0000_s1106" type="#_x0000_t75" style="position:absolute;left:10711;top:22442;width:1497;height:763;visibility:visible;mso-wrap-style:square" o:gfxdata="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">
+                  <v:imagedata r:id="rId114" o:title=""/>
                 </v:shape>
-                <v:shape style="position:absolute;left:2834;top:9694;width:215;height:159" type="#_x0000_t75" id="docshape98" stroked="false">
-                  <v:imagedata r:id="rId57" o:title=""/>
+                <v:shape id="Image 98" o:spid="_x0000_s1107" type="#_x0000_t75" style="position:absolute;left:12436;top:22183;width:1361;height:1007;visibility:visible;mso-wrap-style:square" o:gfxdata="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">
+                  <v:imagedata r:id="rId115" o:title=""/>
                 </v:shape>
-                <v:shape style="position:absolute;left:3245;top:9822;width:36;height:61" id="docshape99" coordorigin="3246,9822" coordsize="36,61" path="m3262,9882l3246,9882,3258,9844,3258,9822,3282,9822,3282,9844,3262,9882xe" filled="true" fillcolor="#343833" stroked="false">
+                <v:shape id="Graphic 99" o:spid="_x0000_s1108" style="position:absolute;left:15048;top:22992;width:229;height:387;visibility:visible;mso-wrap-style:square;v-text-anchor:top" coordsize="22860,38735" o:gfxdata="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" path="m10668,38195l,38195,7620,13716,7620,,22860,r,13716l10668,38195xe" fillcolor="#343833" stroked="f">
                   <v:path arrowok="t"/>
-                  <v:fill type="solid"/>
                 </v:shape>
-                <v:shape style="position:absolute;left:3457;top:9735;width:236;height:121" type="#_x0000_t75" id="docshape100" stroked="false">
-                  <v:imagedata r:id="rId58" o:title=""/>
+                <v:shape id="Image 100" o:spid="_x0000_s1109" type="#_x0000_t75" style="position:absolute;left:16392;top:22442;width:1496;height:763;visibility:visible;mso-wrap-style:square" o:gfxdata="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">
+                  <v:imagedata r:id="rId116" o:title=""/>
                 </v:shape>
-                <v:shape style="position:absolute;left:3728;top:9694;width:217;height:159" type="#_x0000_t75" id="docshape101" stroked="false">
-                  <v:imagedata r:id="rId59" o:title=""/>
+                <v:shape id="Image 101" o:spid="_x0000_s1110" type="#_x0000_t75" style="position:absolute;left:18117;top:22183;width:1375;height:1007;visibility:visible;mso-wrap-style:square" o:gfxdata="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">
+                  <v:imagedata r:id="rId117" o:title=""/>
                 </v:shape>
-                <v:shape style="position:absolute;left:4142;top:9822;width:36;height:61" id="docshape102" coordorigin="4143,9822" coordsize="36,61" path="m4157,9882l4143,9882,4152,9844,4152,9822,4179,9822,4179,9844,4157,9882xe" filled="true" fillcolor="#343833" stroked="false">
+                <v:shape id="Graphic 102" o:spid="_x0000_s1111" style="position:absolute;left:20744;top:22992;width:229;height:387;visibility:visible;mso-wrap-style:square;v-text-anchor:top" coordsize="22860,38735" o:gfxdata="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" path="m9143,38195l,38195,6095,13716,6095,,22859,r,13716l9143,38195xe" fillcolor="#343833" stroked="f">
                   <v:path arrowok="t"/>
-                  <v:fill type="solid"/>
                 </v:shape>
-                <v:shape style="position:absolute;left:4354;top:9735;width:236;height:121" type="#_x0000_t75" id="docshape103" stroked="false">
-                  <v:imagedata r:id="rId60" o:title=""/>
+                <v:shape id="Image 103" o:spid="_x0000_s1112" type="#_x0000_t75" style="position:absolute;left:22087;top:22442;width:1497;height:763;visibility:visible;mso-wrap-style:square" o:gfxdata="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">
+                  <v:imagedata r:id="rId118" o:title=""/>
                 </v:shape>
-                <v:shape style="position:absolute;left:4625;top:9694;width:214;height:159" type="#_x0000_t75" id="docshape104" stroked="false">
-                  <v:imagedata r:id="rId61" o:title=""/>
+                <v:shape id="Image 104" o:spid="_x0000_s1113" type="#_x0000_t75" style="position:absolute;left:23813;top:22183;width:1358;height:1007;visibility:visible;mso-wrap-style:square" o:gfxdata="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">
+                  <v:imagedata r:id="rId119" o:title=""/>
                 </v:shape>
-                <w10:wrap type="none"/>
+                <w10:wrap anchorx="page" anchory="page"/>
               </v:group>
             </w:pict>
           </mc:Fallback>
@@ -13096,13 +13086,15 @@
       <w:r>
         <w:rPr>
           <w:rFonts w:ascii="Times New Roman"/>
+          <w:noProof/>
           <w:position w:val="-4"/>
           <w:sz w:val="20"/>
+          <w:lang w:val="es-ES" w:eastAsia="es-ES"/>
         </w:rPr>
         <mc:AlternateContent>
-          <mc:Choice Requires="wps">
+          <mc:Choice Requires="wpg">
             <w:drawing>
-              <wp:anchor distT="0" distB="0" distL="0" distR="0" allowOverlap="1" layoutInCell="1" locked="0" behindDoc="0" simplePos="0" relativeHeight="15732224">
+              <wp:anchor distT="0" distB="0" distL="0" distR="0" simplePos="0" relativeHeight="15732224" behindDoc="0" locked="0" layoutInCell="1" allowOverlap="1">
                 <wp:simplePos x="0" y="0"/>
                 <wp:positionH relativeFrom="page">
                   <wp:posOffset>556059</wp:posOffset>
@@ -13115,17 +13107,19 @@
                 <wp:wrapNone/>
                 <wp:docPr id="105" name="Group 105"/>
                 <wp:cNvGraphicFramePr>
-                  <a:graphicFrameLocks/>
+                  <a:graphicFrameLocks xmlns:a="http://schemas.openxmlformats.org/drawingml/2006/main"/>
                 </wp:cNvGraphicFramePr>
-                <a:graphic>
+                <a:graphic xmlns:a="http://schemas.openxmlformats.org/drawingml/2006/main">
                   <a:graphicData uri="http://schemas.microsoft.com/office/word/2010/wordprocessingGroup">
                     <wpg:wgp>
-                      <wpg:cNvPr id="105" name="Group 105"/>
-                      <wpg:cNvGrpSpPr/>
+                      <wpg:cNvGrpSpPr>
+                        <a:grpSpLocks/>
+                      </wpg:cNvGrpSpPr>
                       <wpg:grpSpPr>
                         <a:xfrm>
                           <a:off x="0" y="0"/>
                           <a:ext cx="6479540" cy="1604645"/>
+                          <a:chOff x="0" y="0"/>
                           <a:chExt cx="6479540" cy="1604645"/>
                         </a:xfrm>
                       </wpg:grpSpPr>
@@ -13196,13 +13190,13 @@
                           <a:noAutofit/>
                         </wps:bodyPr>
                       </wps:wsp>
-                      <pic:pic>
+                      <pic:pic xmlns:pic="http://schemas.openxmlformats.org/drawingml/2006/picture">
                         <pic:nvPicPr>
                           <pic:cNvPr id="107" name="Image 107"/>
                           <pic:cNvPicPr/>
                         </pic:nvPicPr>
                         <pic:blipFill>
-                          <a:blip r:embed="rId62" cstate="print"/>
+                          <a:blip r:embed="rId120" cstate="print"/>
                           <a:stretch>
                             <a:fillRect/>
                           </a:stretch>
@@ -13217,13 +13211,13 @@
                           </a:prstGeom>
                         </pic:spPr>
                       </pic:pic>
-                      <pic:pic>
+                      <pic:pic xmlns:pic="http://schemas.openxmlformats.org/drawingml/2006/picture">
                         <pic:nvPicPr>
                           <pic:cNvPr id="108" name="Image 108"/>
                           <pic:cNvPicPr/>
                         </pic:nvPicPr>
                         <pic:blipFill>
-                          <a:blip r:embed="rId63" cstate="print"/>
+                          <a:blip r:embed="rId121" cstate="print"/>
                           <a:stretch>
                             <a:fillRect/>
                           </a:stretch>
@@ -13238,13 +13232,13 @@
                           </a:prstGeom>
                         </pic:spPr>
                       </pic:pic>
-                      <pic:pic>
+                      <pic:pic xmlns:pic="http://schemas.openxmlformats.org/drawingml/2006/picture">
                         <pic:nvPicPr>
                           <pic:cNvPr id="109" name="Image 109"/>
                           <pic:cNvPicPr/>
                         </pic:nvPicPr>
                         <pic:blipFill>
-                          <a:blip r:embed="rId64" cstate="print"/>
+                          <a:blip r:embed="rId122" cstate="print"/>
                           <a:stretch>
                             <a:fillRect/>
                           </a:stretch>
@@ -13259,13 +13253,13 @@
                           </a:prstGeom>
                         </pic:spPr>
                       </pic:pic>
-                      <pic:pic>
+                      <pic:pic xmlns:pic="http://schemas.openxmlformats.org/drawingml/2006/picture">
                         <pic:nvPicPr>
                           <pic:cNvPr id="110" name="Image 110"/>
                           <pic:cNvPicPr/>
                         </pic:nvPicPr>
                         <pic:blipFill>
-                          <a:blip r:embed="rId65" cstate="print"/>
+                          <a:blip r:embed="rId123" cstate="print"/>
                           <a:stretch>
                             <a:fillRect/>
                           </a:stretch>
@@ -13575,13 +13569,13 @@
                           <a:noAutofit/>
                         </wps:bodyPr>
                       </wps:wsp>
-                      <pic:pic>
+                      <pic:pic xmlns:pic="http://schemas.openxmlformats.org/drawingml/2006/picture">
                         <pic:nvPicPr>
                           <pic:cNvPr id="112" name="Image 112"/>
                           <pic:cNvPicPr/>
                         </pic:nvPicPr>
                         <pic:blipFill>
-                          <a:blip r:embed="rId66" cstate="print"/>
+                          <a:blip r:embed="rId124" cstate="print"/>
                           <a:stretch>
                             <a:fillRect/>
                           </a:stretch>
@@ -13783,13 +13777,13 @@
                           <a:noAutofit/>
                         </wps:bodyPr>
                       </wps:wsp>
-                      <pic:pic>
+                      <pic:pic xmlns:pic="http://schemas.openxmlformats.org/drawingml/2006/picture">
                         <pic:nvPicPr>
                           <pic:cNvPr id="114" name="Image 114"/>
                           <pic:cNvPicPr/>
                         </pic:nvPicPr>
                         <pic:blipFill>
-                          <a:blip r:embed="rId67" cstate="print"/>
+                          <a:blip r:embed="rId125" cstate="print"/>
                           <a:stretch>
                             <a:fillRect/>
                           </a:stretch>
@@ -14114,13 +14108,13 @@
                           <a:noAutofit/>
                         </wps:bodyPr>
                       </wps:wsp>
-                      <pic:pic>
+                      <pic:pic xmlns:pic="http://schemas.openxmlformats.org/drawingml/2006/picture">
                         <pic:nvPicPr>
                           <pic:cNvPr id="116" name="Image 116"/>
                           <pic:cNvPicPr/>
                         </pic:nvPicPr>
                         <pic:blipFill>
-                          <a:blip r:embed="rId68" cstate="print"/>
+                          <a:blip r:embed="rId126" cstate="print"/>
                           <a:stretch>
                             <a:fillRect/>
                           </a:stretch>
@@ -14321,49 +14315,44 @@
           </mc:Choice>
           <mc:Fallback>
             <w:pict>
-              <v:group style="position:absolute;margin-left:43.784248pt;margin-top:523.371765pt;width:510.2pt;height:126.35pt;mso-position-horizontal-relative:page;mso-position-vertical-relative:page;z-index:15732224" id="docshapegroup105" coordorigin="876,10467" coordsize="10204,2527">
-                <v:shape style="position:absolute;left:884;top:10475;width:10187;height:2510" id="docshape106" coordorigin="884,10476" coordsize="10187,2510" path="m884,10476l11071,10476,11071,12985,884,12985,884,10476xm1048,11317l10756,11317,10756,11889,1048,11889,1048,11317xe" filled="false" stroked="true" strokeweight=".8415pt" strokecolor="#ededed">
+              <v:group w14:anchorId="58E4E6CA" id="Group 105" o:spid="_x0000_s1026" style="position:absolute;margin-left:43.8pt;margin-top:523.35pt;width:510.2pt;height:126.35pt;z-index:15732224;mso-wrap-distance-left:0;mso-wrap-distance-right:0;mso-position-horizontal-relative:page;mso-position-vertical-relative:page" coordsize="64795,16046" o:gfxdata="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">
+                <v:shape id="Graphic 106" o:spid="_x0000_s1027" style="position:absolute;left:53;top:53;width:64687;height:15938;visibility:visible;mso-wrap-style:square;v-text-anchor:top" coordsize="6468745,1593850" o:gfxdata="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" path="m,l6468427,r,1593437l,1593437,,xem103822,534256r6164580,l6268402,897445r-6164580,l103822,534256xe" filled="f" strokecolor="#ededed" strokeweight=".29686mm">
                   <v:path arrowok="t"/>
-                  <v:stroke dashstyle="solid"/>
                 </v:shape>
-                <v:shape style="position:absolute;left:1050;top:10790;width:2942;height:210" type="#_x0000_t75" id="docshape107" stroked="false">
-                  <v:imagedata r:id="rId62" o:title=""/>
+                <v:shape id="Image 107" o:spid="_x0000_s1028" type="#_x0000_t75" style="position:absolute;left:1106;top:2052;width:18676;height:1329;visibility:visible;mso-wrap-style:square" o:gfxdata="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">
+                  <v:imagedata r:id="rId127" o:title=""/>
                 </v:shape>
-                <v:shape style="position:absolute;left:1153;top:11497;width:270;height:178" type="#_x0000_t75" id="docshape108" stroked="false">
-                  <v:imagedata r:id="rId63" o:title=""/>
+                <v:shape id="Image 108" o:spid="_x0000_s1029" type="#_x0000_t75" style="position:absolute;left:1763;top:6539;width:1710;height:1130;visibility:visible;mso-wrap-style:square" o:gfxdata="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">
+                  <v:imagedata r:id="rId128" o:title=""/>
                 </v:shape>
-                <v:shape style="position:absolute;left:1453;top:11502;width:400;height:174" type="#_x0000_t75" id="docshape109" stroked="false">
-                  <v:imagedata r:id="rId64" o:title=""/>
+                <v:shape id="Image 109" o:spid="_x0000_s1030" type="#_x0000_t75" style="position:absolute;left:3671;top:6570;width:2535;height:1099;visibility:visible;mso-wrap-style:square" o:gfxdata="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">
+                  <v:imagedata r:id="rId129" o:title=""/>
                 </v:shape>
-                <v:shape style="position:absolute;left:1884;top:11487;width:323;height:188" type="#_x0000_t75" id="docshape110" stroked="false">
-                  <v:imagedata r:id="rId65" o:title=""/>
+                <v:shape id="Image 110" o:spid="_x0000_s1031" type="#_x0000_t75" style="position:absolute;left:6405;top:6478;width:2046;height:1191;visibility:visible;mso-wrap-style:square" o:gfxdata="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">
+                  <v:imagedata r:id="rId130" o:title=""/>
                 </v:shape>
-                <v:shape style="position:absolute;left:1179;top:11488;width:1110;height:872" id="docshape111" coordorigin="1180,11489" coordsize="1110,872" path="m1274,12259l1273,12246,1273,12245,1272,12234,1269,12224,1264,12216,1254,12204,1254,12245,1254,12274,1252,12286,1247,12293,1242,12300,1238,12305,1218,12305,1215,12303,1211,12300,1202,12286,1201,12285,1199,12274,1199,12245,1202,12233,1206,12226,1211,12218,1218,12216,1238,12216,1242,12218,1247,12226,1252,12233,1254,12245,1254,12204,1245,12199,1223,12199,1218,12202,1211,12204,1206,12206,1202,12211,1199,12216,1199,12202,1180,12202,1180,12360,1199,12360,1199,12303,1202,12307,1206,12312,1211,12315,1216,12319,1245,12319,1254,12315,1264,12305,1269,12295,1272,12285,1273,12273,1274,12259xm1396,12202l1377,12202,1377,12279,1375,12288,1370,12293,1365,12300,1358,12303,1341,12303,1336,12300,1331,12295,1329,12291,1327,12283,1327,12202,1307,12202,1307,12274,1307,12288,1310,12300,1317,12307,1322,12317,1331,12319,1358,12319,1363,12315,1370,12312,1372,12307,1377,12300,1377,12317,1396,12317,1396,12202xm2290,11489l2246,11489,2246,11671,2290,11671,2290,11489xe" filled="true" fillcolor="#343833" stroked="false">
+                <v:shape id="Graphic 111" o:spid="_x0000_s1032" style="position:absolute;left:1931;top:6485;width:7049;height:5537;visibility:visible;mso-wrap-style:square;v-text-anchor:top" coordsize="704850,553720" o:gfxdata="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" path="m59524,489305r-304,-8572l59131,480161r-940,-6871l56311,466979r-2883,-5207l47332,454152r,26009l47332,498449r-1524,7620l42672,510641r-3048,4572l36576,518261r-12192,l22098,516737r-2286,-1524l13716,506069r-115,-571l12192,498449r,-18288l13716,472541r3048,-4572l19812,463296r4572,-1524l36576,461772r3048,1524l42672,467969r3136,4572l47332,480161r,-26009l41148,451104r-13716,l24384,452628r-4572,1524l16764,455676r-3048,3048l12192,461772r,-9144l,452628,,553402r12192,l12192,516737r1524,3048l16764,522833r3048,1524l22860,527405r18288,l47332,524357r6096,-6096l56311,512241r1880,-6743l59220,497903r304,-8598xem137350,452628r-12192,l125158,501497r-1524,6096l120586,510641r-3048,4572l112966,516737r-10668,l99250,515213r-3048,-3048l94678,509117r-1524,-4572l93154,452628r-12294,l80860,498449r,9144l82384,515213r4572,4572l90004,525881r6198,1524l112966,527405r3048,-3048l120586,522833r1524,-3048l125158,515213r,10668l137350,525881r,-73253xem704646,l677214,r,115824l704646,115824,704646,xe" fillcolor="#343833" stroked="f">
                   <v:path arrowok="t"/>
-                  <v:fill type="solid"/>
                 </v:shape>
-                <v:shape style="position:absolute;left:1434;top:12156;width:212;height:164" type="#_x0000_t75" id="docshape112" stroked="false">
-                  <v:imagedata r:id="rId66" o:title=""/>
+                <v:shape id="Image 112" o:spid="_x0000_s1033" type="#_x0000_t75" style="position:absolute;left:3550;top:10722;width:1344;height:1037;visibility:visible;mso-wrap-style:square" o:gfxdata="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">
+                  <v:imagedata r:id="rId131" o:title=""/>
                 </v:shape>
-                <v:shape style="position:absolute;left:1684;top:12158;width:219;height:161" id="docshape113" coordorigin="1685,12158" coordsize="219,161" path="m1742,12158l1723,12158,1723,12180,1742,12180,1742,12158xm1779,12303l1742,12303,1742,12202,1694,12202,1694,12216,1723,12216,1723,12303,1685,12303,1685,12317,1779,12317,1779,12303xm1904,12209l1899,12204,1892,12202,1887,12202,1882,12199,1870,12199,1858,12200,1847,12203,1837,12208,1829,12216,1823,12224,1818,12234,1816,12246,1815,12259,1816,12273,1818,12285,1823,12295,1829,12305,1837,12311,1847,12316,1858,12318,1870,12319,1882,12319,1887,12317,1894,12317,1904,12312,1904,12291,1899,12295,1884,12303,1877,12305,1860,12305,1851,12300,1836,12286,1834,12274,1834,12245,1836,12235,1844,12226,1851,12218,1860,12216,1882,12216,1889,12218,1899,12223,1904,12228,1904,12209xe" filled="true" fillcolor="#343833" stroked="false">
+                <v:shape id="Graphic 113" o:spid="_x0000_s1034" style="position:absolute;left:5137;top:10737;width:1391;height:1022;visibility:visible;mso-wrap-style:square;v-text-anchor:top" coordsize="139065,102235" o:gfxdata="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" path="m36576,l24384,r,13716l36576,13716,36576,xem59537,91541r-22961,l36576,27432r-30480,l6096,36576r18288,l24384,91541,,91541r,9144l59537,100685r,-9144xem138976,32004r-3048,-3048l131356,27432r-3048,l125260,25908r-7620,l109893,26504,83070,55537r-571,8572l83070,72707r26823,28931l117640,102209r7620,l128308,100685r4572,l138976,97637r,-13716l135928,86969r-9144,4572l122212,93065r-10668,l105359,90017,96215,80873,94691,73253r,-18288l96215,48869r4572,-6096l105359,38100r6185,-1524l125260,36576r4572,1524l135928,41148r3048,3149l138976,32004xe" fillcolor="#343833" stroked="f">
                   <v:path arrowok="t"/>
-                  <v:fill type="solid"/>
                 </v:shape>
-                <v:shape style="position:absolute;left:2071;top:12163;width:212;height:157" type="#_x0000_t75" id="docshape114" stroked="false">
-                  <v:imagedata r:id="rId67" o:title=""/>
+                <v:shape id="Image 114" o:spid="_x0000_s1035" type="#_x0000_t75" style="position:absolute;left:7596;top:10768;width:1344;height:991;visibility:visible;mso-wrap-style:square" o:gfxdata="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">
+                  <v:imagedata r:id="rId132" o:title=""/>
                 </v:shape>
-                <v:shape style="position:absolute;left:2322;top:12170;width:344;height:149" id="docshape115" coordorigin="2322,12170" coordsize="344,149" path="m2411,12209l2404,12204,2399,12202,2394,12202,2390,12199,2377,12199,2365,12200,2354,12203,2345,12208,2337,12216,2330,12224,2326,12234,2323,12246,2322,12259,2323,12273,2326,12285,2330,12295,2337,12305,2345,12311,2354,12316,2365,12318,2377,12319,2390,12319,2394,12317,2399,12317,2404,12315,2411,12312,2411,12291,2406,12295,2397,12300,2390,12303,2385,12305,2365,12305,2358,12300,2344,12286,2341,12274,2341,12245,2344,12235,2351,12226,2356,12218,2365,12216,2390,12216,2399,12221,2406,12223,2411,12228,2411,12209xm2534,12202l2490,12202,2490,12170,2471,12170,2471,12202,2442,12202,2442,12216,2471,12216,2471,12293,2476,12303,2481,12307,2486,12315,2495,12317,2534,12317,2534,12303,2505,12303,2498,12300,2495,12298,2490,12288,2490,12216,2534,12216,2534,12202xm2666,12259l2666,12246,2665,12245,2664,12234,2660,12223,2656,12216,2654,12214,2647,12206,2647,12245,2647,12274,2644,12286,2635,12300,2628,12305,2608,12305,2601,12300,2592,12286,2589,12274,2589,12245,2592,12233,2596,12226,2601,12218,2608,12216,2628,12216,2635,12218,2640,12226,2644,12233,2645,12234,2647,12245,2647,12206,2644,12204,2632,12199,2601,12199,2589,12204,2582,12214,2576,12223,2571,12234,2568,12246,2568,12259,2568,12273,2569,12274,2571,12286,2576,12296,2582,12305,2589,12315,2601,12319,2632,12319,2647,12315,2654,12305,2660,12296,2664,12286,2666,12273,2666,12259xe" filled="true" fillcolor="#343833" stroked="false">
+                <v:shape id="Graphic 115" o:spid="_x0000_s1036" style="position:absolute;left:9184;top:10813;width:2185;height:946;visibility:visible;mso-wrap-style:square;v-text-anchor:top" coordsize="218440,94615" o:gfxdata="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" path="m56489,24384l51917,21336,48869,19812r-3048,l42773,18288r-7721,l27355,18884,571,47917,,56489r571,8598l27355,94018r7697,571l42773,94589r3048,-1524l48869,93065r3048,-1524l56489,90017r,-13716l53441,79349r-6096,3048l42773,83921r-3149,1524l27432,85445,22860,82397,13716,73253,12192,65633r,-18288l13716,41249r4572,-6096l21336,30480r6096,-1524l42773,28956r6096,3048l53441,33528r3048,3149l56489,24384xem134302,19812r-27432,l106870,,94678,r,19812l76288,19812r,9144l94678,28956r,48869l97726,83921r3048,3048l103822,91541r6096,1524l134302,93065r,-9144l116014,83921r-4572,-1524l109918,80873r-3048,-6096l106870,28956r27432,l134302,19812xem218401,56489l206209,22860r,24485l206209,65633r-1524,7620l198589,82397r-4572,3048l181737,85445r-4572,-3048l171069,73253r-1524,-7620l169545,47345r1524,-7620l174117,35052r3048,-4572l181737,28956r12280,l206209,47345r,-24485l204685,21336r-7620,-3048l177165,18288,155829,56489r571,8814l156476,65633r1639,7620l160972,80060r4001,5385l169545,91541r7620,3048l197065,94589,218071,65303r330,-8814xe" fillcolor="#343833" stroked="f">
                   <v:path arrowok="t"/>
-                  <v:fill type="solid"/>
                 </v:shape>
-                <v:shape style="position:absolute;left:2718;top:12158;width:325;height:161" type="#_x0000_t75" id="docshape116" stroked="false">
-                  <v:imagedata r:id="rId68" o:title=""/>
+                <v:shape id="Image 116" o:spid="_x0000_s1037" type="#_x0000_t75" style="position:absolute;left:11704;top:10737;width:2061;height:1022;visibility:visible;mso-wrap-style:square" o:gfxdata="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">
+                  <v:imagedata r:id="rId133" o:title=""/>
                 </v:shape>
-                <v:shape style="position:absolute;left:3077;top:12156;width:320;height:190" id="docshape117" coordorigin="3077,12156" coordsize="320,190" path="m3166,12300l3140,12300,3130,12295,3128,12291,3128,12276,3128,12156,3077,12156,3077,12170,3108,12170,3108,12288,3111,12298,3118,12305,3123,12315,3132,12317,3166,12317,3166,12300xm3279,12158l3262,12158,3255,12170,3249,12181,3243,12193,3238,12204,3235,12216,3233,12228,3232,12240,3231,12252,3232,12263,3233,12274,3235,12286,3238,12298,3243,12309,3249,12321,3262,12346,3279,12346,3272,12333,3267,12321,3262,12309,3258,12298,3254,12287,3252,12275,3251,12263,3250,12252,3251,12240,3252,12227,3254,12215,3258,12204,3262,12193,3267,12181,3272,12170,3279,12158xm3397,12252l3397,12240,3395,12228,3393,12216,3390,12204,3386,12193,3381,12181,3374,12170,3366,12158,3349,12158,3356,12170,3361,12181,3366,12193,3370,12204,3374,12216,3376,12228,3377,12240,3378,12252,3377,12263,3376,12274,3374,12286,3370,12298,3366,12309,3361,12321,3356,12333,3349,12346,3366,12346,3374,12333,3381,12321,3386,12309,3390,12298,3393,12286,3395,12274,3397,12263,3397,12252xe" filled="true" fillcolor="#343833" stroked="false">
+                <v:shape id="Graphic 117" o:spid="_x0000_s1038" style="position:absolute;left:13979;top:10722;width:2032;height:1206;visibility:visible;mso-wrap-style:square;v-text-anchor:top" coordsize="203200,120650" o:gfxdata="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" path="m56476,91541r-16852,l33528,88493,32004,85445r,-9144l32004,,,,,9144r19812,l19812,83921r1524,6096l25908,94589r3048,6096l35052,102209r21424,l56476,91541xem128206,1524r-10668,l113017,8623,98869,45770,97726,61061r292,6884l108775,104736r8763,15850l128206,120586r-4280,-7988l120205,104736,109918,61061r292,-7988l120205,16002r3721,-7379l128206,1524xem203073,61061l195910,23393,183159,1524r-10668,l176784,8623r3708,7379l190588,53289r293,7772l190588,67945r-10096,36791l172491,120586r10668,l200494,82283r2286,-14338l203073,61061xe" fillcolor="#343833" stroked="f">
                   <v:path arrowok="t"/>
-                  <v:fill type="solid"/>
                 </v:shape>
-                <w10:wrap type="none"/>
+                <w10:wrap anchorx="page" anchory="page"/>
               </v:group>
             </w:pict>
           </mc:Fallback>
@@ -14372,13 +14361,15 @@
       <w:r>
         <w:rPr>
           <w:rFonts w:ascii="Times New Roman"/>
+          <w:noProof/>
           <w:position w:val="-4"/>
           <w:sz w:val="20"/>
+          <w:lang w:val="es-ES" w:eastAsia="es-ES"/>
         </w:rPr>
         <mc:AlternateContent>
-          <mc:Choice Requires="wps">
+          <mc:Choice Requires="wpg">
             <w:drawing>
-              <wp:anchor distT="0" distB="0" distL="0" distR="0" allowOverlap="1" layoutInCell="1" locked="0" behindDoc="0" simplePos="0" relativeHeight="15732736">
+              <wp:anchor distT="0" distB="0" distL="0" distR="0" simplePos="0" relativeHeight="15732736" behindDoc="0" locked="0" layoutInCell="1" allowOverlap="1">
                 <wp:simplePos x="0" y="0"/>
                 <wp:positionH relativeFrom="page">
                   <wp:posOffset>556059</wp:posOffset>
@@ -14391,17 +14382,19 @@
                 <wp:wrapNone/>
                 <wp:docPr id="118" name="Group 118"/>
                 <wp:cNvGraphicFramePr>
-                  <a:graphicFrameLocks/>
+                  <a:graphicFrameLocks xmlns:a="http://schemas.openxmlformats.org/drawingml/2006/main"/>
                 </wp:cNvGraphicFramePr>
-                <a:graphic>
+                <a:graphic xmlns:a="http://schemas.openxmlformats.org/drawingml/2006/main">
                   <a:graphicData uri="http://schemas.microsoft.com/office/word/2010/wordprocessingGroup">
                     <wpg:wgp>
-                      <wpg:cNvPr id="118" name="Group 118"/>
-                      <wpg:cNvGrpSpPr/>
+                      <wpg:cNvGrpSpPr>
+                        <a:grpSpLocks/>
+                      </wpg:cNvGrpSpPr>
                       <wpg:grpSpPr>
                         <a:xfrm>
                           <a:off x="0" y="0"/>
                           <a:ext cx="6479540" cy="1604645"/>
+                          <a:chOff x="0" y="0"/>
                           <a:chExt cx="6479540" cy="1604645"/>
                         </a:xfrm>
                       </wpg:grpSpPr>
@@ -14472,13 +14465,13 @@
                           <a:noAutofit/>
                         </wps:bodyPr>
                       </wps:wsp>
-                      <pic:pic>
+                      <pic:pic xmlns:pic="http://schemas.openxmlformats.org/drawingml/2006/picture">
                         <pic:nvPicPr>
                           <pic:cNvPr id="120" name="Image 120"/>
                           <pic:cNvPicPr/>
                         </pic:nvPicPr>
                         <pic:blipFill>
-                          <a:blip r:embed="rId69" cstate="print"/>
+                          <a:blip r:embed="rId134" cstate="print"/>
                           <a:stretch>
                             <a:fillRect/>
                           </a:stretch>
@@ -14493,13 +14486,13 @@
                           </a:prstGeom>
                         </pic:spPr>
                       </pic:pic>
-                      <pic:pic>
+                      <pic:pic xmlns:pic="http://schemas.openxmlformats.org/drawingml/2006/picture">
                         <pic:nvPicPr>
                           <pic:cNvPr id="121" name="Image 121"/>
                           <pic:cNvPicPr/>
                         </pic:nvPicPr>
                         <pic:blipFill>
-                          <a:blip r:embed="rId63" cstate="print"/>
+                          <a:blip r:embed="rId121" cstate="print"/>
                           <a:stretch>
                             <a:fillRect/>
                           </a:stretch>
@@ -14514,13 +14507,13 @@
                           </a:prstGeom>
                         </pic:spPr>
                       </pic:pic>
-                      <pic:pic>
+                      <pic:pic xmlns:pic="http://schemas.openxmlformats.org/drawingml/2006/picture">
                         <pic:nvPicPr>
                           <pic:cNvPr id="122" name="Image 122"/>
                           <pic:cNvPicPr/>
                         </pic:nvPicPr>
                         <pic:blipFill>
-                          <a:blip r:embed="rId70" cstate="print"/>
+                          <a:blip r:embed="rId135" cstate="print"/>
                           <a:stretch>
                             <a:fillRect/>
                           </a:stretch>
@@ -14535,13 +14528,13 @@
                           </a:prstGeom>
                         </pic:spPr>
                       </pic:pic>
-                      <pic:pic>
+                      <pic:pic xmlns:pic="http://schemas.openxmlformats.org/drawingml/2006/picture">
                         <pic:nvPicPr>
                           <pic:cNvPr id="123" name="Image 123"/>
                           <pic:cNvPicPr/>
                         </pic:nvPicPr>
                         <pic:blipFill>
-                          <a:blip r:embed="rId65" cstate="print"/>
+                          <a:blip r:embed="rId123" cstate="print"/>
                           <a:stretch>
                             <a:fillRect/>
                           </a:stretch>
@@ -14842,13 +14835,13 @@
                           <a:noAutofit/>
                         </wps:bodyPr>
                       </wps:wsp>
-                      <pic:pic>
+                      <pic:pic xmlns:pic="http://schemas.openxmlformats.org/drawingml/2006/picture">
                         <pic:nvPicPr>
                           <pic:cNvPr id="125" name="Image 125"/>
                           <pic:cNvPicPr/>
                         </pic:nvPicPr>
                         <pic:blipFill>
-                          <a:blip r:embed="rId71" cstate="print"/>
+                          <a:blip r:embed="rId136" cstate="print"/>
                           <a:stretch>
                             <a:fillRect/>
                           </a:stretch>
@@ -16139,13 +16132,13 @@
                           <a:noAutofit/>
                         </wps:bodyPr>
                       </wps:wsp>
-                      <pic:pic>
+                      <pic:pic xmlns:pic="http://schemas.openxmlformats.org/drawingml/2006/picture">
                         <pic:nvPicPr>
                           <pic:cNvPr id="127" name="Image 127"/>
                           <pic:cNvPicPr/>
                         </pic:nvPicPr>
                         <pic:blipFill>
-                          <a:blip r:embed="rId72" cstate="print"/>
+                          <a:blip r:embed="rId137" cstate="print"/>
                           <a:stretch>
                             <a:fillRect/>
                           </a:stretch>
@@ -16464,13 +16457,13 @@
                           <a:noAutofit/>
                         </wps:bodyPr>
                       </wps:wsp>
-                      <pic:pic>
+                      <pic:pic xmlns:pic="http://schemas.openxmlformats.org/drawingml/2006/picture">
                         <pic:nvPicPr>
                           <pic:cNvPr id="129" name="Image 129"/>
                           <pic:cNvPicPr/>
                         </pic:nvPicPr>
                         <pic:blipFill>
-                          <a:blip r:embed="rId73" cstate="print"/>
+                          <a:blip r:embed="rId138" cstate="print"/>
                           <a:stretch>
                             <a:fillRect/>
                           </a:stretch>
@@ -16906,13 +16899,13 @@
                           <a:noAutofit/>
                         </wps:bodyPr>
                       </wps:wsp>
-                      <pic:pic>
+                      <pic:pic xmlns:pic="http://schemas.openxmlformats.org/drawingml/2006/picture">
                         <pic:nvPicPr>
                           <pic:cNvPr id="131" name="Image 131"/>
                           <pic:cNvPicPr/>
                         </pic:nvPicPr>
                         <pic:blipFill>
-                          <a:blip r:embed="rId74" cstate="print"/>
+                          <a:blip r:embed="rId139" cstate="print"/>
                           <a:stretch>
                             <a:fillRect/>
                           </a:stretch>
@@ -16927,13 +16920,13 @@
                           </a:prstGeom>
                         </pic:spPr>
                       </pic:pic>
-                      <pic:pic>
+                      <pic:pic xmlns:pic="http://schemas.openxmlformats.org/drawingml/2006/picture">
                         <pic:nvPicPr>
                           <pic:cNvPr id="132" name="Image 132"/>
                           <pic:cNvPicPr/>
                         </pic:nvPicPr>
                         <pic:blipFill>
-                          <a:blip r:embed="rId75" cstate="print"/>
+                          <a:blip r:embed="rId140" cstate="print"/>
                           <a:stretch>
                             <a:fillRect/>
                           </a:stretch>
@@ -17035,59 +17028,53 @@
           </mc:Choice>
           <mc:Fallback>
             <w:pict>
-              <v:group style="position:absolute;margin-left:43.784248pt;margin-top:660.854248pt;width:510.2pt;height:126.35pt;mso-position-horizontal-relative:page;mso-position-vertical-relative:page;z-index:15732736" id="docshapegroup118" coordorigin="876,13217" coordsize="10204,2527">
-                <v:shape style="position:absolute;left:884;top:13225;width:10187;height:2510" id="docshape119" coordorigin="884,13225" coordsize="10187,2510" path="m884,13225l11071,13225,11071,15735,884,15735,884,13225xm1048,14081l10756,14081,10756,14639,1048,14639,1048,14081xe" filled="false" stroked="true" strokeweight=".8415pt" strokecolor="#ededed">
+              <v:group w14:anchorId="68EE3789" id="Group 118" o:spid="_x0000_s1026" style="position:absolute;margin-left:43.8pt;margin-top:660.85pt;width:510.2pt;height:126.35pt;z-index:15732736;mso-wrap-distance-left:0;mso-wrap-distance-right:0;mso-position-horizontal-relative:page;mso-position-vertical-relative:page" coordsize="64795,16046" o:gfxdata="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">
+                <v:shape id="Graphic 119" o:spid="_x0000_s1027" style="position:absolute;left:53;top:53;width:64687;height:15938;visibility:visible;mso-wrap-style:square;v-text-anchor:top" coordsize="6468745,1593850" o:gfxdata="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" path="m,l6468427,r,1593437l,1593437,,xem103822,543401r6164580,l6268402,897445r-6164580,l103822,543401xe" filled="f" strokecolor="#ededed" strokeweight=".29686mm">
                   <v:path arrowok="t"/>
-                  <v:stroke dashstyle="solid"/>
                 </v:shape>
-                <v:shape style="position:absolute;left:1047;top:13537;width:2297;height:210" type="#_x0000_t75" id="docshape120" stroked="false">
-                  <v:imagedata r:id="rId69" o:title=""/>
+                <v:shape id="Image 120" o:spid="_x0000_s1028" type="#_x0000_t75" style="position:absolute;left:1091;top:2037;width:14583;height:1328;visibility:visible;mso-wrap-style:square" o:gfxdata="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">
+                  <v:imagedata r:id="rId141" o:title=""/>
                 </v:shape>
-                <v:shape style="position:absolute;left:1153;top:14261;width:270;height:178" type="#_x0000_t75" id="docshape121" stroked="false">
-                  <v:imagedata r:id="rId63" o:title=""/>
+                <v:shape id="Image 121" o:spid="_x0000_s1029" type="#_x0000_t75" style="position:absolute;left:1763;top:6631;width:1710;height:1130;visibility:visible;mso-wrap-style:square" o:gfxdata="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">
+                  <v:imagedata r:id="rId128" o:title=""/>
                 </v:shape>
-                <v:shape style="position:absolute;left:1453;top:14266;width:400;height:174" type="#_x0000_t75" id="docshape122" stroked="false">
-                  <v:imagedata r:id="rId70" o:title=""/>
+                <v:shape id="Image 122" o:spid="_x0000_s1030" type="#_x0000_t75" style="position:absolute;left:3671;top:6661;width:2535;height:1100;visibility:visible;mso-wrap-style:square" o:gfxdata="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">
+                  <v:imagedata r:id="rId142" o:title=""/>
                 </v:shape>
-                <v:shape style="position:absolute;left:1884;top:14251;width:323;height:188" type="#_x0000_t75" id="docshape123" stroked="false">
-                  <v:imagedata r:id="rId65" o:title=""/>
+                <v:shape id="Image 123" o:spid="_x0000_s1031" type="#_x0000_t75" style="position:absolute;left:6405;top:6570;width:2046;height:1191;visibility:visible;mso-wrap-style:square" o:gfxdata="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">
+                  <v:imagedata r:id="rId130" o:title=""/>
                 </v:shape>
-                <v:shape style="position:absolute;left:1179;top:14251;width:1110;height:859" id="docshape124" coordorigin="1180,14251" coordsize="1110,859" path="m1274,15009l1273,14995,1273,14995,1272,14983,1269,14973,1264,14963,1254,14954,1254,14995,1254,15023,1252,15035,1247,15043,1242,15050,1238,15052,1218,15052,1211,15050,1206,15043,1202,15033,1199,15023,1199,14995,1202,14982,1211,14968,1215,14966,1218,14963,1238,14963,1242,14968,1247,14975,1252,14982,1252,14983,1254,14995,1254,14954,1245,14949,1218,14949,1211,14954,1206,14956,1202,14961,1199,14966,1199,14951,1180,14951,1180,15110,1199,15110,1199,15052,1202,15057,1206,15062,1216,15067,1223,15069,1245,15069,1254,15064,1264,15052,1269,15044,1272,15034,1272,15033,1273,15023,1274,15009xm1396,14951l1377,14951,1377,15028,1375,15038,1370,15043,1365,15050,1358,15052,1341,15052,1336,15050,1331,15045,1329,15040,1327,15033,1327,14951,1307,14951,1307,15023,1307,15038,1310,15050,1317,15057,1322,15064,1331,15069,1351,15069,1358,15067,1363,15064,1370,15059,1372,15055,1377,15050,1377,15067,1396,15067,1396,14951xm2290,14251l2246,14251,2246,14434,2290,14434,2290,14251xe" filled="true" fillcolor="#343833" stroked="false">
+                <v:shape id="Graphic 124" o:spid="_x0000_s1032" style="position:absolute;left:1931;top:6566;width:7049;height:5455;visibility:visible;mso-wrap-style:square;v-text-anchor:top" coordsize="704850,545465" o:gfxdata="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" path="m59524,481203r-304,-8611l59143,472059r-952,-7087l56311,458190r-2883,-6032l47332,446062r,25997l47332,490347r-1524,7620l42672,502539r-3048,4572l36576,508635r-12192,l19812,507111r-3048,-4572l13716,496443r-1524,-6096l12192,472059r1524,-7709l19812,455206r2286,-1524l24384,452158r12192,l39624,455206r3048,4572l45808,464350r127,622l47332,472059r,-25997l41148,443014r-16764,l19812,446062r-3048,1524l13716,450634r-1524,3048l12192,444538,,444538,,545312r12192,l12192,508635r1524,3048l16764,514731r6096,3048l27432,519303r13716,l58293,496443r927,-6668l59524,481203xem137350,444538r-12192,l125158,493395r-1524,6096l120586,502539r-3048,4572l112966,508635r-10668,l99250,507111r-3048,-3048l94678,501015r-1524,-4572l93154,444538r-12294,l80860,490347r,9144l82384,507111r4572,4572l90004,516255r6198,3048l108394,519303r4572,-1524l116014,516255r4572,-3048l122110,510159r3048,-3048l125158,517779r12192,l137350,444538xem704646,l677214,r,115824l704646,115824,704646,xe" fillcolor="#343833" stroked="f">
                   <v:path arrowok="t"/>
-                  <v:fill type="solid"/>
                 </v:shape>
-                <v:shape style="position:absolute;left:1434;top:14905;width:212;height:164" type="#_x0000_t75" id="docshape125" stroked="false">
-                  <v:imagedata r:id="rId71" o:title=""/>
+                <v:shape id="Image 125" o:spid="_x0000_s1033" type="#_x0000_t75" style="position:absolute;left:3550;top:10722;width:1344;height:1037;visibility:visible;mso-wrap-style:square" o:gfxdata="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">
+                  <v:imagedata r:id="rId143" o:title=""/>
                 </v:shape>
-                <v:shape style="position:absolute;left:1684;top:14905;width:1737;height:207" id="docshape126" coordorigin="1685,14906" coordsize="1737,207" path="m1743,14906l1723,14906,1723,14930,1743,14930,1743,14906xm1779,15052l1743,15052,1743,14951,1694,14951,1694,14966,1723,14966,1723,15052,1685,15052,1685,15067,1779,15067,1779,15052xm1904,14956l1899,14954,1892,14951,1887,14951,1882,14949,1870,14949,1858,14950,1847,14952,1837,14957,1829,14963,1823,14973,1818,14983,1816,14995,1815,15009,1816,15023,1818,15034,1823,15044,1829,15052,1837,15060,1847,15065,1858,15068,1870,15069,1882,15069,1887,15067,1894,15064,1899,15064,1904,15059,1904,15040,1899,15045,1884,15052,1860,15052,1851,15050,1844,15043,1836,15033,1834,15023,1834,14995,1836,14982,1851,14968,1860,14963,1877,14963,1882,14966,1889,14968,1894,14968,1904,14978,1904,14956xm2154,15023l2151,15016,2142,15007,2135,15004,2125,15002,2118,14999,2106,14997,2096,14995,2091,14990,2089,14985,2089,14975,2091,14970,2096,14968,2099,14966,2106,14963,2120,14963,2125,14966,2132,14966,2147,14973,2147,14963,2147,14956,2137,14951,2130,14949,2099,14949,2089,14951,2082,14956,2074,14963,2070,14973,2070,14992,2072,14999,2082,15009,2101,15014,2108,15016,2125,15019,2135,15026,2135,15040,2132,15045,2127,15047,2123,15052,2096,15052,2089,15050,2084,15050,2077,15045,2070,15043,2070,15062,2084,15067,2089,15067,2096,15069,2123,15069,2132,15067,2142,15059,2149,15052,2154,15045,2154,15023xm2281,14951l2238,14951,2238,14918,2219,14918,2219,14951,2187,14951,2187,14966,2219,14966,2219,15043,2221,15052,2233,15064,2243,15067,2281,15067,2281,15050,2245,15050,2243,15045,2238,15043,2238,14966,2281,14966,2281,14951xm2409,14978l2404,14968,2401,14966,2401,14963,2399,14958,2392,14956,2387,14951,2380,14949,2349,14949,2344,14951,2337,14951,2322,14956,2322,14975,2329,14970,2337,14968,2341,14968,2356,14963,2373,14963,2380,14966,2385,14970,2387,14975,2389,14982,2389,14995,2389,15009,2389,15026,2387,15035,2382,15043,2375,15050,2368,15052,2344,15052,2339,15047,2334,15038,2334,15023,2337,15019,2346,15009,2389,15009,2389,14995,2349,14995,2337,14997,2327,15004,2320,15009,2315,15021,2315,15043,2317,15052,2332,15067,2341,15069,2361,15069,2370,15067,2375,15064,2382,15062,2387,15055,2388,15052,2389,15050,2389,15067,2409,15067,2409,15050,2409,15009,2409,14978xm2534,14951l2490,14951,2490,14918,2471,14918,2471,14951,2440,14951,2440,14966,2471,14966,2471,15043,2474,15052,2481,15057,2486,15062,2495,15064,2534,15064,2534,15050,2498,15050,2495,15045,2493,15043,2490,15036,2490,14966,2534,14966,2534,14951xm2630,14906l2611,14906,2611,14930,2630,14930,2630,14906xm2666,15052l2630,15052,2630,14951,2579,14951,2579,14966,2611,14966,2611,15052,2572,15052,2572,15067,2666,15067,2666,15052xm2789,14956l2779,14951,2774,14951,2769,14949,2757,14949,2745,14950,2734,14952,2725,14957,2717,14963,2710,14973,2705,14983,2701,14995,2700,15009,2701,15023,2705,15034,2710,15044,2717,15052,2725,15060,2734,15065,2745,15068,2757,15069,2769,15069,2779,15064,2784,15064,2789,15059,2789,15040,2786,15045,2781,15047,2774,15050,2769,15052,2745,15052,2736,15050,2731,15043,2724,15033,2721,15023,2721,14995,2724,14982,2731,14975,2736,14968,2745,14963,2765,14963,2774,14968,2779,14968,2789,14978,2789,14956xm3041,15050l3012,15050,3008,15047,3005,15043,3003,15040,3000,15033,3000,15023,3000,14906,2950,14906,2950,14920,2981,14920,2981,15038,2983,15047,2991,15055,2996,15062,3005,15067,3041,15067,3041,15050xm3173,15009l3173,14995,3172,14995,3170,14982,3166,14972,3161,14963,3154,14956,3154,14995,3154,15023,3152,15035,3147,15043,3142,15050,3135,15052,3116,15052,3108,15050,3104,15043,3096,15035,3096,15035,3094,15023,3094,14995,3096,14982,3104,14975,3108,14968,3116,14963,3135,14963,3142,14968,3147,14975,3152,14982,3152,14983,3154,14995,3154,14956,3152,14954,3140,14949,3125,14949,3114,14950,3103,14952,3095,14957,3087,14963,3082,14973,3078,14983,3076,14995,3075,15009,3076,15023,3076,15023,3078,15035,3082,15045,3087,15055,3095,15061,3103,15065,3114,15068,3125,15069,3140,15069,3152,15064,3161,15055,3163,15052,3166,15045,3170,15035,3173,15023,3173,15009xm3296,14980l3294,14968,3286,14961,3282,14951,3272,14949,3246,14949,3241,14954,3234,14956,3231,14961,3226,14968,3226,14951,3207,14951,3207,15067,3226,15067,3226,14990,3229,14980,3234,14973,3238,14968,3246,14966,3262,14966,3267,14968,3272,14973,3274,14978,3277,14985,3277,15067,3296,15067,3296,14995,3296,14980xm3421,14951l3402,14951,3402,14966,3402,15021,3399,15033,3390,15047,3385,15052,3366,15052,3358,15047,3349,15033,3346,15021,3347,14994,3349,14982,3358,14968,3366,14963,3385,14963,3390,14968,3399,14982,3400,14983,3402,14994,3402,15021,3402,14966,3401,14963,3399,14961,3395,14956,3390,14954,3385,14949,3358,14949,3346,14954,3339,14963,3334,14973,3331,14983,3328,14994,3327,15007,3328,15020,3328,15021,3331,15032,3334,15042,3339,15050,3346,15062,3358,15067,3378,15067,3385,15064,3395,15059,3399,15055,3400,15052,3402,15047,3402,15074,3399,15083,3395,15088,3390,15093,3383,15096,3363,15096,3358,15093,3354,15093,3346,15091,3339,15086,3339,15105,3346,15108,3351,15110,3363,15110,3368,15112,3390,15112,3402,15108,3409,15098,3411,15096,3414,15090,3418,15081,3420,15071,3421,15062,3421,15047,3421,14966,3421,14951xe" filled="true" fillcolor="#343833" stroked="false">
+                <v:shape id="Graphic 126" o:spid="_x0000_s1034" style="position:absolute;left:5137;top:10722;width:11030;height:1314;visibility:visible;mso-wrap-style:square;v-text-anchor:top" coordsize="1102995,131445" o:gfxdata="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" path="m36677,l24485,r,15240l36677,15240,36677,xem59537,93052r-22860,l36677,28956r-30581,l6096,38100r18389,l24485,93052,,93052r,9144l59537,102196r,-9144xem138976,32004r-3048,-1524l131356,28956r-3048,l125260,27432r-7620,l109893,28003,83070,57010r-571,8610l83070,74193r26823,28943l117640,103720r7620,l128308,102196r4572,-1524l135928,100672r3048,-3048l138976,85432r-3048,3048l126784,93052r-15240,l105359,91528r-4572,-4572l96215,80860,94691,74764r,-18288l96215,48768r9144,-9144l111544,36576r10668,l125260,38100r4572,1524l132880,39624r6096,6096l138976,32004xem297764,74764r-1524,-4572l290144,64096r-4572,-1524l279476,61048r-4572,-1524l267284,58000r-6096,-1524l258140,53428r-1524,-3136l256616,44196r1524,-3048l261188,39624r1524,-1524l267284,36576r9144,l279476,38100r4572,l293192,42672r,-6096l293192,32004r-6096,-3048l282524,27432r-19812,l256616,28956r-4674,3048l247370,36576r-3048,6096l244322,54952r1524,4572l251942,65620r12294,3048l268808,70192r10668,1524l285572,76288r,9144l284048,88480r-3048,1524l277952,93052r-16764,l256616,91528r-3150,l248894,88480r-4572,-1524l244322,99148r9144,3048l256616,102196r4572,1524l277952,103720r6096,-1524l290144,97624r4572,-4572l297764,88480r,-13716xem378714,28956r-27432,l351282,7620r-12281,l339001,28956r-19812,l319189,38100r19812,l339001,86956r1524,6096l348145,100672r6185,1524l378714,102196r,-10668l355854,91528r-1524,-3048l351282,86956r,-48856l378714,38100r,-9144xem459676,45720r-3048,-6096l455104,38100r-508,-1524l453580,33528r-4572,-1524l445871,28956r-4572,-1524l421487,27432r-3048,1524l413867,28956r-9144,3048l404723,44196r4572,-3048l413867,39624r3048,l426059,36576r10668,l441299,38100r3048,3048l445871,44196r1613,4572l447484,56476r,9144l447484,76288r-1613,6096l442823,86956r-4572,4572l433679,93052r-15240,l415391,90004r-3048,-6096l412343,74764r1524,-3048l419963,65620r27521,l447484,56476r-25997,l413867,58000r-6096,4572l403199,65620r-3048,7620l400151,86956r1524,6096l410819,102196r6096,1524l429107,103720r6096,-1524l438251,100672r4572,-1524l445871,94576r813,-1524l447484,91528r,10668l459676,102196r,-10668l459676,65620r,-19900xem539026,29044r-27432,l511594,7620r-12192,l499402,29044r-19914,l479488,38188r19914,l499402,87058r1524,6096l505498,96202r3048,3048l514642,100774r24384,l539026,91630r-22860,l514642,88582r-1524,-1524l511594,82486r,-44298l539026,38188r,-9144xem600176,l587895,r,15240l600176,15240,600176,xem623036,93052r-22860,l600176,28956r-32093,l568083,38100r19812,l587895,93052r-24384,l563511,102196r59525,l623036,93052xem700951,32004r-6096,-3048l691807,28956r-3048,-1524l681050,27432r-7696,571l645274,57010r-800,8610l645274,74193r28080,28943l681050,103720r7709,l694855,100672r3048,l700951,97624r,-12192l699427,88480r-3048,1524l691807,91528r-3048,1524l673430,93052r-6096,-1524l664286,86956r-4572,-6096l658190,74764r,-18288l659714,48768r4572,-4572l667334,39624r6096,-3048l685622,36576r6185,3048l694855,39624r6096,6096l700951,32004xem861263,91528r-18288,l839927,90004r-1524,-3048l836879,85432r-1524,-4572l835355,74764,835355,,803249,r,9144l823061,9144r,74764l824585,90004r4572,4572l832307,99148r6096,3048l861263,102196r,-10668xem945273,65620l933081,32004r,24472l933081,74764r-1524,7620l928509,86956r-3149,4572l920788,93052r-12192,l904024,91528r-3048,-4572l896404,82384r-115,-571l894880,74764r,-18288l896404,48768r4572,-4572l904024,39624r4572,-3048l920788,36576r4572,3048l928509,44196r3048,4572l931672,49390r1409,7086l933081,32004r-1524,-1524l923836,27432r-9144,l883234,57010r-546,8610l883234,74218r114,546l884783,81813r29909,21907l923836,103720r7721,-3048l937653,94576r788,-1524l940765,88557r2413,-6744l944714,74218r559,-8598xem1023086,47244r-1524,-7620l1016990,35052r-3048,-6096l1007846,27432r-16764,l988034,30480r-4572,1524l981938,35052r-3048,4572l978890,28956r-12293,l966597,102196r12293,l978890,53428r1524,-6184l983462,42672r3048,-3048l991082,38100r10668,l1004798,39624r3048,3048l1009370,45720r1524,4572l1010894,102196r12192,l1023086,56476r,-9232xem1102525,28956r-12192,l1090333,38100r,35140l1088809,80860r-6096,9144l1079665,93052r-12294,l1062799,90004r-6096,-9144l1055179,73240r25,-16865l1056703,48768r6096,-9144l1067371,36576r12294,l1090333,73240r,-35140l1089571,36576r-762,-1524l1085761,32004r-3048,-1524l1079665,27432r-16866,l1042987,64096r559,8573l1043660,73240r1423,6858l1047496,86385r3111,5143l1055179,99148r7620,3048l1075093,102196r4572,-1524l1085761,97624r3048,-3048l1089317,93052r1016,-3048l1090333,106768r-1524,6096l1085761,115912r-3048,3150l1078141,120586r-12294,l1062799,119062r-3048,l1055179,117538r-4572,-3150l1050607,126682r4572,1524l1058227,129730r7620,l1068895,131254r13818,l1102525,90004r,-51904l1102525,28956xe" fillcolor="#343833" stroked="f">
                   <v:path arrowok="t"/>
-                  <v:fill type="solid"/>
                 </v:shape>
-                <v:shape style="position:absolute;left:3591;top:14912;width:212;height:157" type="#_x0000_t75" id="docshape127" stroked="false">
-                  <v:imagedata r:id="rId72" o:title=""/>
+                <v:shape id="Image 127" o:spid="_x0000_s1035" type="#_x0000_t75" style="position:absolute;left:17247;top:10768;width:1343;height:991;visibility:visible;mso-wrap-style:square" o:gfxdata="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">
+                  <v:imagedata r:id="rId144" o:title=""/>
                 </v:shape>
-                <v:shape style="position:absolute;left:3841;top:14917;width:344;height:152" id="docshape128" coordorigin="3842,14918" coordsize="344,152" path="m3931,14956l3924,14954,3919,14951,3914,14951,3909,14949,3897,14949,3885,14950,3874,14952,3864,14957,3856,14963,3850,14973,3846,14983,3843,14995,3842,15009,3843,15023,3846,15034,3850,15044,3856,15052,3864,15060,3874,15065,3885,15068,3897,15069,3909,15069,3919,15064,3926,15064,3931,15059,3931,15040,3926,15045,3916,15050,3909,15052,3885,15052,3878,15050,3871,15043,3864,15033,3861,15023,3861,14995,3864,14982,3878,14968,3885,14963,3904,14963,3914,14968,3921,14968,3931,14978,3931,14956xm4053,14951l4010,14951,4010,14918,3991,14918,3991,14951,3962,14951,3962,14966,3991,14966,3991,15043,3996,15052,4001,15057,4005,15064,4017,15067,4053,15067,4053,15050,4020,15050,4013,15043,4010,15038,4010,14966,4053,14966,4053,14951xm4186,15009l4185,14995,4185,14995,4183,14982,4180,14972,4174,14963,4167,14954,4167,14995,4167,15023,4164,15035,4155,15050,4147,15052,4128,15052,4121,15050,4111,15035,4111,15035,4109,15023,4109,14995,4111,14982,4121,14968,4128,14963,4147,14963,4155,14968,4164,14982,4164,14983,4167,14995,4167,14954,4155,14949,4121,14949,4109,14954,4102,14963,4096,14973,4092,14983,4090,14995,4090,15009,4090,15023,4090,15023,4092,15035,4096,15045,4102,15055,4109,15064,4121,15069,4155,15069,4167,15064,4174,15055,4175,15052,4180,15045,4183,15035,4185,15023,4186,15009xe" filled="true" fillcolor="#343833" stroked="false">
+                <v:shape id="Graphic 128" o:spid="_x0000_s1036" style="position:absolute;left:18835;top:10798;width:2185;height:965;visibility:visible;mso-wrap-style:square;v-text-anchor:top" coordsize="218440,96520" o:gfxdata="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" path="m56476,24384l51904,22860,48856,21336r-3048,l42760,19812r-7708,l2286,41770,,58000r571,8573l27355,95516r7697,584l42760,96100r6096,-3048l53428,93052r3048,-3048l56476,77812r-3048,3048l47332,83908r-4572,1524l27432,85432,22860,83908,18288,79336,13716,73240,12192,67144r,-18288l13716,41148r9144,-9144l27432,28956r12192,l45808,32004r4572,l56476,38100r,-13716xem134302,21336r-27432,l106870,,94678,r,21336l76301,21336r,9144l94678,30480r,48856l97726,85432r3048,3048l103822,93052r7620,1524l134302,94576r,-10668l112966,83908r-4572,-4572l106870,76288r,-45808l134302,30480r,-9144xem218313,58000l206121,22860r,25996l206121,67144r-1524,7620l198501,83908r-4572,1524l181648,85432r-4572,-1524l170980,74764r-115,-571l169456,67144r,-18288l170980,41148r6096,-9144l181648,28956r12281,l198501,32004r6096,9144l204724,41770r1397,7086l206121,22860r-7620,-3048l177076,19812,157264,58000r330,8598l157683,67144r1105,7049l161112,80937r3772,6019l169456,93052r7620,3048l198501,96100,217982,66598r331,-8598xe" fillcolor="#343833" stroked="f">
                   <v:path arrowok="t"/>
-                  <v:fill type="solid"/>
                 </v:shape>
-                <v:shape style="position:absolute;left:4238;top:14905;width:325;height:164" type="#_x0000_t75" id="docshape129" stroked="false">
-                  <v:imagedata r:id="rId73" o:title=""/>
+                <v:shape id="Image 129" o:spid="_x0000_s1037" type="#_x0000_t75" style="position:absolute;left:21355;top:10722;width:2061;height:1037;visibility:visible;mso-wrap-style:square" o:gfxdata="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">
+                  <v:imagedata r:id="rId145" o:title=""/>
                 </v:shape>
-                <v:shape style="position:absolute;left:4597;top:14905;width:852;height:188" id="docshape130" coordorigin="4597,14906" coordsize="852,188" path="m4688,15050l4659,15050,4655,15047,4652,15043,4647,15040,4647,15023,4647,14906,4597,14906,4597,14920,4628,14920,4628,15038,4631,15047,4638,15055,4643,15062,4652,15067,4688,15067,4688,15050xm4799,14906l4782,14906,4775,14918,4758,14954,4755,14966,4753,14977,4751,14988,4751,14999,4751,15012,4753,15023,4755,15034,4758,15045,4769,15070,4775,15082,4782,15093,4799,15093,4792,15082,4786,15070,4781,15059,4777,15047,4775,15035,4773,15023,4773,15012,4773,14999,4773,14988,4774,14976,4777,14954,4781,14941,4786,14930,4792,14918,4799,14906xm4910,14906l4890,14906,4890,14930,4910,14930,4910,14906xm4946,15052l4910,15052,4910,14951,4862,14951,4862,14966,4890,14966,4890,15052,4852,15052,4852,15067,4946,15067,4946,15052xm5068,14980l5066,14968,5061,14961,5054,14951,5047,14949,5020,14949,5013,14954,5008,14956,5003,14961,5001,14968,5001,14951,4982,14951,4982,15067,5001,15067,5001,14990,5003,14980,5008,14973,5013,14968,5018,14966,5035,14966,5042,14968,5044,14973,5049,14978,5049,15067,5068,15067,5068,14995,5068,14980xm5193,14951l5150,14951,5150,14918,5131,14918,5131,14951,5102,14951,5102,14966,5131,14966,5131,15043,5136,15052,5140,15057,5145,15064,5157,15067,5193,15067,5193,15050,5160,15050,5152,15043,5150,15038,5150,14966,5193,14966,5193,14951xm5448,14980l5446,14968,5441,14961,5434,14951,5427,14949,5400,14949,5393,14954,5388,14956,5383,14961,5381,14968,5381,14951,5362,14951,5362,15067,5381,15067,5381,14990,5383,14980,5388,14973,5393,14968,5398,14966,5415,14966,5422,14968,5424,14973,5429,14978,5429,15067,5448,15067,5448,14995,5448,14980xe" filled="true" fillcolor="#343833" stroked="false">
+                <v:shape id="Graphic 130" o:spid="_x0000_s1038" style="position:absolute;left:23630;top:10722;width:5410;height:1194;visibility:visible;mso-wrap-style:square;v-text-anchor:top" coordsize="541020,119380" o:gfxdata="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" path="m58000,91528r-18376,l36576,90004,35052,86956,32004,85432r,-10668l32004,,,,,9144r19812,l19812,83908r1524,6096l25908,94576r3048,4572l35052,102196r22948,l58000,91528xem128206,l117538,r-4305,7975l98869,45542,97726,59524r279,7747l109347,104305r8191,14757l128206,119062r-4293,-7150l120205,104495,111493,67297r-51,-7773l111709,52374,123913,7759,128206,xem198501,l186309,r,15240l198501,15240,198501,xem221361,93052r-22860,l198501,28956r-30569,l167932,38100r18377,l186309,93052r-24473,l161836,102196r59525,l221361,93052xem299275,47244r-1524,-7620l294703,35052r-4572,-6096l285559,27432r-16853,l264134,30480r-3048,1524l258038,35052r-1524,4572l256514,28956r-12192,l244322,102196r12192,l256514,53428r1524,-6184l261086,42672r3048,-3048l267182,38100r10668,l282422,39624r1613,3048l287083,45720r,56476l299275,102196r,-45720l299275,47244xem378612,28956r-27432,l351180,7620r-12192,l338988,28956r-18377,l320611,38100r18377,l338988,86956r3048,6096l345084,96100r3048,4572l355752,102196r22860,l378612,91528r-21336,l352704,86956r-1524,-3048l351180,38100r27432,l378612,28956xem540550,47244r-1524,-7620l535978,35052r-4572,-6096l526834,27432r-16866,l505396,30480r-3048,1524l499300,35052r-1524,4572l497776,28956r-12192,l485584,102196r12192,l497776,53428r1524,-6184l502348,42672r3048,-3048l508444,38100r10668,l523684,39624r1626,3048l528358,45720r,56476l540550,102196r,-45720l540550,47244xe" fillcolor="#343833" stroked="f">
                   <v:path arrowok="t"/>
-                  <v:fill type="solid"/>
                 </v:shape>
-                <v:shape style="position:absolute;left:5486;top:14948;width:349;height:121" type="#_x0000_t75" id="docshape131" stroked="false">
-                  <v:imagedata r:id="rId74" o:title=""/>
+                <v:shape id="Image 131" o:spid="_x0000_s1039" type="#_x0000_t75" style="position:absolute;left:29279;top:10996;width:2215;height:763;visibility:visible;mso-wrap-style:square" o:gfxdata="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">
+                  <v:imagedata r:id="rId146" o:title=""/>
                 </v:shape>
-                <v:shape style="position:absolute;left:5883;top:14948;width:205;height:121" type="#_x0000_t75" id="docshape132" stroked="false">
-                  <v:imagedata r:id="rId75" o:title=""/>
+                <v:shape id="Image 132" o:spid="_x0000_s1040" type="#_x0000_t75" style="position:absolute;left:31800;top:10996;width:1297;height:763;visibility:visible;mso-wrap-style:square" o:gfxdata="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">
+                  <v:imagedata r:id="rId147" o:title=""/>
                 </v:shape>
-                <v:shape style="position:absolute;left:6136;top:14905;width:49;height:188" id="docshape133" coordorigin="6136,14906" coordsize="49,188" path="m6153,15093l6136,15093,6143,15082,6149,15070,6164,15012,6165,14999,6164,14988,6149,14930,6136,14906,6153,14906,6180,14966,6184,14999,6184,15012,6167,15070,6160,15082,6153,15093xe" filled="true" fillcolor="#343833" stroked="false">
+                <v:shape id="Graphic 133" o:spid="_x0000_s1041" style="position:absolute;left:33403;top:10722;width:311;height:1194;visibility:visible;mso-wrap-style:square;v-text-anchor:top" coordsize="31115,119380" o:gfxdata="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" path="m10668,119062l,119062r4286,-7151l8001,104501,18002,67294r286,-7763l18002,52380,8001,15240,,,10668,,27963,38220r2612,21311l30288,67294,19430,104501r-4238,7410l10668,119062xe" fillcolor="#343833" stroked="f">
                   <v:path arrowok="t"/>
-                  <v:fill type="solid"/>
                 </v:shape>
-                <w10:wrap type="none"/>
+                <w10:wrap anchorx="page" anchory="page"/>
               </v:group>
             </w:pict>
           </mc:Fallback>
@@ -17096,38 +17083,42 @@
       <w:r>
         <w:rPr>
           <w:rFonts w:ascii="Times New Roman"/>
+          <w:noProof/>
           <w:position w:val="-4"/>
           <w:sz w:val="20"/>
+          <w:lang w:val="es-ES" w:eastAsia="es-ES"/>
         </w:rPr>
         <mc:AlternateContent>
-          <mc:Choice Requires="wps">
+          <mc:Choice Requires="wpg">
             <w:drawing>
               <wp:inline distT="0" distB="0" distL="0" distR="0">
                 <wp:extent cx="542290" cy="147955"/>
                 <wp:effectExtent l="0" t="0" r="0" b="4444"/>
                 <wp:docPr id="134" name="Group 134"/>
                 <wp:cNvGraphicFramePr>
-                  <a:graphicFrameLocks/>
+                  <a:graphicFrameLocks xmlns:a="http://schemas.openxmlformats.org/drawingml/2006/main"/>
                 </wp:cNvGraphicFramePr>
-                <a:graphic>
+                <a:graphic xmlns:a="http://schemas.openxmlformats.org/drawingml/2006/main">
                   <a:graphicData uri="http://schemas.microsoft.com/office/word/2010/wordprocessingGroup">
                     <wpg:wgp>
-                      <wpg:cNvPr id="134" name="Group 134"/>
-                      <wpg:cNvGrpSpPr/>
+                      <wpg:cNvGrpSpPr>
+                        <a:grpSpLocks/>
+                      </wpg:cNvGrpSpPr>
                       <wpg:grpSpPr>
                         <a:xfrm>
                           <a:off x="0" y="0"/>
                           <a:ext cx="542290" cy="147955"/>
+                          <a:chOff x="0" y="0"/>
                           <a:chExt cx="542290" cy="147955"/>
                         </a:xfrm>
                       </wpg:grpSpPr>
-                      <pic:pic>
+                      <pic:pic xmlns:pic="http://schemas.openxmlformats.org/drawingml/2006/picture">
                         <pic:nvPicPr>
                           <pic:cNvPr id="135" name="Image 135"/>
                           <pic:cNvPicPr/>
                         </pic:nvPicPr>
                         <pic:blipFill>
-                          <a:blip r:embed="rId76" cstate="print"/>
+                          <a:blip r:embed="rId148" cstate="print"/>
                           <a:stretch>
                             <a:fillRect/>
                           </a:stretch>
@@ -17188,13 +17179,13 @@
                           <a:noAutofit/>
                         </wps:bodyPr>
                       </wps:wsp>
-                      <pic:pic>
+                      <pic:pic xmlns:pic="http://schemas.openxmlformats.org/drawingml/2006/picture">
                         <pic:nvPicPr>
                           <pic:cNvPr id="137" name="Image 137"/>
                           <pic:cNvPicPr/>
                         </pic:nvPicPr>
                         <pic:blipFill>
-                          <a:blip r:embed="rId77" cstate="print"/>
+                          <a:blip r:embed="rId149" cstate="print"/>
                           <a:stretch>
                             <a:fillRect/>
                           </a:stretch>
@@ -17209,13 +17200,13 @@
                           </a:prstGeom>
                         </pic:spPr>
                       </pic:pic>
-                      <pic:pic>
+                      <pic:pic xmlns:pic="http://schemas.openxmlformats.org/drawingml/2006/picture">
                         <pic:nvPicPr>
                           <pic:cNvPr id="138" name="Image 138"/>
                           <pic:cNvPicPr/>
                         </pic:nvPicPr>
                         <pic:blipFill>
-                          <a:blip r:embed="rId78" cstate="print"/>
+                          <a:blip r:embed="rId150" cstate="print"/>
                           <a:stretch>
                             <a:fillRect/>
                           </a:stretch>
@@ -17238,19 +17229,20 @@
           </mc:Choice>
           <mc:Fallback>
             <w:pict>
-              <v:group style="width:42.7pt;height:11.65pt;mso-position-horizontal-relative:char;mso-position-vertical-relative:line" id="docshapegroup134" coordorigin="0,0" coordsize="854,233">
-                <v:shape style="position:absolute;left:0;top:6;width:186;height:226" type="#_x0000_t75" id="docshape135" stroked="false">
-                  <v:imagedata r:id="rId76" o:title=""/>
+              <v:group w14:anchorId="66D919E2" id="Group 134" o:spid="_x0000_s1026" style="width:42.7pt;height:11.65pt;mso-position-horizontal-relative:char;mso-position-vertical-relative:line" coordsize="5422,1479" o:gfxdata="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">
+                <v:shape id="Image 135" o:spid="_x0000_s1027" type="#_x0000_t75" style="position:absolute;top:39;width:1175;height:1434;visibility:visible;mso-wrap-style:square" o:gfxdata="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">
+                  <v:imagedata r:id="rId151" o:title=""/>
                 </v:shape>
-                <v:rect style="position:absolute;left:229;top:0;width:53;height:228" id="docshape136" filled="true" fillcolor="#2b4456" stroked="false">
-                  <v:fill type="solid"/>
-                </v:rect>
-                <v:shape style="position:absolute;left:319;top:58;width:166;height:174" type="#_x0000_t75" id="docshape137" stroked="false">
-                  <v:imagedata r:id="rId77" o:title=""/>
+                <v:shape id="Graphic 136" o:spid="_x0000_s1028" style="position:absolute;left:1457;width:336;height:1447;visibility:visible;mso-wrap-style:square;v-text-anchor:top" coordsize="33655,144780" o:gfxdata="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" path="m33527,144780l,144780,,,33527,r,144780xe" fillcolor="#2b4456" stroked="f">
+                  <v:path arrowok="t"/>
                 </v:shape>
-                <v:shape style="position:absolute;left:526;top:58;width:327;height:174" type="#_x0000_t75" id="docshape138" stroked="false">
-                  <v:imagedata r:id="rId78" o:title=""/>
+                <v:shape id="Image 137" o:spid="_x0000_s1029" type="#_x0000_t75" style="position:absolute;left:2030;top:374;width:1054;height:1099;visibility:visible;mso-wrap-style:square" o:gfxdata="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">
+                  <v:imagedata r:id="rId152" o:title=""/>
                 </v:shape>
+                <v:shape id="Image 138" o:spid="_x0000_s1030" type="#_x0000_t75" style="position:absolute;left:3344;top:374;width:2076;height:1099;visibility:visible;mso-wrap-style:square" o:gfxdata="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">
+                  <v:imagedata r:id="rId153" o:title=""/>
+                </v:shape>
+                <w10:anchorlock/>
               </v:group>
             </w:pict>
           </mc:Fallback>
@@ -17259,55 +17251,52 @@
       <w:r>
         <w:rPr>
           <w:rFonts w:ascii="Times New Roman"/>
+          <w:spacing w:val="85"/>
           <w:position w:val="-4"/>
           <w:sz w:val="20"/>
         </w:rPr>
+        <w:t xml:space="preserve"> </w:t>
       </w:r>
       <w:r>
         <w:rPr>
           <w:rFonts w:ascii="Times New Roman"/>
+          <w:noProof/>
           <w:spacing w:val="85"/>
           <w:position w:val="-4"/>
           <w:sz w:val="20"/>
-        </w:rPr>
-        <w:t> </w:t>
-      </w:r>
-      <w:r>
-        <w:rPr>
-          <w:rFonts w:ascii="Times New Roman"/>
-          <w:spacing w:val="85"/>
-          <w:position w:val="-4"/>
-          <w:sz w:val="20"/>
+          <w:lang w:val="es-ES" w:eastAsia="es-ES"/>
         </w:rPr>
         <mc:AlternateContent>
-          <mc:Choice Requires="wps">
+          <mc:Choice Requires="wpg">
             <w:drawing>
               <wp:inline distT="0" distB="0" distL="0" distR="0">
                 <wp:extent cx="902335" cy="148590"/>
                 <wp:effectExtent l="0" t="0" r="0" b="3810"/>
                 <wp:docPr id="139" name="Group 139"/>
                 <wp:cNvGraphicFramePr>
-                  <a:graphicFrameLocks/>
+                  <a:graphicFrameLocks xmlns:a="http://schemas.openxmlformats.org/drawingml/2006/main"/>
                 </wp:cNvGraphicFramePr>
-                <a:graphic>
+                <a:graphic xmlns:a="http://schemas.openxmlformats.org/drawingml/2006/main">
                   <a:graphicData uri="http://schemas.microsoft.com/office/word/2010/wordprocessingGroup">
                     <wpg:wgp>
-                      <wpg:cNvPr id="139" name="Group 139"/>
-                      <wpg:cNvGrpSpPr/>
+                      <wpg:cNvGrpSpPr>
+                        <a:grpSpLocks/>
+                      </wpg:cNvGrpSpPr>
                       <wpg:grpSpPr>
                         <a:xfrm>
                           <a:off x="0" y="0"/>
                           <a:ext cx="902335" cy="148590"/>
+                          <a:chOff x="0" y="0"/>
                           <a:chExt cx="902335" cy="148590"/>
                         </a:xfrm>
                       </wpg:grpSpPr>
-                      <pic:pic>
+                      <pic:pic xmlns:pic="http://schemas.openxmlformats.org/drawingml/2006/picture">
                         <pic:nvPicPr>
                           <pic:cNvPr id="140" name="Image 140"/>
                           <pic:cNvPicPr/>
                         </pic:nvPicPr>
                         <pic:blipFill>
-                          <a:blip r:embed="rId79" cstate="print"/>
+                          <a:blip r:embed="rId154" cstate="print"/>
                           <a:stretch>
                             <a:fillRect/>
                           </a:stretch>
@@ -17322,13 +17311,13 @@
                           </a:prstGeom>
                         </pic:spPr>
                       </pic:pic>
-                      <pic:pic>
+                      <pic:pic xmlns:pic="http://schemas.openxmlformats.org/drawingml/2006/picture">
                         <pic:nvPicPr>
                           <pic:cNvPr id="141" name="Image 141"/>
                           <pic:cNvPicPr/>
                         </pic:nvPicPr>
                         <pic:blipFill>
-                          <a:blip r:embed="rId80" cstate="print"/>
+                          <a:blip r:embed="rId155" cstate="print"/>
                           <a:stretch>
                             <a:fillRect/>
                           </a:stretch>
@@ -17343,13 +17332,13 @@
                           </a:prstGeom>
                         </pic:spPr>
                       </pic:pic>
-                      <pic:pic>
+                      <pic:pic xmlns:pic="http://schemas.openxmlformats.org/drawingml/2006/picture">
                         <pic:nvPicPr>
                           <pic:cNvPr id="142" name="Image 142"/>
                           <pic:cNvPicPr/>
                         </pic:nvPicPr>
                         <pic:blipFill>
-                          <a:blip r:embed="rId81" cstate="print"/>
+                          <a:blip r:embed="rId156" cstate="print"/>
                           <a:stretch>
                             <a:fillRect/>
                           </a:stretch>
@@ -17364,13 +17353,13 @@
                           </a:prstGeom>
                         </pic:spPr>
                       </pic:pic>
-                      <pic:pic>
+                      <pic:pic xmlns:pic="http://schemas.openxmlformats.org/drawingml/2006/picture">
                         <pic:nvPicPr>
                           <pic:cNvPr id="143" name="Image 143"/>
                           <pic:cNvPicPr/>
                         </pic:nvPicPr>
                         <pic:blipFill>
-                          <a:blip r:embed="rId82" cstate="print"/>
+                          <a:blip r:embed="rId157" cstate="print"/>
                           <a:stretch>
                             <a:fillRect/>
                           </a:stretch>
@@ -17439,39 +17428,34 @@
           </mc:Choice>
           <mc:Fallback>
             <w:pict>
-              <v:group style="width:71.05pt;height:11.7pt;mso-position-horizontal-relative:char;mso-position-vertical-relative:line" id="docshapegroup139" coordorigin="0,0" coordsize="1421,234">
-                <v:shape style="position:absolute;left:0;top:9;width:339;height:224" type="#_x0000_t75" id="docshape140" stroked="false">
-                  <v:imagedata r:id="rId79" o:title=""/>
+              <v:group w14:anchorId="6B6350A3" id="Group 139" o:spid="_x0000_s1026" style="width:71.05pt;height:11.7pt;mso-position-horizontal-relative:char;mso-position-vertical-relative:line" coordsize="9023,1485" o:gfxdata="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">
+                <v:shape id="Image 140" o:spid="_x0000_s1027" type="#_x0000_t75" style="position:absolute;top:60;width:2152;height:1420;visibility:visible;mso-wrap-style:square" o:gfxdata="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">
+                  <v:imagedata r:id="rId158" o:title=""/>
                 </v:shape>
-                <v:shape style="position:absolute;left:375;top:19;width:503;height:214" type="#_x0000_t75" id="docshape141" stroked="false">
-                  <v:imagedata r:id="rId80" o:title=""/>
+                <v:shape id="Image 141" o:spid="_x0000_s1028" type="#_x0000_t75" style="position:absolute;left:2382;top:121;width:3192;height:1359;visibility:visible;mso-wrap-style:square" o:gfxdata="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">
+                  <v:imagedata r:id="rId159" o:title=""/>
                 </v:shape>
-                <v:shape style="position:absolute;left:916;top:0;width:200;height:229" type="#_x0000_t75" id="docshape142" stroked="false">
-                  <v:imagedata r:id="rId81" o:title=""/>
+                <v:shape id="Image 142" o:spid="_x0000_s1029" type="#_x0000_t75" style="position:absolute;left:5817;width:1268;height:1449;visibility:visible;mso-wrap-style:square" o:gfxdata="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">
+                  <v:imagedata r:id="rId160" o:title=""/>
                 </v:shape>
-                <v:shape style="position:absolute;left:1154;top:60;width:166;height:174" type="#_x0000_t75" id="docshape143" stroked="false">
-                  <v:imagedata r:id="rId82" o:title=""/>
+                <v:shape id="Image 143" o:spid="_x0000_s1030" type="#_x0000_t75" style="position:absolute;left:7329;top:381;width:1053;height:1099;visibility:visible;mso-wrap-style:square" o:gfxdata="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">
+                  <v:imagedata r:id="rId161" o:title=""/>
                 </v:shape>
-                <v:rect style="position:absolute;left:1367;top:1;width:53;height:228" id="docshape144" filled="true" fillcolor="#2b4456" stroked="false">
-                  <v:fill type="solid"/>
-                </v:rect>
+                <v:shape id="Graphic 144" o:spid="_x0000_s1031" style="position:absolute;left:8683;top:6;width:337;height:1448;visibility:visible;mso-wrap-style:square;v-text-anchor:top" coordsize="33655,144780" o:gfxdata="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" path="m33528,144780l,144780,,,33528,r,144780xe" fillcolor="#2b4456" stroked="f">
+                  <v:path arrowok="t"/>
+                </v:shape>
+                <w10:anchorlock/>
               </v:group>
             </w:pict>
           </mc:Fallback>
         </mc:AlternateContent>
       </w:r>
-      <w:r>
-        <w:rPr>
-          <w:rFonts w:ascii="Times New Roman"/>
-          <w:spacing w:val="85"/>
-          <w:position w:val="-4"/>
-          <w:sz w:val="20"/>
-        </w:rPr>
-      </w:r>
+      <w:bookmarkStart w:id="0" w:name="_GoBack"/>
+      <w:bookmarkEnd w:id="0"/>
     </w:p>
     <w:p>
       <w:pPr>
-        <w:spacing w:line="240" w:lineRule="auto" w:before="12"/>
+        <w:spacing w:before="12"/>
         <w:rPr>
           <w:rFonts w:ascii="Times New Roman"/>
           <w:sz w:val="20"/>
@@ -17480,10 +17464,12 @@
       <w:r>
         <w:rPr>
           <w:rFonts w:ascii="Times New Roman"/>
+          <w:noProof/>
           <w:sz w:val="20"/>
+          <w:lang w:val="es-ES" w:eastAsia="es-ES"/>
         </w:rPr>
         <w:drawing>
-          <wp:anchor distT="0" distB="0" distL="0" distR="0" allowOverlap="1" layoutInCell="1" locked="0" behindDoc="1" simplePos="0" relativeHeight="487588864">
+          <wp:anchor distT="0" distB="0" distL="0" distR="0" simplePos="0" relativeHeight="487588864" behindDoc="1" locked="0" layoutInCell="1" allowOverlap="1">
             <wp:simplePos x="0" y="0"/>
             <wp:positionH relativeFrom="page">
               <wp:posOffset>553783</wp:posOffset>
@@ -17496,17 +17482,17 @@
             <wp:wrapTopAndBottom/>
             <wp:docPr id="145" name="Image 145"/>
             <wp:cNvGraphicFramePr>
-              <a:graphicFrameLocks/>
+              <a:graphicFrameLocks xmlns:a="http://schemas.openxmlformats.org/drawingml/2006/main"/>
             </wp:cNvGraphicFramePr>
-            <a:graphic>
+            <a:graphic xmlns:a="http://schemas.openxmlformats.org/drawingml/2006/main">
               <a:graphicData uri="http://schemas.openxmlformats.org/drawingml/2006/picture">
-                <pic:pic>
+                <pic:pic xmlns:pic="http://schemas.openxmlformats.org/drawingml/2006/picture">
                   <pic:nvPicPr>
                     <pic:cNvPr id="145" name="Image 145"/>
                     <pic:cNvPicPr/>
                   </pic:nvPicPr>
                   <pic:blipFill>
-                    <a:blip r:embed="rId83" cstate="print"/>
+                    <a:blip r:embed="rId162" cstate="print"/>
                     <a:stretch>
                       <a:fillRect/>
                     </a:stretch>
@@ -17529,12 +17515,14 @@
       <w:r>
         <w:rPr>
           <w:rFonts w:ascii="Times New Roman"/>
+          <w:noProof/>
           <w:sz w:val="20"/>
+          <w:lang w:val="es-ES" w:eastAsia="es-ES"/>
         </w:rPr>
         <mc:AlternateContent>
-          <mc:Choice Requires="wps">
+          <mc:Choice Requires="wpg">
             <w:drawing>
-              <wp:anchor distT="0" distB="0" distL="0" distR="0" allowOverlap="1" layoutInCell="1" locked="0" behindDoc="1" simplePos="0" relativeHeight="487589376">
+              <wp:anchor distT="0" distB="0" distL="0" distR="0" simplePos="0" relativeHeight="487589376" behindDoc="1" locked="0" layoutInCell="1" allowOverlap="1">
                 <wp:simplePos x="0" y="0"/>
                 <wp:positionH relativeFrom="page">
                   <wp:posOffset>564451</wp:posOffset>
@@ -17547,17 +17535,19 @@
                 <wp:wrapTopAndBottom/>
                 <wp:docPr id="146" name="Group 146"/>
                 <wp:cNvGraphicFramePr>
-                  <a:graphicFrameLocks/>
+                  <a:graphicFrameLocks xmlns:a="http://schemas.openxmlformats.org/drawingml/2006/main"/>
                 </wp:cNvGraphicFramePr>
-                <a:graphic>
+                <a:graphic xmlns:a="http://schemas.openxmlformats.org/drawingml/2006/main">
                   <a:graphicData uri="http://schemas.microsoft.com/office/word/2010/wordprocessingGroup">
                     <wpg:wgp>
-                      <wpg:cNvPr id="146" name="Group 146"/>
-                      <wpg:cNvGrpSpPr/>
+                      <wpg:cNvGrpSpPr>
+                        <a:grpSpLocks/>
+                      </wpg:cNvGrpSpPr>
                       <wpg:grpSpPr>
                         <a:xfrm>
                           <a:off x="0" y="0"/>
                           <a:ext cx="1751964" cy="317500"/>
+                          <a:chOff x="0" y="0"/>
                           <a:chExt cx="1751964" cy="317500"/>
                         </a:xfrm>
                       </wpg:grpSpPr>
@@ -18258,13 +18248,13 @@
                           <a:noAutofit/>
                         </wps:bodyPr>
                       </wps:wsp>
-                      <pic:pic>
+                      <pic:pic xmlns:pic="http://schemas.openxmlformats.org/drawingml/2006/picture">
                         <pic:nvPicPr>
                           <pic:cNvPr id="148" name="Image 148"/>
                           <pic:cNvPicPr/>
                         </pic:nvPicPr>
                         <pic:blipFill>
-                          <a:blip r:embed="rId84" cstate="print"/>
+                          <a:blip r:embed="rId163" cstate="print"/>
                           <a:stretch>
                             <a:fillRect/>
                           </a:stretch>
@@ -18279,13 +18269,13 @@
                           </a:prstGeom>
                         </pic:spPr>
                       </pic:pic>
-                      <pic:pic>
+                      <pic:pic xmlns:pic="http://schemas.openxmlformats.org/drawingml/2006/picture">
                         <pic:nvPicPr>
                           <pic:cNvPr id="149" name="Image 149"/>
                           <pic:cNvPicPr/>
                         </pic:nvPicPr>
                         <pic:blipFill>
-                          <a:blip r:embed="rId85" cstate="print"/>
+                          <a:blip r:embed="rId164" cstate="print"/>
                           <a:stretch>
                             <a:fillRect/>
                           </a:stretch>
@@ -18300,13 +18290,13 @@
                           </a:prstGeom>
                         </pic:spPr>
                       </pic:pic>
-                      <pic:pic>
+                      <pic:pic xmlns:pic="http://schemas.openxmlformats.org/drawingml/2006/picture">
                         <pic:nvPicPr>
                           <pic:cNvPr id="150" name="Image 150"/>
                           <pic:cNvPicPr/>
                         </pic:nvPicPr>
                         <pic:blipFill>
-                          <a:blip r:embed="rId86" cstate="print"/>
+                          <a:blip r:embed="rId165" cstate="print"/>
                           <a:stretch>
                             <a:fillRect/>
                           </a:stretch>
@@ -18321,13 +18311,13 @@
                           </a:prstGeom>
                         </pic:spPr>
                       </pic:pic>
-                      <pic:pic>
+                      <pic:pic xmlns:pic="http://schemas.openxmlformats.org/drawingml/2006/picture">
                         <pic:nvPicPr>
                           <pic:cNvPr id="151" name="Image 151"/>
                           <pic:cNvPicPr/>
                         </pic:nvPicPr>
                         <pic:blipFill>
-                          <a:blip r:embed="rId87" cstate="print"/>
+                          <a:blip r:embed="rId166" cstate="print"/>
                           <a:stretch>
                             <a:fillRect/>
                           </a:stretch>
@@ -18342,13 +18332,13 @@
                           </a:prstGeom>
                         </pic:spPr>
                       </pic:pic>
-                      <pic:pic>
+                      <pic:pic xmlns:pic="http://schemas.openxmlformats.org/drawingml/2006/picture">
                         <pic:nvPicPr>
                           <pic:cNvPr id="152" name="Image 152"/>
                           <pic:cNvPicPr/>
                         </pic:nvPicPr>
                         <pic:blipFill>
-                          <a:blip r:embed="rId88" cstate="print"/>
+                          <a:blip r:embed="rId167" cstate="print"/>
                           <a:stretch>
                             <a:fillRect/>
                           </a:stretch>
@@ -18601,13 +18591,13 @@
                           <a:noAutofit/>
                         </wps:bodyPr>
                       </wps:wsp>
-                      <pic:pic>
+                      <pic:pic xmlns:pic="http://schemas.openxmlformats.org/drawingml/2006/picture">
                         <pic:nvPicPr>
                           <pic:cNvPr id="154" name="Image 154"/>
                           <pic:cNvPicPr/>
                         </pic:nvPicPr>
                         <pic:blipFill>
-                          <a:blip r:embed="rId89" cstate="print"/>
+                          <a:blip r:embed="rId168" cstate="print"/>
                           <a:stretch>
                             <a:fillRect/>
                           </a:stretch>
@@ -18832,38 +18822,35 @@
           </mc:Choice>
           <mc:Fallback>
             <w:pict>
-              <v:group style="position:absolute;margin-left:44.445pt;margin-top:49.451477pt;width:137.950pt;height:25pt;mso-position-horizontal-relative:page;mso-position-vertical-relative:paragraph;z-index:-15727104;mso-wrap-distance-left:0;mso-wrap-distance-right:0" id="docshapegroup145" coordorigin="889,989" coordsize="2759,500">
-                <v:shape style="position:absolute;left:1780;top:1001;width:594;height:164" id="docshape146" coordorigin="1781,1001" coordsize="594,164" path="m1870,1052l1855,1044,1851,1044,1843,1042,1839,1042,1827,1043,1816,1047,1806,1052,1798,1059,1790,1068,1785,1079,1782,1091,1781,1105,1782,1117,1786,1129,1791,1139,1798,1148,1806,1155,1816,1161,1827,1164,1839,1165,1843,1165,1851,1162,1855,1162,1870,1155,1870,1136,1868,1141,1863,1143,1855,1145,1851,1148,1827,1148,1817,1143,1812,1136,1805,1129,1803,1119,1803,1090,1805,1078,1812,1071,1817,1064,1827,1059,1846,1059,1851,1061,1855,1061,1860,1064,1865,1068,1870,1071,1870,1052xm1995,1145l1966,1145,1961,1143,1954,1129,1954,1119,1954,1001,1906,1001,1906,1016,1935,1016,1935,1133,1937,1143,1952,1157,1959,1160,1995,1160,1995,1145xm2125,1085l2123,1078,2123,1073,2120,1068,2120,1064,2118,1061,2116,1059,2113,1054,2108,1049,2087,1042,2070,1042,2065,1044,2058,1044,2043,1049,2038,1052,2038,1071,2043,1066,2058,1061,2062,1061,2070,1059,2087,1059,2094,1061,2099,1066,2103,1068,2106,1076,2106,1088,2106,1102,2106,1119,2101,1131,2091,1145,2082,1148,2065,1148,2058,1145,2050,1138,2048,1133,2048,1119,2050,1112,2055,1109,2062,1105,2070,1102,2106,1102,2106,1088,2062,1088,2050,1092,2041,1097,2034,1105,2029,1114,2029,1138,2034,1148,2038,1155,2046,1160,2055,1165,2077,1165,2084,1162,2089,1160,2096,1155,2101,1150,2103,1148,2106,1143,2106,1160,2125,1160,2125,1143,2125,1102,2125,1085xm2248,1119l2245,1112,2235,1102,2228,1097,2219,1097,2211,1095,2199,1092,2192,1090,2187,1088,2185,1085,2183,1080,2183,1071,2185,1066,2199,1059,2221,1059,2235,1066,2243,1068,2243,1049,2235,1047,2231,1047,2226,1044,2219,1044,2214,1042,2195,1042,2183,1047,2175,1052,2168,1059,2163,1066,2163,1085,2166,1092,2178,1105,2185,1107,2195,1109,2202,1109,2204,1112,2221,1114,2228,1119,2228,1136,2226,1141,2211,1148,2190,1148,2185,1145,2163,1138,2163,1157,2171,1160,2178,1160,2185,1162,2190,1165,2216,1165,2228,1160,2235,1155,2243,1148,2248,1138,2248,1119xm2375,1119l2373,1112,2363,1102,2356,1097,2346,1097,2339,1095,2325,1092,2317,1090,2312,1085,2310,1080,2310,1071,2312,1066,2317,1064,2320,1061,2327,1059,2346,1059,2353,1061,2368,1068,2368,1049,2363,1047,2358,1047,2351,1044,2346,1044,2341,1042,2320,1042,2310,1047,2303,1052,2296,1059,2291,1066,2291,1085,2293,1092,2298,1097,2303,1105,2322,1109,2329,1109,2329,1112,2346,1114,2356,1119,2356,1136,2353,1141,2344,1145,2337,1148,2317,1148,2310,1145,2305,1143,2291,1138,2291,1157,2298,1160,2305,1160,2310,1162,2317,1165,2344,1165,2363,1155,2370,1148,2375,1138,2375,1119xe" filled="true" fillcolor="#343833" stroked="false">
+              <v:group w14:anchorId="3E921E31" id="Group 146" o:spid="_x0000_s1026" style="position:absolute;margin-left:44.45pt;margin-top:49.45pt;width:137.95pt;height:25pt;z-index:-15727104;mso-wrap-distance-left:0;mso-wrap-distance-right:0;mso-position-horizontal-relative:page" coordsize="17519,3175" o:gfxdata="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">
+                <v:shape id="Graphic 147" o:spid="_x0000_s1027" style="position:absolute;left:5664;top:77;width:3772;height:1041;visibility:visible;mso-wrap-style:square;v-text-anchor:top" coordsize="377190,104139" o:gfxdata="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" path="m56578,32004l47332,27432r-3048,l39712,25908r-3048,l28981,26720,609,56972,,65620r825,7938l28981,103136r7683,584l39712,103720r4572,-1524l47332,102196r9246,-4572l56578,85432r-1524,3048l52006,90004r-4674,1524l44284,93052r-15240,l22948,90004,19900,85432,15328,80860,13804,74764r,-18376l15328,48768r4572,-4572l22948,39624r6096,-3048l41236,36576r3048,1524l47332,38100r3150,1524l53530,42672r3048,1524l56578,32004xem135915,91528r-18288,l114579,90004r-4572,-9144l110007,74764,110007,,79438,r,9144l97815,9144r,74764l99339,90004r9144,9144l113055,100672r22860,l135915,91528xem218414,53340r-1524,-4572l216890,45720r-1524,-3048l215366,39624r-1524,-1524l212826,36576r-2032,-3048l207746,30480,194030,25908r-10769,l180213,27432r-4572,l166497,30480r-3048,1524l163449,44196r3048,-3048l175641,38100r3048,l183261,36576r10769,l198602,38100r3048,3048l204698,42672r1524,4572l206222,54864r,9144l206222,74764r-3048,7620l197078,91528r-6197,1524l180213,93052r-4572,-1524l171069,86956r-1524,-3048l169545,74764r1524,-4572l174117,68668r4572,-3048l183261,64008r22961,l206222,54864r-27533,l171069,57912r-6096,3048l160401,65620r-3048,6096l157353,86956r3048,6096l163449,97624r4572,3048l174117,103720r13716,l204190,93052r2032,-3048l206222,100672r12192,l218414,90004r,-25996l218414,53340xem296329,74764r-1524,-4572l288607,64008r-4572,-3048l277939,60960r-4572,-1524l255079,50292r,-6096l256603,41148r9144,-4572l279463,36576r9144,4572l293281,42672r,-12192l288607,28956r-3048,l282511,27432r-4572,l274891,25908r-12192,l255079,28956r-4572,3048l245935,36576r-3048,4572l242887,53340r1524,4572l252031,65620r4572,1524l262699,68668r4572,l268795,70192r10668,1524l284035,74764r,10668l282511,88480r-9144,4572l259651,93052r-3048,-1524l242887,86956r,12192l247459,100672r4572,l256603,102196r3048,1524l276415,103720r7620,-3048l288607,97624r4674,-4572l296329,86956r,-12192xem377190,74764r-1524,-4572l369570,64008r-4572,-3048l358902,60960r-4572,-1524l345186,57912r-4572,-1524l337477,53340r-1524,-3048l335953,44196r1524,-3048l340614,39624r1524,-1524l346710,36576r12192,l363474,38100r9144,4572l372618,30480r-3048,-1524l366522,28956r-4572,-1524l358902,27432r-3048,-1524l342138,25908r-6185,3048l331381,32004r-4572,4572l323761,41148r,12192l325285,57912r3048,3048l331381,65620r12281,3048l348234,68668r,1524l358902,71716r6096,3048l364998,85432r-1524,3048l357378,91528r-4572,1524l340614,93052r-4661,-1524l332905,90004r-9144,-3048l323761,99148r4572,1524l332905,100672r3048,1524l340614,103720r16764,l369570,97624r4572,-4572l377190,86956r,-12192xe" fillcolor="#343833" stroked="f">
                   <v:path arrowok="t"/>
-                  <v:fill type="solid"/>
                 </v:shape>
-                <v:shape style="position:absolute;left:2541;top:1008;width:222;height:157" type="#_x0000_t75" id="docshape147" stroked="false">
-                  <v:imagedata r:id="rId84" o:title=""/>
+                <v:shape id="Image 148" o:spid="_x0000_s1028" type="#_x0000_t75" style="position:absolute;left:10490;top:122;width:1404;height:992;visibility:visible;mso-wrap-style:square" o:gfxdata="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">
+                  <v:imagedata r:id="rId169" o:title=""/>
                 </v:shape>
-                <v:shape style="position:absolute;left:888;top:1001;width:852;height:447" type="#_x0000_t75" id="docshape148" stroked="false">
-                  <v:imagedata r:id="rId85" o:title=""/>
+                <v:shape id="Image 149" o:spid="_x0000_s1029" type="#_x0000_t75" style="position:absolute;top:77;width:5405;height:2838;visibility:visible;mso-wrap-style:square" o:gfxdata="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">
+                  <v:imagedata r:id="rId170" o:title=""/>
                 </v:shape>
-                <v:shape style="position:absolute;left:2793;top:1013;width:351;height:152" type="#_x0000_t75" id="docshape149" stroked="false">
-                  <v:imagedata r:id="rId86" o:title=""/>
+                <v:shape id="Image 150" o:spid="_x0000_s1030" type="#_x0000_t75" style="position:absolute;left:12093;top:153;width:2229;height:961;visibility:visible;mso-wrap-style:square" o:gfxdata="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">
+                  <v:imagedata r:id="rId171" o:title=""/>
                 </v:shape>
-                <v:shape style="position:absolute;left:3185;top:989;width:462;height:176" type="#_x0000_t75" id="docshape150" stroked="false">
-                  <v:imagedata r:id="rId87" o:title=""/>
+                <v:shape id="Image 151" o:spid="_x0000_s1031" type="#_x0000_t75" style="position:absolute;left:14582;width:2932;height:1114;visibility:visible;mso-wrap-style:square" o:gfxdata="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">
+                  <v:imagedata r:id="rId172" o:title=""/>
                 </v:shape>
-                <v:shape style="position:absolute;left:1901;top:1289;width:101;height:159" type="#_x0000_t75" id="docshape151" stroked="false">
-                  <v:imagedata r:id="rId88" o:title=""/>
+                <v:shape id="Image 152" o:spid="_x0000_s1032" type="#_x0000_t75" style="position:absolute;left:6428;top:1907;width:641;height:1008;visibility:visible;mso-wrap-style:square" o:gfxdata="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">
+                  <v:imagedata r:id="rId173" o:title=""/>
                 </v:shape>
-                <v:shape style="position:absolute;left:2035;top:1287;width:188;height:202" id="docshape152" coordorigin="2036,1287" coordsize="188,202" path="m2130,1388l2129,1375,2129,1374,2126,1363,2123,1353,2118,1345,2110,1333,2110,1374,2110,1402,2108,1415,2098,1429,2091,1434,2072,1434,2070,1431,2067,1429,2058,1415,2057,1414,2055,1402,2055,1374,2058,1364,2062,1357,2067,1347,2072,1345,2091,1345,2098,1347,2103,1357,2108,1364,2110,1374,2110,1333,2098,1328,2079,1328,2072,1330,2062,1335,2058,1340,2055,1347,2055,1287,2036,1287,2036,1446,2055,1446,2055,1431,2058,1439,2062,1441,2067,1446,2072,1448,2098,1448,2110,1443,2118,1434,2123,1424,2126,1414,2129,1402,2130,1388xm2223,1330l2171,1330,2171,1347,2204,1347,2204,1458,2197,1472,2192,1475,2161,1475,2161,1489,2199,1489,2207,1487,2214,1479,2219,1472,2223,1463,2223,1330xm2223,1287l2204,1287,2204,1311,2223,1311,2223,1287xe" filled="true" fillcolor="#496782" stroked="false">
+                <v:shape id="Graphic 153" o:spid="_x0000_s1033" style="position:absolute;left:7283;top:1892;width:1194;height:1283;visibility:visible;mso-wrap-style:square;v-text-anchor:top" coordsize="119380,128270" o:gfxdata="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" path="m59524,64096l51904,36664,47332,29044r,25908l47332,73240r-1524,7722l39712,90106r-4572,3048l22860,93154,21336,91630,19812,90106,13716,80962r-127,-622l12192,73240r,-18288l13716,48856r3048,-4572l19812,38188r3048,-1524l35140,36664r4572,1524l42760,44284r3048,4572l47332,54952r,-25908l39712,25996r-12280,l22860,27520r-6096,3048l13716,33616r-1524,4572l12192,,,,,100774r12192,l12192,91630r1524,4572l16764,97726r3048,3048l22860,102298r16852,l47332,99250r4572,-6096l55029,87109r2400,-6769l58978,72720r546,-8624xem119062,27520r-33528,l85534,38188r21336,l106870,108394r-4572,9144l99250,119062r-19812,l79438,128206r24384,l108394,126682r4572,-4572l116014,117538r3048,-6096l119062,27520xem119062,l106870,r,15328l119062,15328,119062,xe" fillcolor="#496782" stroked="f">
                   <v:path arrowok="t"/>
-                  <v:fill type="solid"/>
                 </v:shape>
-                <v:shape style="position:absolute;left:2281;top:1328;width:101;height:121" type="#_x0000_t75" id="docshape153" stroked="false">
-                  <v:imagedata r:id="rId89" o:title=""/>
+                <v:shape id="Image 154" o:spid="_x0000_s1034" type="#_x0000_t75" style="position:absolute;left:8841;top:2152;width:641;height:763;visibility:visible;mso-wrap-style:square" o:gfxdata="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">
+                  <v:imagedata r:id="rId174" o:title=""/>
                 </v:shape>
-                <v:shape style="position:absolute;left:2415;top:1299;width:212;height:150" id="docshape154" coordorigin="2416,1299" coordsize="212,150" path="m2505,1338l2500,1335,2493,1333,2488,1330,2483,1330,2478,1328,2471,1328,2459,1329,2448,1332,2438,1337,2430,1345,2424,1353,2420,1364,2417,1376,2416,1388,2417,1402,2420,1414,2424,1424,2430,1434,2438,1440,2448,1445,2459,1447,2471,1448,2488,1448,2495,1446,2505,1441,2505,1422,2500,1424,2495,1429,2490,1431,2486,1431,2478,1434,2462,1434,2452,1429,2438,1415,2435,1402,2435,1374,2438,1364,2445,1357,2452,1347,2462,1345,2483,1345,2490,1347,2500,1352,2505,1357,2505,1338xm2628,1330l2584,1330,2584,1299,2567,1299,2567,1330,2536,1330,2536,1347,2567,1347,2567,1422,2570,1431,2575,1439,2582,1443,2591,1446,2628,1446,2628,1431,2599,1431,2589,1427,2584,1417,2584,1347,2628,1347,2628,1330xe" filled="true" fillcolor="#496782" stroked="false">
+                <v:shape id="Graphic 155" o:spid="_x0000_s1035" style="position:absolute;left:9696;top:1968;width:1346;height:953;visibility:visible;mso-wrap-style:square;v-text-anchor:top" coordsize="134620,95250" o:gfxdata="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" path="m56476,24472l53428,22948,48856,21424,45808,19900r-3048,l39712,18376r-4572,l2286,41046,,56476r571,8624l27393,94107r7747,571l45808,94678r4572,-1524l56476,90106r,-12192l53428,79438r-3048,3048l47332,84010r-3048,l39712,85534r-10756,l22860,82486,13716,73342,12192,65620r,-18288l13716,41236r4572,-4572l22860,30568r6096,-1524l42760,29044r4572,1524l53428,33616r3048,3048l56476,24472xem134391,19900r-27534,l106857,,96189,r,19900l76288,19900r,10668l96189,30568r,47346l97713,84010r3048,4572l105333,91630r6096,1524l134391,93154r,-9144l116001,84010r-6096,-3048l106857,74866r,-44298l134391,30568r,-10668xe" fillcolor="#496782" stroked="f">
                   <v:path arrowok="t"/>
-                  <v:fill type="solid"/>
                 </v:shape>
-                <w10:wrap type="topAndBottom"/>
+                <w10:wrap type="topAndBottom" anchorx="page"/>
               </v:group>
             </w:pict>
           </mc:Fallback>
@@ -18872,7 +18859,7 @@
     </w:p>
     <w:p>
       <w:pPr>
-        <w:spacing w:line="240" w:lineRule="auto" w:before="71"/>
+        <w:spacing w:before="71"/>
         <w:rPr>
           <w:rFonts w:ascii="Times New Roman"/>
           <w:sz w:val="20"/>
@@ -18880,23 +18867,81 @@
       </w:pPr>
     </w:p>
     <w:sectPr>
+      <w:headerReference w:type="default" r:id="rId175"/>
       <w:type w:val="continuous"/>
       <w:pgSz w:w="11910" w:h="16840"/>
-      <w:pgMar w:top="1560" w:bottom="280" w:left="850" w:right="1700"/>
+      <w:pgMar w:top="1560" w:right="1700" w:bottom="280" w:left="850" w:header="720" w:footer="720" w:gutter="0"/>
+      <w:cols w:space="720"/>
     </w:sectPr>
   </w:body>
 </w:document>
 </file>
 
+<file path=word/endnotes.xml><?xml version="1.0" encoding="utf-8"?>
+<w:endnotes xmlns:wpc="http://schemas.microsoft.com/office/word/2010/wordprocessingCanvas" xmlns:cx="http://schemas.microsoft.com/office/drawing/2014/chartex" xmlns:mc="http://schemas.openxmlformats.org/markup-compatibility/2006" xmlns:o="urn:schemas-microsoft-com:office:office" xmlns:r="http://schemas.openxmlformats.org/officeDocument/2006/relationships" xmlns:m="http://schemas.openxmlformats.org/officeDocument/2006/math" xmlns:v="urn:schemas-microsoft-com:vml" xmlns:wp14="http://schemas.microsoft.com/office/word/2010/wordprocessingDrawing" xmlns:wp="http://schemas.openxmlformats.org/drawingml/2006/wordprocessingDrawing" xmlns:w10="urn:schemas-microsoft-com:office:word" xmlns:w="http://schemas.openxmlformats.org/wordprocessingml/2006/main" xmlns:w14="http://schemas.microsoft.com/office/word/2010/wordml" xmlns:w15="http://schemas.microsoft.com/office/word/2012/wordml" xmlns:w16se="http://schemas.microsoft.com/office/word/2015/wordml/symex" xmlns:wpg="http://schemas.microsoft.com/office/word/2010/wordprocessingGroup" xmlns:wpi="http://schemas.microsoft.com/office/word/2010/wordprocessingInk" xmlns:wne="http://schemas.microsoft.com/office/word/2006/wordml" xmlns:wps="http://schemas.microsoft.com/office/word/2010/wordprocessingShape" mc:Ignorable="w14 w15 w16se wp14">
+  <w:endnote w:type="separator" w:id="-1">
+    <w:p>
+      <w:r>
+        <w:separator/>
+      </w:r>
+    </w:p>
+  </w:endnote>
+  <w:endnote w:type="continuationSeparator" w:id="0">
+    <w:p>
+      <w:r>
+        <w:continuationSeparator/>
+      </w:r>
+    </w:p>
+  </w:endnote>
+</w:endnotes>
+</file>
+
+<file path=word/footnotes.xml><?xml version="1.0" encoding="utf-8"?>
+<w:footnotes xmlns:wpc="http://schemas.microsoft.com/office/word/2010/wordprocessingCanvas" xmlns:cx="http://schemas.microsoft.com/office/drawing/2014/chartex" xmlns:mc="http://schemas.openxmlformats.org/markup-compatibility/2006" xmlns:o="urn:schemas-microsoft-com:office:office" xmlns:r="http://schemas.openxmlformats.org/officeDocument/2006/relationships" xmlns:m="http://schemas.openxmlformats.org/officeDocument/2006/math" xmlns:v="urn:schemas-microsoft-com:vml" xmlns:wp14="http://schemas.microsoft.com/office/word/2010/wordprocessingDrawing" xmlns:wp="http://schemas.openxmlformats.org/drawingml/2006/wordprocessingDrawing" xmlns:w10="urn:schemas-microsoft-com:office:word" xmlns:w="http://schemas.openxmlformats.org/wordprocessingml/2006/main" xmlns:w14="http://schemas.microsoft.com/office/word/2010/wordml" xmlns:w15="http://schemas.microsoft.com/office/word/2012/wordml" xmlns:w16se="http://schemas.microsoft.com/office/word/2015/wordml/symex" xmlns:wpg="http://schemas.microsoft.com/office/word/2010/wordprocessingGroup" xmlns:wpi="http://schemas.microsoft.com/office/word/2010/wordprocessingInk" xmlns:wne="http://schemas.microsoft.com/office/word/2006/wordml" xmlns:wps="http://schemas.microsoft.com/office/word/2010/wordprocessingShape" mc:Ignorable="w14 w15 w16se wp14">
+  <w:footnote w:type="separator" w:id="-1">
+    <w:p>
+      <w:r>
+        <w:separator/>
+      </w:r>
+    </w:p>
+  </w:footnote>
+  <w:footnote w:type="continuationSeparator" w:id="0">
+    <w:p>
+      <w:r>
+        <w:continuationSeparator/>
+      </w:r>
+    </w:p>
+  </w:footnote>
+</w:footnotes>
+</file>
+
+<file path=word/header1.xml><?xml version="1.0" encoding="utf-8"?>
+<w:hdr xmlns:wpc="http://schemas.microsoft.com/office/word/2010/wordprocessingCanvas" xmlns:cx="http://schemas.microsoft.com/office/drawing/2014/chartex" xmlns:mc="http://schemas.openxmlformats.org/markup-compatibility/2006" xmlns:o="urn:schemas-microsoft-com:office:office" xmlns:r="http://schemas.openxmlformats.org/officeDocument/2006/relationships" xmlns:m="http://schemas.openxmlformats.org/officeDocument/2006/math" xmlns:v="urn:schemas-microsoft-com:vml" xmlns:wp14="http://schemas.microsoft.com/office/word/2010/wordprocessingDrawing" xmlns:wp="http://schemas.openxmlformats.org/drawingml/2006/wordprocessingDrawing" xmlns:w10="urn:schemas-microsoft-com:office:word" xmlns:w="http://schemas.openxmlformats.org/wordprocessingml/2006/main" xmlns:w14="http://schemas.microsoft.com/office/word/2010/wordml" xmlns:w15="http://schemas.microsoft.com/office/word/2012/wordml" xmlns:w16se="http://schemas.microsoft.com/office/word/2015/wordml/symex" xmlns:wpg="http://schemas.microsoft.com/office/word/2010/wordprocessingGroup" xmlns:wpi="http://schemas.microsoft.com/office/word/2010/wordprocessingInk" xmlns:wne="http://schemas.microsoft.com/office/word/2006/wordml" xmlns:wps="http://schemas.microsoft.com/office/word/2010/wordprocessingShape" mc:Ignorable="w14 w15 w16se wp14">
+  <w:p>
+    <w:pPr>
+      <w:pStyle w:val="Encabezado"/>
+    </w:pPr>
+    <w:r>
+      <w:t>PRUEBA</w:t>
+    </w:r>
+  </w:p>
+  <w:p>
+    <w:pPr>
+      <w:pStyle w:val="Encabezado"/>
+    </w:pPr>
+  </w:p>
+</w:hdr>
+</file>
+
 <file path=word/styles.xml><?xml version="1.0" encoding="utf-8"?>
-<w:styles xmlns:r="http://schemas.openxmlformats.org/officeDocument/2006/relationships" xmlns:w="http://schemas.openxmlformats.org/wordprocessingml/2006/main">
+<w:styles xmlns:mc="http://schemas.openxmlformats.org/markup-compatibility/2006" xmlns:r="http://schemas.openxmlformats.org/officeDocument/2006/relationships" xmlns:w="http://schemas.openxmlformats.org/wordprocessingml/2006/main" xmlns:w14="http://schemas.microsoft.com/office/word/2010/wordml" xmlns:w15="http://schemas.microsoft.com/office/word/2012/wordml" xmlns:w16se="http://schemas.microsoft.com/office/word/2015/wordml/symex" mc:Ignorable="w14 w15 w16se">
   <w:docDefaults>
     <w:rPrDefault>
       <w:rPr>
-        <w:rFonts w:cstheme="minorBidi" w:hAnsiTheme="minorHAnsi" w:eastAsiaTheme="minorHAnsi" w:asciiTheme="minorHAnsi"/>
+        <w:rFonts w:asciiTheme="minorHAnsi" w:eastAsiaTheme="minorHAnsi" w:hAnsiTheme="minorHAnsi" w:cstheme="minorBidi"/>
         <w:sz w:val="22"/>
         <w:szCs w:val="22"/>
-        <w:lang w:val="en-US" w:bidi="ar-SA" w:eastAsia="en-US"/>
+        <w:lang w:val="en-US" w:eastAsia="en-US" w:bidi="ar-SA"/>
       </w:rPr>
     </w:rPrDefault>
     <w:pPrDefault>
@@ -18904,19 +18949,415 @@
         <w:widowControl w:val="0"/>
         <w:autoSpaceDE w:val="0"/>
         <w:autoSpaceDN w:val="0"/>
-        <w:spacing w:lineRule="auto" w:line="240" w:before="0" w:after="0"/>
-        <w:ind w:left="0" w:right="0"/>
-        <w:jc w:val="left"/>
       </w:pPr>
     </w:pPrDefault>
   </w:docDefaults>
-  <w:style w:styleId="DefaultParagraphFont" w:default="1" w:type="character">
+  <w:latentStyles w:defLockedState="0" w:defUIPriority="99" w:defSemiHidden="0" w:defUnhideWhenUsed="0" w:defQFormat="0" w:count="371">
+    <w:lsdException w:name="Normal" w:uiPriority="0" w:qFormat="1"/>
+    <w:lsdException w:name="heading 1" w:uiPriority="9" w:qFormat="1"/>
+    <w:lsdException w:name="heading 2" w:semiHidden="1" w:uiPriority="9" w:unhideWhenUsed="1" w:qFormat="1"/>
+    <w:lsdException w:name="heading 3" w:semiHidden="1" w:uiPriority="9" w:unhideWhenUsed="1" w:qFormat="1"/>
+    <w:lsdException w:name="heading 4" w:semiHidden="1" w:uiPriority="9" w:unhideWhenUsed="1" w:qFormat="1"/>
+    <w:lsdException w:name="heading 5" w:semiHidden="1" w:uiPriority="9" w:unhideWhenUsed="1" w:qFormat="1"/>
+    <w:lsdException w:name="heading 6" w:semiHidden="1" w:uiPriority="9" w:unhideWhenUsed="1" w:qFormat="1"/>
+    <w:lsdException w:name="heading 7" w:semiHidden="1" w:uiPriority="9" w:unhideWhenUsed="1" w:qFormat="1"/>
+    <w:lsdException w:name="heading 8" w:semiHidden="1" w:uiPriority="9" w:unhideWhenUsed="1" w:qFormat="1"/>
+    <w:lsdException w:name="heading 9" w:semiHidden="1" w:uiPriority="9" w:unhideWhenUsed="1" w:qFormat="1"/>
+    <w:lsdException w:name="index 1" w:semiHidden="1" w:unhideWhenUsed="1"/>
+    <w:lsdException w:name="index 2" w:semiHidden="1" w:unhideWhenUsed="1"/>
+    <w:lsdException w:name="index 3" w:semiHidden="1" w:unhideWhenUsed="1"/>
+    <w:lsdException w:name="index 4" w:semiHidden="1" w:unhideWhenUsed="1"/>
+    <w:lsdException w:name="index 5" w:semiHidden="1" w:unhideWhenUsed="1"/>
+    <w:lsdException w:name="index 6" w:semiHidden="1" w:unhideWhenUsed="1"/>
+    <w:lsdException w:name="index 7" w:semiHidden="1" w:unhideWhenUsed="1"/>
+    <w:lsdException w:name="index 8" w:semiHidden="1" w:unhideWhenUsed="1"/>
+    <w:lsdException w:name="index 9" w:semiHidden="1" w:unhideWhenUsed="1"/>
+    <w:lsdException w:name="toc 1" w:semiHidden="1" w:uiPriority="39" w:unhideWhenUsed="1"/>
+    <w:lsdException w:name="toc 2" w:semiHidden="1" w:uiPriority="39" w:unhideWhenUsed="1"/>
+    <w:lsdException w:name="toc 3" w:semiHidden="1" w:uiPriority="39" w:unhideWhenUsed="1"/>
+    <w:lsdException w:name="toc 4" w:semiHidden="1" w:uiPriority="39" w:unhideWhenUsed="1"/>
+    <w:lsdException w:name="toc 5" w:semiHidden="1" w:uiPriority="39" w:unhideWhenUsed="1"/>
+    <w:lsdException w:name="toc 6" w:semiHidden="1" w:uiPriority="39" w:unhideWhenUsed="1"/>
+    <w:lsdException w:name="toc 7" w:semiHidden="1" w:uiPriority="39" w:unhideWhenUsed="1"/>
+    <w:lsdException w:name="toc 8" w:semiHidden="1" w:uiPriority="39" w:unhideWhenUsed="1"/>
+    <w:lsdException w:name="toc 9" w:semiHidden="1" w:uiPriority="39" w:unhideWhenUsed="1"/>
+    <w:lsdException w:name="Normal Indent" w:semiHidden="1" w:unhideWhenUsed="1"/>
+    <w:lsdException w:name="footnote text" w:semiHidden="1" w:unhideWhenUsed="1"/>
+    <w:lsdException w:name="annotation text" w:semiHidden="1" w:unhideWhenUsed="1"/>
+    <w:lsdException w:name="header" w:semiHidden="1" w:unhideWhenUsed="1"/>
+    <w:lsdException w:name="footer" w:semiHidden="1" w:unhideWhenUsed="1"/>
+    <w:lsdException w:name="index heading" w:semiHidden="1" w:unhideWhenUsed="1"/>
+    <w:lsdException w:name="caption" w:semiHidden="1" w:uiPriority="35" w:unhideWhenUsed="1" w:qFormat="1"/>
+    <w:lsdException w:name="table of figures" w:semiHidden="1" w:unhideWhenUsed="1"/>
+    <w:lsdException w:name="envelope address" w:semiHidden="1" w:unhideWhenUsed="1"/>
+    <w:lsdException w:name="envelope return" w:semiHidden="1" w:unhideWhenUsed="1"/>
+    <w:lsdException w:name="footnote reference" w:semiHidden="1" w:unhideWhenUsed="1"/>
+    <w:lsdException w:name="annotation reference" w:semiHidden="1" w:unhideWhenUsed="1"/>
+    <w:lsdException w:name="line number" w:semiHidden="1" w:unhideWhenUsed="1"/>
+    <w:lsdException w:name="page number" w:semiHidden="1" w:unhideWhenUsed="1"/>
+    <w:lsdException w:name="endnote reference" w:semiHidden="1" w:unhideWhenUsed="1"/>
+    <w:lsdException w:name="endnote text" w:semiHidden="1" w:unhideWhenUsed="1"/>
+    <w:lsdException w:name="table of authorities" w:semiHidden="1" w:unhideWhenUsed="1"/>
+    <w:lsdException w:name="macro" w:semiHidden="1" w:unhideWhenUsed="1"/>
+    <w:lsdException w:name="toa heading" w:semiHidden="1" w:unhideWhenUsed="1"/>
+    <w:lsdException w:name="List" w:semiHidden="1" w:unhideWhenUsed="1"/>
+    <w:lsdException w:name="List Bullet" w:semiHidden="1" w:unhideWhenUsed="1"/>
+    <w:lsdException w:name="List Number" w:semiHidden="1" w:unhideWhenUsed="1"/>
+    <w:lsdException w:name="List 2" w:semiHidden="1" w:unhideWhenUsed="1"/>
+    <w:lsdException w:name="List 3" w:semiHidden="1" w:unhideWhenUsed="1"/>
+    <w:lsdException w:name="List 4" w:semiHidden="1" w:unhideWhenUsed="1"/>
+    <w:lsdException w:name="List 5" w:semiHidden="1" w:unhideWhenUsed="1"/>
+    <w:lsdException w:name="List Bullet 2" w:semiHidden="1" w:unhideWhenUsed="1"/>
+    <w:lsdException w:name="List Bullet 3" w:semiHidden="1" w:unhideWhenUsed="1"/>
+    <w:lsdException w:name="List Bullet 4" w:semiHidden="1" w:unhideWhenUsed="1"/>
+    <w:lsdException w:name="List Bullet 5" w:semiHidden="1" w:unhideWhenUsed="1"/>
+    <w:lsdException w:name="List Number 2" w:semiHidden="1" w:unhideWhenUsed="1"/>
+    <w:lsdException w:name="List Number 3" w:semiHidden="1" w:unhideWhenUsed="1"/>
+    <w:lsdException w:name="List Number 4" w:semiHidden="1" w:unhideWhenUsed="1"/>
+    <w:lsdException w:name="List Number 5" w:semiHidden="1" w:unhideWhenUsed="1"/>
+    <w:lsdException w:name="Title" w:uiPriority="10" w:qFormat="1"/>
+    <w:lsdException w:name="Closing" w:semiHidden="1" w:unhideWhenUsed="1"/>
+    <w:lsdException w:name="Signature" w:semiHidden="1" w:unhideWhenUsed="1"/>
+    <w:lsdException w:name="Default Paragraph Font" w:semiHidden="1" w:uiPriority="1" w:unhideWhenUsed="1"/>
+    <w:lsdException w:name="Body Text" w:semiHidden="1" w:unhideWhenUsed="1"/>
+    <w:lsdException w:name="Body Text Indent" w:semiHidden="1" w:unhideWhenUsed="1"/>
+    <w:lsdException w:name="List Continue" w:semiHidden="1" w:unhideWhenUsed="1"/>
+    <w:lsdException w:name="List Continue 2" w:semiHidden="1" w:unhideWhenUsed="1"/>
+    <w:lsdException w:name="List Continue 3" w:semiHidden="1" w:unhideWhenUsed="1"/>
+    <w:lsdException w:name="List Continue 4" w:semiHidden="1" w:unhideWhenUsed="1"/>
+    <w:lsdException w:name="List Continue 5" w:semiHidden="1" w:unhideWhenUsed="1"/>
+    <w:lsdException w:name="Message Header" w:semiHidden="1" w:unhideWhenUsed="1"/>
+    <w:lsdException w:name="Subtitle" w:uiPriority="11" w:qFormat="1"/>
+    <w:lsdException w:name="Salutation" w:semiHidden="1" w:unhideWhenUsed="1"/>
+    <w:lsdException w:name="Date" w:semiHidden="1" w:unhideWhenUsed="1"/>
+    <w:lsdException w:name="Body Text First Indent" w:semiHidden="1" w:unhideWhenUsed="1"/>
+    <w:lsdException w:name="Body Text First Indent 2" w:semiHidden="1" w:unhideWhenUsed="1"/>
+    <w:lsdException w:name="Note Heading" w:semiHidden="1" w:unhideWhenUsed="1"/>
+    <w:lsdException w:name="Body Text 2" w:semiHidden="1" w:unhideWhenUsed="1"/>
+    <w:lsdException w:name="Body Text 3" w:semiHidden="1" w:unhideWhenUsed="1"/>
+    <w:lsdException w:name="Body Text Indent 2" w:semiHidden="1" w:unhideWhenUsed="1"/>
+    <w:lsdException w:name="Body Text Indent 3" w:semiHidden="1" w:unhideWhenUsed="1"/>
+    <w:lsdException w:name="Block Text" w:semiHidden="1" w:unhideWhenUsed="1"/>
+    <w:lsdException w:name="Hyperlink" w:semiHidden="1" w:unhideWhenUsed="1"/>
+    <w:lsdException w:name="FollowedHyperlink" w:semiHidden="1" w:unhideWhenUsed="1"/>
+    <w:lsdException w:name="Strong" w:uiPriority="22" w:qFormat="1"/>
+    <w:lsdException w:name="Emphasis" w:uiPriority="20" w:qFormat="1"/>
+    <w:lsdException w:name="Document Map" w:semiHidden="1" w:unhideWhenUsed="1"/>
+    <w:lsdException w:name="Plain Text" w:semiHidden="1" w:unhideWhenUsed="1"/>
+    <w:lsdException w:name="E-mail Signature" w:semiHidden="1" w:unhideWhenUsed="1"/>
+    <w:lsdException w:name="HTML Top of Form" w:semiHidden="1" w:unhideWhenUsed="1"/>
+    <w:lsdException w:name="HTML Bottom of Form" w:semiHidden="1" w:unhideWhenUsed="1"/>
+    <w:lsdException w:name="Normal (Web)" w:semiHidden="1" w:unhideWhenUsed="1"/>
+    <w:lsdException w:name="HTML Acronym" w:semiHidden="1" w:unhideWhenUsed="1"/>
+    <w:lsdException w:name="HTML Address" w:semiHidden="1" w:unhideWhenUsed="1"/>
+    <w:lsdException w:name="HTML Cite" w:semiHidden="1" w:unhideWhenUsed="1"/>
+    <w:lsdException w:name="HTML Code" w:semiHidden="1" w:unhideWhenUsed="1"/>
+    <w:lsdException w:name="HTML Definition" w:semiHidden="1" w:unhideWhenUsed="1"/>
+    <w:lsdException w:name="HTML Keyboard" w:semiHidden="1" w:unhideWhenUsed="1"/>
+    <w:lsdException w:name="HTML Preformatted" w:semiHidden="1" w:unhideWhenUsed="1"/>
+    <w:lsdException w:name="HTML Sample" w:semiHidden="1" w:unhideWhenUsed="1"/>
+    <w:lsdException w:name="HTML Typewriter" w:semiHidden="1" w:unhideWhenUsed="1"/>
+    <w:lsdException w:name="HTML Variable" w:semiHidden="1" w:unhideWhenUsed="1"/>
+    <w:lsdException w:name="Normal Table" w:semiHidden="1" w:unhideWhenUsed="1"/>
+    <w:lsdException w:name="annotation subject" w:semiHidden="1" w:unhideWhenUsed="1"/>
+    <w:lsdException w:name="No List" w:semiHidden="1" w:unhideWhenUsed="1"/>
+    <w:lsdException w:name="Outline List 1" w:semiHidden="1" w:unhideWhenUsed="1"/>
+    <w:lsdException w:name="Outline List 2" w:semiHidden="1" w:unhideWhenUsed="1"/>
+    <w:lsdException w:name="Outline List 3" w:semiHidden="1" w:unhideWhenUsed="1"/>
+    <w:lsdException w:name="Table Simple 1" w:semiHidden="1" w:unhideWhenUsed="1"/>
+    <w:lsdException w:name="Table Simple 2" w:semiHidden="1" w:unhideWhenUsed="1"/>
+    <w:lsdException w:name="Table Simple 3" w:semiHidden="1" w:unhideWhenUsed="1"/>
+    <w:lsdException w:name="Table Classic 1" w:semiHidden="1" w:unhideWhenUsed="1"/>
+    <w:lsdException w:name="Table Classic 2" w:semiHidden="1" w:unhideWhenUsed="1"/>
+    <w:lsdException w:name="Table Classic 3" w:semiHidden="1" w:unhideWhenUsed="1"/>
+    <w:lsdException w:name="Table Classic 4" w:semiHidden="1" w:unhideWhenUsed="1"/>
+    <w:lsdException w:name="Table Colorful 1" w:semiHidden="1" w:unhideWhenUsed="1"/>
+    <w:lsdException w:name="Table Colorful 2" w:semiHidden="1" w:unhideWhenUsed="1"/>
+    <w:lsdException w:name="Table Colorful 3" w:semiHidden="1" w:unhideWhenUsed="1"/>
+    <w:lsdException w:name="Table Columns 1" w:semiHidden="1" w:unhideWhenUsed="1"/>
+    <w:lsdException w:name="Table Columns 2" w:semiHidden="1" w:unhideWhenUsed="1"/>
+    <w:lsdException w:name="Table Columns 3" w:semiHidden="1" w:unhideWhenUsed="1"/>
+    <w:lsdException w:name="Table Columns 4" w:semiHidden="1" w:unhideWhenUsed="1"/>
+    <w:lsdException w:name="Table Columns 5" w:semiHidden="1" w:unhideWhenUsed="1"/>
+    <w:lsdException w:name="Table Grid 1" w:semiHidden="1" w:unhideWhenUsed="1"/>
+    <w:lsdException w:name="Table Grid 2" w:semiHidden="1" w:unhideWhenUsed="1"/>
+    <w:lsdException w:name="Table Grid 3" w:semiHidden="1" w:unhideWhenUsed="1"/>
+    <w:lsdException w:name="Table Grid 4" w:semiHidden="1" w:unhideWhenUsed="1"/>
+    <w:lsdException w:name="Table Grid 5" w:semiHidden="1" w:unhideWhenUsed="1"/>
+    <w:lsdException w:name="Table Grid 6" w:semiHidden="1" w:unhideWhenUsed="1"/>
+    <w:lsdException w:name="Table Grid 7" w:semiHidden="1" w:unhideWhenUsed="1"/>
+    <w:lsdException w:name="Table Grid 8" w:semiHidden="1" w:unhideWhenUsed="1"/>
+    <w:lsdException w:name="Table List 1" w:semiHidden="1" w:unhideWhenUsed="1"/>
+    <w:lsdException w:name="Table List 2" w:semiHidden="1" w:unhideWhenUsed="1"/>
+    <w:lsdException w:name="Table List 3" w:semiHidden="1" w:unhideWhenUsed="1"/>
+    <w:lsdException w:name="Table List 4" w:semiHidden="1" w:unhideWhenUsed="1"/>
+    <w:lsdException w:name="Table List 5" w:semiHidden="1" w:unhideWhenUsed="1"/>
+    <w:lsdException w:name="Table List 6" w:semiHidden="1" w:unhideWhenUsed="1"/>
+    <w:lsdException w:name="Table List 7" w:semiHidden="1" w:unhideWhenUsed="1"/>
+    <w:lsdException w:name="Table List 8" w:semiHidden="1" w:unhideWhenUsed="1"/>
+    <w:lsdException w:name="Table 3D effects 1" w:semiHidden="1" w:unhideWhenUsed="1"/>
+    <w:lsdException w:name="Table 3D effects 2" w:semiHidden="1" w:unhideWhenUsed="1"/>
+    <w:lsdException w:name="Table 3D effects 3" w:semiHidden="1" w:unhideWhenUsed="1"/>
+    <w:lsdException w:name="Table Contemporary" w:semiHidden="1" w:unhideWhenUsed="1"/>
+    <w:lsdException w:name="Table Elegant" w:semiHidden="1" w:unhideWhenUsed="1"/>
+    <w:lsdException w:name="Table Professional" w:semiHidden="1" w:unhideWhenUsed="1"/>
+    <w:lsdException w:name="Table Subtle 1" w:semiHidden="1" w:unhideWhenUsed="1"/>
+    <w:lsdException w:name="Table Subtle 2" w:semiHidden="1" w:unhideWhenUsed="1"/>
+    <w:lsdException w:name="Table Web 1" w:semiHidden="1" w:unhideWhenUsed="1"/>
+    <w:lsdException w:name="Table Web 2" w:semiHidden="1" w:unhideWhenUsed="1"/>
+    <w:lsdException w:name="Table Web 3" w:semiHidden="1" w:unhideWhenUsed="1"/>
+    <w:lsdException w:name="Balloon Text" w:semiHidden="1" w:unhideWhenUsed="1"/>
+    <w:lsdException w:name="Table Grid" w:uiPriority="39"/>
+    <w:lsdException w:name="Table Theme" w:semiHidden="1" w:unhideWhenUsed="1"/>
+    <w:lsdException w:name="Placeholder Text" w:semiHidden="1"/>
+    <w:lsdException w:name="No Spacing" w:uiPriority="1" w:qFormat="1"/>
+    <w:lsdException w:name="Light Shading" w:uiPriority="60"/>
+    <w:lsdException w:name="Light List" w:uiPriority="61"/>
+    <w:lsdException w:name="Light Grid" w:uiPriority="62"/>
+    <w:lsdException w:name="Medium Shading 1" w:uiPriority="63"/>
+    <w:lsdException w:name="Medium Shading 2" w:uiPriority="64"/>
+    <w:lsdException w:name="Medium List 1" w:uiPriority="65"/>
+    <w:lsdException w:name="Medium List 2" w:uiPriority="66"/>
+    <w:lsdException w:name="Medium Grid 1" w:uiPriority="67"/>
+    <w:lsdException w:name="Medium Grid 2" w:uiPriority="68"/>
+    <w:lsdException w:name="Medium Grid 3" w:uiPriority="69"/>
+    <w:lsdException w:name="Dark List" w:uiPriority="70"/>
+    <w:lsdException w:name="Colorful Shading" w:uiPriority="71"/>
+    <w:lsdException w:name="Colorful List" w:uiPriority="72"/>
+    <w:lsdException w:name="Colorful Grid" w:uiPriority="73"/>
+    <w:lsdException w:name="Light Shading Accent 1" w:uiPriority="60"/>
+    <w:lsdException w:name="Light List Accent 1" w:uiPriority="61"/>
+    <w:lsdException w:name="Light Grid Accent 1" w:uiPriority="62"/>
+    <w:lsdException w:name="Medium Shading 1 Accent 1" w:uiPriority="63"/>
+    <w:lsdException w:name="Medium Shading 2 Accent 1" w:uiPriority="64"/>
+    <w:lsdException w:name="Medium List 1 Accent 1" w:uiPriority="65"/>
+    <w:lsdException w:name="Revision" w:semiHidden="1"/>
+    <w:lsdException w:name="List Paragraph" w:uiPriority="34" w:qFormat="1"/>
+    <w:lsdException w:name="Quote" w:uiPriority="29" w:qFormat="1"/>
+    <w:lsdException w:name="Intense Quote" w:uiPriority="30" w:qFormat="1"/>
+    <w:lsdException w:name="Medium List 2 Accent 1" w:uiPriority="66"/>
+    <w:lsdException w:name="Medium Grid 1 Accent 1" w:uiPriority="67"/>
+    <w:lsdException w:name="Medium Grid 2 Accent 1" w:uiPriority="68"/>
+    <w:lsdException w:name="Medium Grid 3 Accent 1" w:uiPriority="69"/>
+    <w:lsdException w:name="Dark List Accent 1" w:uiPriority="70"/>
+    <w:lsdException w:name="Colorful Shading Accent 1" w:uiPriority="71"/>
+    <w:lsdException w:name="Colorful List Accent 1" w:uiPriority="72"/>
+    <w:lsdException w:name="Colorful Grid Accent 1" w:uiPriority="73"/>
+    <w:lsdException w:name="Light Shading Accent 2" w:uiPriority="60"/>
+    <w:lsdException w:name="Light List Accent 2" w:uiPriority="61"/>
+    <w:lsdException w:name="Light Grid Accent 2" w:uiPriority="62"/>
+    <w:lsdException w:name="Medium Shading 1 Accent 2" w:uiPriority="63"/>
+    <w:lsdException w:name="Medium Shading 2 Accent 2" w:uiPriority="64"/>
+    <w:lsdException w:name="Medium List 1 Accent 2" w:uiPriority="65"/>
+    <w:lsdException w:name="Medium List 2 Accent 2" w:uiPriority="66"/>
+    <w:lsdException w:name="Medium Grid 1 Accent 2" w:uiPriority="67"/>
+    <w:lsdException w:name="Medium Grid 2 Accent 2" w:uiPriority="68"/>
+    <w:lsdException w:name="Medium Grid 3 Accent 2" w:uiPriority="69"/>
+    <w:lsdException w:name="Dark List Accent 2" w:uiPriority="70"/>
+    <w:lsdException w:name="Colorful Shading Accent 2" w:uiPriority="71"/>
+    <w:lsdException w:name="Colorful List Accent 2" w:uiPriority="72"/>
+    <w:lsdException w:name="Colorful Grid Accent 2" w:uiPriority="73"/>
+    <w:lsdException w:name="Light Shading Accent 3" w:uiPriority="60"/>
+    <w:lsdException w:name="Light List Accent 3" w:uiPriority="61"/>
+    <w:lsdException w:name="Light Grid Accent 3" w:uiPriority="62"/>
+    <w:lsdException w:name="Medium Shading 1 Accent 3" w:uiPriority="63"/>
+    <w:lsdException w:name="Medium Shading 2 Accent 3" w:uiPriority="64"/>
+    <w:lsdException w:name="Medium List 1 Accent 3" w:uiPriority="65"/>
+    <w:lsdException w:name="Medium List 2 Accent 3" w:uiPriority="66"/>
+    <w:lsdException w:name="Medium Grid 1 Accent 3" w:uiPriority="67"/>
+    <w:lsdException w:name="Medium Grid 2 Accent 3" w:uiPriority="68"/>
+    <w:lsdException w:name="Medium Grid 3 Accent 3" w:uiPriority="69"/>
+    <w:lsdException w:name="Dark List Accent 3" w:uiPriority="70"/>
+    <w:lsdException w:name="Colorful Shading Accent 3" w:uiPriority="71"/>
+    <w:lsdException w:name="Colorful List Accent 3" w:uiPriority="72"/>
+    <w:lsdException w:name="Colorful Grid Accent 3" w:uiPriority="73"/>
+    <w:lsdException w:name="Light Shading Accent 4" w:uiPriority="60"/>
+    <w:lsdException w:name="Light List Accent 4" w:uiPriority="61"/>
+    <w:lsdException w:name="Light Grid Accent 4" w:uiPriority="62"/>
+    <w:lsdException w:name="Medium Shading 1 Accent 4" w:uiPriority="63"/>
+    <w:lsdException w:name="Medium Shading 2 Accent 4" w:uiPriority="64"/>
+    <w:lsdException w:name="Medium List 1 Accent 4" w:uiPriority="65"/>
+    <w:lsdException w:name="Medium List 2 Accent 4" w:uiPriority="66"/>
+    <w:lsdException w:name="Medium Grid 1 Accent 4" w:uiPriority="67"/>
+    <w:lsdException w:name="Medium Grid 2 Accent 4" w:uiPriority="68"/>
+    <w:lsdException w:name="Medium Grid 3 Accent 4" w:uiPriority="69"/>
+    <w:lsdException w:name="Dark List Accent 4" w:uiPriority="70"/>
+    <w:lsdException w:name="Colorful Shading Accent 4" w:uiPriority="71"/>
+    <w:lsdException w:name="Colorful List Accent 4" w:uiPriority="72"/>
+    <w:lsdException w:name="Colorful Grid Accent 4" w:uiPriority="73"/>
+    <w:lsdException w:name="Light Shading Accent 5" w:uiPriority="60"/>
+    <w:lsdException w:name="Light List Accent 5" w:uiPriority="61"/>
+    <w:lsdException w:name="Light Grid Accent 5" w:uiPriority="62"/>
+    <w:lsdException w:name="Medium Shading 1 Accent 5" w:uiPriority="63"/>
+    <w:lsdException w:name="Medium Shading 2 Accent 5" w:uiPriority="64"/>
+    <w:lsdException w:name="Medium List 1 Accent 5" w:uiPriority="65"/>
+    <w:lsdException w:name="Medium List 2 Accent 5" w:uiPriority="66"/>
+    <w:lsdException w:name="Medium Grid 1 Accent 5" w:uiPriority="67"/>
+    <w:lsdException w:name="Medium Grid 2 Accent 5" w:uiPriority="68"/>
+    <w:lsdException w:name="Medium Grid 3 Accent 5" w:uiPriority="69"/>
+    <w:lsdException w:name="Dark List Accent 5" w:uiPriority="70"/>
+    <w:lsdException w:name="Colorful Shading Accent 5" w:uiPriority="71"/>
+    <w:lsdException w:name="Colorful List Accent 5" w:uiPriority="72"/>
+    <w:lsdException w:name="Colorful Grid Accent 5" w:uiPriority="73"/>
+    <w:lsdException w:name="Light Shading Accent 6" w:uiPriority="60"/>
+    <w:lsdException w:name="Light List Accent 6" w:uiPriority="61"/>
+    <w:lsdException w:name="Light Grid Accent 6" w:uiPriority="62"/>
+    <w:lsdException w:name="Medium Shading 1 Accent 6" w:uiPriority="63"/>
+    <w:lsdException w:name="Medium Shading 2 Accent 6" w:uiPriority="64"/>
+    <w:lsdException w:name="Medium List 1 Accent 6" w:uiPriority="65"/>
+    <w:lsdException w:name="Medium List 2 Accent 6" w:uiPriority="66"/>
+    <w:lsdException w:name="Medium Grid 1 Accent 6" w:uiPriority="67"/>
+    <w:lsdException w:name="Medium Grid 2 Accent 6" w:uiPriority="68"/>
+    <w:lsdException w:name="Medium Grid 3 Accent 6" w:uiPriority="69"/>
+    <w:lsdException w:name="Dark List Accent 6" w:uiPriority="70"/>
+    <w:lsdException w:name="Colorful Shading Accent 6" w:uiPriority="71"/>
+    <w:lsdException w:name="Colorful List Accent 6" w:uiPriority="72"/>
+    <w:lsdException w:name="Colorful Grid Accent 6" w:uiPriority="73"/>
+    <w:lsdException w:name="Subtle Emphasis" w:uiPriority="19" w:qFormat="1"/>
+    <w:lsdException w:name="Intense Emphasis" w:uiPriority="21" w:qFormat="1"/>
+    <w:lsdException w:name="Subtle Reference" w:uiPriority="31" w:qFormat="1"/>
+    <w:lsdException w:name="Intense Reference" w:uiPriority="32" w:qFormat="1"/>
+    <w:lsdException w:name="Book Title" w:uiPriority="33" w:qFormat="1"/>
+    <w:lsdException w:name="Bibliography" w:semiHidden="1" w:uiPriority="37" w:unhideWhenUsed="1"/>
+    <w:lsdException w:name="TOC Heading" w:semiHidden="1" w:uiPriority="39" w:unhideWhenUsed="1" w:qFormat="1"/>
+    <w:lsdException w:name="Plain Table 1" w:uiPriority="41"/>
+    <w:lsdException w:name="Plain Table 2" w:uiPriority="42"/>
+    <w:lsdException w:name="Plain Table 3" w:uiPriority="43"/>
+    <w:lsdException w:name="Plain Table 4" w:uiPriority="44"/>
+    <w:lsdException w:name="Plain Table 5" w:uiPriority="45"/>
+    <w:lsdException w:name="Grid Table Light" w:uiPriority="40"/>
+    <w:lsdException w:name="Grid Table 1 Light" w:uiPriority="46"/>
+    <w:lsdException w:name="Grid Table 2" w:uiPriority="47"/>
+    <w:lsdException w:name="Grid Table 3" w:uiPriority="48"/>
+    <w:lsdException w:name="Grid Table 4" w:uiPriority="49"/>
+    <w:lsdException w:name="Grid Table 5 Dark" w:uiPriority="50"/>
+    <w:lsdException w:name="Grid Table 6 Colorful" w:uiPriority="51"/>
+    <w:lsdException w:name="Grid Table 7 Colorful" w:uiPriority="52"/>
+    <w:lsdException w:name="Grid Table 1 Light Accent 1" w:uiPriority="46"/>
+    <w:lsdException w:name="Grid Table 2 Accent 1" w:uiPriority="47"/>
+    <w:lsdException w:name="Grid Table 3 Accent 1" w:uiPriority="48"/>
+    <w:lsdException w:name="Grid Table 4 Accent 1" w:uiPriority="49"/>
+    <w:lsdException w:name="Grid Table 5 Dark Accent 1" w:uiPriority="50"/>
+    <w:lsdException w:name="Grid Table 6 Colorful Accent 1" w:uiPriority="51"/>
+    <w:lsdException w:name="Grid Table 7 Colorful Accent 1" w:uiPriority="52"/>
+    <w:lsdException w:name="Grid Table 1 Light Accent 2" w:uiPriority="46"/>
+    <w:lsdException w:name="Grid Table 2 Accent 2" w:uiPriority="47"/>
+    <w:lsdException w:name="Grid Table 3 Accent 2" w:uiPriority="48"/>
+    <w:lsdException w:name="Grid Table 4 Accent 2" w:uiPriority="49"/>
+    <w:lsdException w:name="Grid Table 5 Dark Accent 2" w:uiPriority="50"/>
+    <w:lsdException w:name="Grid Table 6 Colorful Accent 2" w:uiPriority="51"/>
+    <w:lsdException w:name="Grid Table 7 Colorful Accent 2" w:uiPriority="52"/>
+    <w:lsdException w:name="Grid Table 1 Light Accent 3" w:uiPriority="46"/>
+    <w:lsdException w:name="Grid Table 2 Accent 3" w:uiPriority="47"/>
+    <w:lsdException w:name="Grid Table 3 Accent 3" w:uiPriority="48"/>
+    <w:lsdException w:name="Grid Table 4 Accent 3" w:uiPriority="49"/>
+    <w:lsdException w:name="Grid Table 5 Dark Accent 3" w:uiPriority="50"/>
+    <w:lsdException w:name="Grid Table 6 Colorful Accent 3" w:uiPriority="51"/>
+    <w:lsdException w:name="Grid Table 7 Colorful Accent 3" w:uiPriority="52"/>
+    <w:lsdException w:name="Grid Table 1 Light Accent 4" w:uiPriority="46"/>
+    <w:lsdException w:name="Grid Table 2 Accent 4" w:uiPriority="47"/>
+    <w:lsdException w:name="Grid Table 3 Accent 4" w:uiPriority="48"/>
+    <w:lsdException w:name="Grid Table 4 Accent 4" w:uiPriority="49"/>
+    <w:lsdException w:name="Grid Table 5 Dark Accent 4" w:uiPriority="50"/>
+    <w:lsdException w:name="Grid Table 6 Colorful Accent 4" w:uiPriority="51"/>
+    <w:lsdException w:name="Grid Table 7 Colorful Accent 4" w:uiPriority="52"/>
+    <w:lsdException w:name="Grid Table 1 Light Accent 5" w:uiPriority="46"/>
+    <w:lsdException w:name="Grid Table 2 Accent 5" w:uiPriority="47"/>
+    <w:lsdException w:name="Grid Table 3 Accent 5" w:uiPriority="48"/>
+    <w:lsdException w:name="Grid Table 4 Accent 5" w:uiPriority="49"/>
+    <w:lsdException w:name="Grid Table 5 Dark Accent 5" w:uiPriority="50"/>
+    <w:lsdException w:name="Grid Table 6 Colorful Accent 5" w:uiPriority="51"/>
+    <w:lsdException w:name="Grid Table 7 Colorful Accent 5" w:uiPriority="52"/>
+    <w:lsdException w:name="Grid Table 1 Light Accent 6" w:uiPriority="46"/>
+    <w:lsdException w:name="Grid Table 2 Accent 6" w:uiPriority="47"/>
+    <w:lsdException w:name="Grid Table 3 Accent 6" w:uiPriority="48"/>
+    <w:lsdException w:name="Grid Table 4 Accent 6" w:uiPriority="49"/>
+    <w:lsdException w:name="Grid Table 5 Dark Accent 6" w:uiPriority="50"/>
+    <w:lsdException w:name="Grid Table 6 Colorful Accent 6" w:uiPriority="51"/>
+    <w:lsdException w:name="Grid Table 7 Colorful Accent 6" w:uiPriority="52"/>
+    <w:lsdException w:name="List Table 1 Light" w:uiPriority="46"/>
+    <w:lsdException w:name="List Table 2" w:uiPriority="47"/>
+    <w:lsdException w:name="List Table 3" w:uiPriority="48"/>
+    <w:lsdException w:name="List Table 4" w:uiPriority="49"/>
+    <w:lsdException w:name="List Table 5 Dark" w:uiPriority="50"/>
+    <w:lsdException w:name="List Table 6 Colorful" w:uiPriority="51"/>
+    <w:lsdException w:name="List Table 7 Colorful" w:uiPriority="52"/>
+    <w:lsdException w:name="List Table 1 Light Accent 1" w:uiPriority="46"/>
+    <w:lsdException w:name="List Table 2 Accent 1" w:uiPriority="47"/>
+    <w:lsdException w:name="List Table 3 Accent 1" w:uiPriority="48"/>
+    <w:lsdException w:name="List Table 4 Accent 1" w:uiPriority="49"/>
+    <w:lsdException w:name="List Table 5 Dark Accent 1" w:uiPriority="50"/>
+    <w:lsdException w:name="List Table 6 Colorful Accent 1" w:uiPriority="51"/>
+    <w:lsdException w:name="List Table 7 Colorful Accent 1" w:uiPriority="52"/>
+    <w:lsdException w:name="List Table 1 Light Accent 2" w:uiPriority="46"/>
+    <w:lsdException w:name="List Table 2 Accent 2" w:uiPriority="47"/>
+    <w:lsdException w:name="List Table 3 Accent 2" w:uiPriority="48"/>
+    <w:lsdException w:name="List Table 4 Accent 2" w:uiPriority="49"/>
+    <w:lsdException w:name="List Table 5 Dark Accent 2" w:uiPriority="50"/>
+    <w:lsdException w:name="List Table 6 Colorful Accent 2" w:uiPriority="51"/>
+    <w:lsdException w:name="List Table 7 Colorful Accent 2" w:uiPriority="52"/>
+    <w:lsdException w:name="List Table 1 Light Accent 3" w:uiPriority="46"/>
+    <w:lsdException w:name="List Table 2 Accent 3" w:uiPriority="47"/>
+    <w:lsdException w:name="List Table 3 Accent 3" w:uiPriority="48"/>
+    <w:lsdException w:name="List Table 4 Accent 3" w:uiPriority="49"/>
+    <w:lsdException w:name="List Table 5 Dark Accent 3" w:uiPriority="50"/>
+    <w:lsdException w:name="List Table 6 Colorful Accent 3" w:uiPriority="51"/>
+    <w:lsdException w:name="List Table 7 Colorful Accent 3" w:uiPriority="52"/>
+    <w:lsdException w:name="List Table 1 Light Accent 4" w:uiPriority="46"/>
+    <w:lsdException w:name="List Table 2 Accent 4" w:uiPriority="47"/>
+    <w:lsdException w:name="List Table 3 Accent 4" w:uiPriority="48"/>
+    <w:lsdException w:name="List Table 4 Accent 4" w:uiPriority="49"/>
+    <w:lsdException w:name="List Table 5 Dark Accent 4" w:uiPriority="50"/>
+    <w:lsdException w:name="List Table 6 Colorful Accent 4" w:uiPriority="51"/>
+    <w:lsdException w:name="List Table 7 Colorful Accent 4" w:uiPriority="52"/>
+    <w:lsdException w:name="List Table 1 Light Accent 5" w:uiPriority="46"/>
+    <w:lsdException w:name="List Table 2 Accent 5" w:uiPriority="47"/>
+    <w:lsdException w:name="List Table 3 Accent 5" w:uiPriority="48"/>
+    <w:lsdException w:name="List Table 4 Accent 5" w:uiPriority="49"/>
+    <w:lsdException w:name="List Table 5 Dark Accent 5" w:uiPriority="50"/>
+    <w:lsdException w:name="List Table 6 Colorful Accent 5" w:uiPriority="51"/>
+    <w:lsdException w:name="List Table 7 Colorful Accent 5" w:uiPriority="52"/>
+    <w:lsdException w:name="List Table 1 Light Accent 6" w:uiPriority="46"/>
+    <w:lsdException w:name="List Table 2 Accent 6" w:uiPriority="47"/>
+    <w:lsdException w:name="List Table 3 Accent 6" w:uiPriority="48"/>
+    <w:lsdException w:name="List Table 4 Accent 6" w:uiPriority="49"/>
+    <w:lsdException w:name="List Table 5 Dark Accent 6" w:uiPriority="50"/>
+    <w:lsdException w:name="List Table 6 Colorful Accent 6" w:uiPriority="51"/>
+    <w:lsdException w:name="List Table 7 Colorful Accent 6" w:uiPriority="52"/>
+  </w:latentStyles>
+  <w:style w:type="paragraph" w:default="1" w:styleId="Normal">
+    <w:name w:val="Normal"/>
+    <w:uiPriority w:val="1"/>
+    <w:qFormat/>
+  </w:style>
+  <w:style w:type="character" w:default="1" w:styleId="Fuentedeprrafopredeter">
     <w:name w:val="Default Paragraph Font"/>
     <w:uiPriority w:val="1"/>
     <w:semiHidden/>
     <w:unhideWhenUsed/>
   </w:style>
-  <w:style w:styleId="TableNormal" w:default="1" w:type="table">
+  <w:style w:type="table" w:default="1" w:styleId="Tablanormal">
+    <w:name w:val="Normal Table"/>
+    <w:uiPriority w:val="99"/>
+    <w:semiHidden/>
+    <w:unhideWhenUsed/>
+    <w:tblPr>
+      <w:tblInd w:w="0" w:type="dxa"/>
+      <w:tblCellMar>
+        <w:top w:w="0" w:type="dxa"/>
+        <w:left w:w="108" w:type="dxa"/>
+        <w:bottom w:w="0" w:type="dxa"/>
+        <w:right w:w="108" w:type="dxa"/>
+      </w:tblCellMar>
+    </w:tblPr>
+  </w:style>
+  <w:style w:type="numbering" w:default="1" w:styleId="Sinlista">
+    <w:name w:val="No List"/>
+    <w:uiPriority w:val="99"/>
+    <w:semiHidden/>
+    <w:unhideWhenUsed/>
+  </w:style>
+  <w:style w:type="table" w:customStyle="1" w:styleId="TableNormal">
     <w:name w:val="Table Normal"/>
     <w:uiPriority w:val="2"/>
     <w:semiHidden/>
@@ -18932,34 +19373,59 @@
       </w:tblCellMar>
     </w:tblPr>
   </w:style>
-  <w:style w:styleId="NoList" w:default="1" w:type="numbering">
-    <w:name w:val="No List"/>
-    <w:uiPriority w:val="99"/>
-    <w:semiHidden/>
-    <w:unhideWhenUsed/>
-  </w:style>
-  <w:style w:default="1" w:styleId="Normal" w:type="paragraph">
-    <w:name w:val="Normal"/>
-    <w:uiPriority w:val="1"/>
-    <w:qFormat/>
-    <w:pPr/>
-    <w:rPr/>
-  </w:style>
-  <w:style w:styleId="ListParagraph" w:type="paragraph">
+  <w:style w:type="paragraph" w:styleId="Prrafodelista">
     <w:name w:val="List Paragraph"/>
     <w:basedOn w:val="Normal"/>
     <w:uiPriority w:val="1"/>
     <w:qFormat/>
-    <w:pPr/>
-    <w:rPr/>
   </w:style>
-  <w:style w:styleId="TableParagraph" w:type="paragraph">
+  <w:style w:type="paragraph" w:customStyle="1" w:styleId="TableParagraph">
     <w:name w:val="Table Paragraph"/>
     <w:basedOn w:val="Normal"/>
     <w:uiPriority w:val="1"/>
     <w:qFormat/>
-    <w:pPr/>
-    <w:rPr/>
+  </w:style>
+  <w:style w:type="paragraph" w:styleId="Encabezado">
+    <w:name w:val="header"/>
+    <w:basedOn w:val="Normal"/>
+    <w:link w:val="EncabezadoCar"/>
+    <w:uiPriority w:val="99"/>
+    <w:unhideWhenUsed/>
+    <w:rsid w:val="00D71226"/>
+    <w:pPr>
+      <w:tabs>
+        <w:tab w:val="center" w:pos="4252"/>
+        <w:tab w:val="right" w:pos="8504"/>
+      </w:tabs>
+    </w:pPr>
+  </w:style>
+  <w:style w:type="character" w:customStyle="1" w:styleId="EncabezadoCar">
+    <w:name w:val="Encabezado Car"/>
+    <w:basedOn w:val="Fuentedeprrafopredeter"/>
+    <w:link w:val="Encabezado"/>
+    <w:uiPriority w:val="99"/>
+    <w:rsid w:val="00D71226"/>
+  </w:style>
+  <w:style w:type="paragraph" w:styleId="Piedepgina">
+    <w:name w:val="footer"/>
+    <w:basedOn w:val="Normal"/>
+    <w:link w:val="PiedepginaCar"/>
+    <w:uiPriority w:val="99"/>
+    <w:unhideWhenUsed/>
+    <w:rsid w:val="00D71226"/>
+    <w:pPr>
+      <w:tabs>
+        <w:tab w:val="center" w:pos="4252"/>
+        <w:tab w:val="right" w:pos="8504"/>
+      </w:tabs>
+    </w:pPr>
+  </w:style>
+  <w:style w:type="character" w:customStyle="1" w:styleId="PiedepginaCar">
+    <w:name w:val="Pie de página Car"/>
+    <w:basedOn w:val="Fuentedeprrafopredeter"/>
+    <w:link w:val="Piedepgina"/>
+    <w:uiPriority w:val="99"/>
+    <w:rsid w:val="00D71226"/>
   </w:style>
 </w:styles>
 </file>

</xml_diff>